<commit_message>
Close remaining review items: drop dead SNP-free Figure 2 code, switch to constrained layout, refresh figures
- Remove the deprecated fig2_sv_sensitivity() prototype version that read the
  SNP-free enzyme_comparison.csv; Figure 2 remains generated by
  generate_figure2_rust.py on controlled SV genomes with a 1% SNP background
- Replace plt.tight_layout() with layout="constrained" in Figures 1, 3, 4, 5
  so panel titles and twin axes cannot collide again
- Remove literal asterisks from the Figure 2 suptitle and regenerate
- Update the digestion-time sentence in Results to the measured values
- Regenerate all main figures and the manuscript docx
</commit_message>
<xml_diff>
--- a/Syn2b_Manuscript.docx
+++ b/Syn2b_Manuscript.docx
@@ -3763,13 +3763,13 @@
         <w:t xml:space="preserve"> </w:t>
       </w:r>
       <w:r>
-        <w:t xml:space="preserve">45 ms on a single core; individual enzymes range from approximately 30 ms (AlfI)</w:t>
-      </w:r>
-      <w:r>
-        <w:t xml:space="preserve"> </w:t>
-      </w:r>
-      <w:r>
-        <w:t xml:space="preserve">to 47 ms (All 4) (Figure 5a). Pairwise structural comparison scales sub-linearly</w:t>
+        <w:t xml:space="preserve">45 ms on a single core; individual enzymes range from approximately 30 ms (BplI)</w:t>
+      </w:r>
+      <w:r>
+        <w:t xml:space="preserve"> </w:t>
+      </w:r>
+      <w:r>
+        <w:t xml:space="preserve">to 44 ms (All 4) (Figure 5a). Pairwise structural comparison scales sub-linearly</w:t>
       </w:r>
       <w:r>
         <w:t xml:space="preserve"> </w:t>

</xml_diff>

<commit_message>
Add genome-wide ANI-rearrangement discordance survey (new Figure 5)
- New Results section 6: 34% of GTDB-R207 pairs with ANIm >= 97% carry >=2
  dnadiff inversion events; Syn2b junction count flags them (AUC 0.80)
- New analysis script + results (results/discordance/), per-pair ANIm and
  dnadiff event truth fetched from HPC benchmarks
- Runtime figure becomes Figure 6; missing Table 3 renumbered; per-pair
  times unified to unique-pair convention across main and supplementary tables
- Rewrite title/abstract (fragmentation principle first, <=150 words),
  deduplicate enzyme-density text, merge Discussion comparison paragraphs,
  add orientation-convention caveat, skani positioning in Introduction,
  enzyme-panel rationale (2bRAD link), SynTracker comparison note
- New Methods subsection for the discordance analysis
</commit_message>
<xml_diff>
--- a/Syn2b_Manuscript.docx
+++ b/Syn2b_Manuscript.docx
@@ -2,13 +2,13 @@
 <file path=word/document.xml><?xml version="1.0" encoding="utf-8"?>
 <w:document xmlns:w="http://schemas.openxmlformats.org/wordprocessingml/2006/main" xmlns:m="http://schemas.openxmlformats.org/officeDocument/2006/math" xmlns:r="http://schemas.openxmlformats.org/officeDocument/2006/relationships" xmlns:o="urn:schemas-microsoft-com:office:office" xmlns:v="urn:schemas-microsoft-com:vml" xmlns:w10="urn:schemas-microsoft-com:office:word" xmlns:a="http://schemas.openxmlformats.org/drawingml/2006/main" xmlns:pic="http://schemas.openxmlformats.org/drawingml/2006/picture" xmlns:wp="http://schemas.openxmlformats.org/drawingml/2006/wordprocessingDrawing">
   <w:body>
-    <w:bookmarkStart w:id="37" w:name="Xfb3261d548fe8da6bb34f2e4f574f27e44ec4ad"/>
+    <w:bookmarkStart w:id="39" w:name="Xec573160e92fa6b8ce6bac14bd269bf20145b31"/>
     <w:p>
       <w:pPr>
         <w:pStyle w:val="Heading1"/>
       </w:pPr>
       <w:r>
-        <w:t xml:space="preserve">Syn2b: length-weighted restriction-enzyme tags provide assembly-fragmentation-invariant structural-variation metrics</w:t>
+        <w:t xml:space="preserve">Syn2b: fragmentation-invariant structural comparison of microbial genomes by ordered restriction-enzyme tags</w:t>
       </w:r>
     </w:p>
     <w:p>
@@ -60,19 +60,25 @@
         <w:pStyle w:val="FirstParagraph"/>
       </w:pPr>
       <w:r>
-        <w:t xml:space="preserve">Microbial strain variation is driven by both point mutations and structural</w:t>
-      </w:r>
-      <w:r>
-        <w:t xml:space="preserve"> </w:t>
-      </w:r>
-      <w:r>
-        <w:t xml:space="preserve">variants, yet most strain-tracking tools capture only single-nucleotide</w:t>
-      </w:r>
-      <w:r>
-        <w:t xml:space="preserve"> </w:t>
-      </w:r>
-      <w:r>
-        <w:t xml:space="preserve">polymorphisms and are blind to rearrangements. We introduce</w:t>
+        <w:t xml:space="preserve">Statistics that count transitions between adjacent states acquire a bias that</w:t>
+      </w:r>
+      <w:r>
+        <w:t xml:space="preserve"> </w:t>
+      </w:r>
+      <w:r>
+        <w:t xml:space="preserve">grows with assembly fragmentation, whereas length-weighted ratios are invariant</w:t>
+      </w:r>
+      <w:r>
+        <w:t xml:space="preserve"> </w:t>
+      </w:r>
+      <w:r>
+        <w:t xml:space="preserve">to splitting; this principle determines which structural-variation metrics are</w:t>
+      </w:r>
+      <w:r>
+        <w:t xml:space="preserve"> </w:t>
+      </w:r>
+      <w:r>
+        <w:t xml:space="preserve">trustworthy for draft genomes. We introduce</w:t>
       </w:r>
       <w:r>
         <w:t xml:space="preserve"> </w:t>
@@ -82,64 +88,46 @@
           <w:b/>
           <w:bCs/>
         </w:rPr>
-        <w:t xml:space="preserve">Strain2b (Syn2b)</w:t>
-      </w:r>
-      <w:r>
-        <w:t xml:space="preserve">, an</w:t>
-      </w:r>
-      <w:r>
-        <w:t xml:space="preserve"> </w:t>
-      </w:r>
-      <w:r>
-        <w:t xml:space="preserve">alignment-free method that encodes genome structure through the order and</w:t>
-      </w:r>
-      <w:r>
-        <w:t xml:space="preserve"> </w:t>
-      </w:r>
-      <w:r>
-        <w:t xml:space="preserve">adjacency of short tags generated by restriction-enzyme digestion. The central</w:t>
-      </w:r>
-      <w:r>
-        <w:t xml:space="preserve"> </w:t>
-      </w:r>
-      <w:r>
-        <w:t xml:space="preserve">advance is a fragmentation principle: length-weighted structural ratios are</w:t>
-      </w:r>
-      <w:r>
-        <w:t xml:space="preserve"> </w:t>
-      </w:r>
-      <w:r>
-        <w:t xml:space="preserve">invariant to assembly fragmentation, whereas transition-count metrics acquire a</w:t>
-      </w:r>
-      <w:r>
-        <w:t xml:space="preserve"> </w:t>
-      </w:r>
-      <w:r>
-        <w:t xml:space="preserve">bias that grows with the number of contigs. In the strain-level regime (ANIm ≥</w:t>
-      </w:r>
-      <w:r>
-        <w:t xml:space="preserve"> </w:t>
-      </w:r>
-      <w:r>
-        <w:t xml:space="preserve">97%, n = 3,826) Syn2b’s fixed-reference inverted aligned fraction agrees with</w:t>
-      </w:r>
-      <w:r>
-        <w:t xml:space="preserve"> </w:t>
-      </w:r>
-      <w:r>
-        <w:t xml:space="preserve">the alignment-based truth at Pearson r = 0.996, slope = 1.006 and SD(error) =</w:t>
-      </w:r>
-      <w:r>
-        <w:t xml:space="preserve"> </w:t>
-      </w:r>
-      <w:r>
-        <w:t xml:space="preserve">0.0135; across all 43,312 held-out pairs from GTDB-R207 the correlation is r =</w:t>
-      </w:r>
-      <w:r>
-        <w:t xml:space="preserve"> </w:t>
-      </w:r>
-      <w:r>
-        <w:t xml:space="preserve">0.94. A multi-enzyme panel (BcgI+AlfI+AloI+FalI) yields ~1.34 tags/kb in</w:t>
+        <w:t xml:space="preserve">Syn2b</w:t>
+      </w:r>
+      <w:r>
+        <w:t xml:space="preserve">, an alignment-free method</w:t>
+      </w:r>
+      <w:r>
+        <w:t xml:space="preserve"> </w:t>
+      </w:r>
+      <w:r>
+        <w:t xml:space="preserve">that encodes genome structure through the order and adjacency of short tags</w:t>
+      </w:r>
+      <w:r>
+        <w:t xml:space="preserve"> </w:t>
+      </w:r>
+      <w:r>
+        <w:t xml:space="preserve">generated by Type IIB restriction-enzyme digestion. In the strain-level regime</w:t>
+      </w:r>
+      <w:r>
+        <w:t xml:space="preserve"> </w:t>
+      </w:r>
+      <w:r>
+        <w:t xml:space="preserve">(ANIm ≥ 97%, n = 3,826) Syn2b’s fixed-reference inverted aligned fraction agrees</w:t>
+      </w:r>
+      <w:r>
+        <w:t xml:space="preserve"> </w:t>
+      </w:r>
+      <w:r>
+        <w:t xml:space="preserve">with alignment-based truth at Pearson r = 0.996, slope = 1.006; across 43,312</w:t>
+      </w:r>
+      <w:r>
+        <w:t xml:space="preserve"> </w:t>
+      </w:r>
+      <w:r>
+        <w:t xml:space="preserve">held-out GTDB-R207 pairs, r = 0.94. A four-enzyme panel (BcgI+AlfI+AloI+FalI)</w:t>
+      </w:r>
+      <w:r>
+        <w:t xml:space="preserve"> </w:t>
+      </w:r>
+      <w:r>
+        <w:t xml:space="preserve">yields ~1.34 tags/kb in</w:t>
       </w:r>
       <w:r>
         <w:t xml:space="preserve"> </w:t>
@@ -149,51 +137,31 @@
           <w:i/>
           <w:iCs/>
         </w:rPr>
-        <w:t xml:space="preserve">E.</w:t>
-      </w:r>
-      <w:r>
-        <w:rPr>
-          <w:i/>
-          <w:iCs/>
-        </w:rPr>
-        <w:t xml:space="preserve"> </w:t>
-      </w:r>
-      <w:r>
-        <w:rPr>
-          <w:i/>
-          <w:iCs/>
-        </w:rPr>
-        <w:t xml:space="preserve">coli</w:t>
-      </w:r>
-      <w:r>
-        <w:t xml:space="preserve"> </w:t>
-      </w:r>
-      <w:r>
-        <w:t xml:space="preserve">K-12 and detects inversion events down to ~4 kb (10/10 controlled</w:t>
-      </w:r>
-      <w:r>
-        <w:t xml:space="preserve"> </w:t>
-      </w:r>
-      <w:r>
-        <w:t xml:space="preserve">replicates; Supplementary Figure 4); combined with the</w:t>
-      </w:r>
-      <w:r>
-        <w:t xml:space="preserve"> </w:t>
-      </w:r>
-      <w:r>
-        <w:t xml:space="preserve">fragmentation-invariant ratio, this enables structural comparison of draft</w:t>
-      </w:r>
-      <w:r>
-        <w:t xml:space="preserve"> </w:t>
-      </w:r>
-      <w:r>
-        <w:t xml:space="preserve">assemblies at a fraction of the cost of alignment-based methods. Syn2b is</w:t>
-      </w:r>
-      <w:r>
-        <w:t xml:space="preserve"> </w:t>
-      </w:r>
-      <w:r>
-        <w:t xml:space="preserve">available at https://github.com/HuangShiLab/Syn2b.</w:t>
+        <w:t xml:space="preserve">E. coli</w:t>
+      </w:r>
+      <w:r>
+        <w:t xml:space="preserve"> </w:t>
+      </w:r>
+      <w:r>
+        <w:t xml:space="preserve">K-12 and detects inversions down to ~4 kb.</w:t>
+      </w:r>
+      <w:r>
+        <w:t xml:space="preserve"> </w:t>
+      </w:r>
+      <w:r>
+        <w:t xml:space="preserve">Applied genome-wide, we find that 34% of GTDB-R207 pairs with ANIm ≥ 97% carry</w:t>
+      </w:r>
+      <w:r>
+        <w:t xml:space="preserve"> </w:t>
+      </w:r>
+      <w:r>
+        <w:t xml:space="preserve">≥2 alignment-visible inversion events — rearrangements invisible to ANI</w:t>
+      </w:r>
+      <w:r>
+        <w:t xml:space="preserve"> </w:t>
+      </w:r>
+      <w:r>
+        <w:t xml:space="preserve">ranking. Syn2b is available at https://github.com/HuangShiLab/Syn2b.</w:t>
       </w:r>
     </w:p>
     <w:p>
@@ -388,7 +356,25 @@
         <w:t xml:space="preserve"> </w:t>
       </w:r>
       <w:r>
-        <w:t xml:space="preserve">alignments makes it computationally expensive.</w:t>
+        <w:t xml:space="preserve">alignments makes it computationally expensive. At the other extreme, fast</w:t>
+      </w:r>
+      <w:r>
+        <w:t xml:space="preserve"> </w:t>
+      </w:r>
+      <w:r>
+        <w:t xml:space="preserve">k-mer-anchor estimators such as skani²¹ compute genome-wide ANI in milliseconds</w:t>
+      </w:r>
+      <w:r>
+        <w:t xml:space="preserve"> </w:t>
+      </w:r>
+      <w:r>
+        <w:t xml:space="preserve">but discard adjacency information entirely and therefore cannot report any</w:t>
+      </w:r>
+      <w:r>
+        <w:t xml:space="preserve"> </w:t>
+      </w:r>
+      <w:r>
+        <w:t xml:space="preserve">structural quantity.</w:t>
       </w:r>
     </w:p>
     <w:p>
@@ -406,22 +392,34 @@
           <w:b/>
           <w:bCs/>
         </w:rPr>
-        <w:t xml:space="preserve">Strain2b (Syn2b)</w:t>
-      </w:r>
-      <w:r>
-        <w:t xml:space="preserve">, a different approach. Syn2b exploits the</w:t>
-      </w:r>
-      <w:r>
-        <w:t xml:space="preserve"> </w:t>
-      </w:r>
-      <w:r>
-        <w:t xml:space="preserve">predictable fragmentation of Type IIB restriction enzymes to generate short,</w:t>
-      </w:r>
-      <w:r>
-        <w:t xml:space="preserve"> </w:t>
-      </w:r>
-      <w:r>
-        <w:t xml:space="preserve">sequenceable tags (27–32 bp)¹⁷. By comparing tag adjacency and order between</w:t>
+        <w:t xml:space="preserve">Syn2b</w:t>
+      </w:r>
+      <w:r>
+        <w:t xml:space="preserve">, which occupies the space between these two extremes.</w:t>
+      </w:r>
+      <w:r>
+        <w:t xml:space="preserve"> </w:t>
+      </w:r>
+      <w:r>
+        <w:t xml:space="preserve">Syn2b exploits the predictable fragmentation of Type IIB restriction enzymes to</w:t>
+      </w:r>
+      <w:r>
+        <w:t xml:space="preserve"> </w:t>
+      </w:r>
+      <w:r>
+        <w:t xml:space="preserve">generate short tags (27–32 bp)¹⁷ that are physically sequenceable by 2bRAD-style</w:t>
+      </w:r>
+      <w:r>
+        <w:t xml:space="preserve"> </w:t>
+      </w:r>
+      <w:r>
+        <w:t xml:space="preserve">protocols, linking the in-silico metric directly to an experimental assay. By</w:t>
+      </w:r>
+      <w:r>
+        <w:t xml:space="preserve"> </w:t>
+      </w:r>
+      <w:r>
+        <w:t xml:space="preserve">comparing tag adjacency and order between</w:t>
       </w:r>
       <w:r>
         <w:t xml:space="preserve"> </w:t>
@@ -620,7 +618,7 @@
         <w:pStyle w:val="BodyText"/>
       </w:pPr>
       <w:r>
-        <w:t xml:space="preserve">We validate Syn2b through three lines of evidence: (1) in-silico simulations of</w:t>
+        <w:t xml:space="preserve">We validate Syn2b through four lines of evidence: (1) in-silico simulations of</w:t>
       </w:r>
       <w:r>
         <w:t xml:space="preserve"> </w:t>
@@ -632,7 +630,7 @@
         <w:t xml:space="preserve"> </w:t>
       </w:r>
       <w:r>
-        <w:t xml:space="preserve">comparison showing density-dependent sensitivity; and (3) a 43,334-pair</w:t>
+        <w:t xml:space="preserve">comparison showing density-dependent sensitivity; (3) a 43,334-pair</w:t>
       </w:r>
       <w:r>
         <w:t xml:space="preserve"> </w:t>
@@ -644,7 +642,19 @@
         <w:t xml:space="preserve"> </w:t>
       </w:r>
       <w:r>
-        <w:t xml:space="preserve">model for the strain-level regime.</w:t>
+        <w:t xml:space="preserve">model for the strain-level regime; and (4) a genome-wide survey of</w:t>
+      </w:r>
+      <w:r>
+        <w:t xml:space="preserve"> </w:t>
+      </w:r>
+      <w:r>
+        <w:t xml:space="preserve">ANI–rearrangement discordance showing that one third of strain-level GTDB pairs</w:t>
+      </w:r>
+      <w:r>
+        <w:t xml:space="preserve"> </w:t>
+      </w:r>
+      <w:r>
+        <w:t xml:space="preserve">carry multiple inversion events that ANI ranking cannot see.</w:t>
       </w:r>
     </w:p>
     <w:p>
@@ -655,7 +665,7 @@
       </w:r>
     </w:p>
     <w:bookmarkEnd w:id="10"/>
-    <w:bookmarkStart w:id="18" w:name="results"/>
+    <w:bookmarkStart w:id="19" w:name="results"/>
     <w:p>
       <w:pPr>
         <w:pStyle w:val="Heading2"/>
@@ -713,7 +723,13 @@
         <w:t xml:space="preserve">BcgI+AlfI+AloI+FalI</w:t>
       </w:r>
       <w:r>
-        <w:t xml:space="preserve">. Each enzyme recognizes a</w:t>
+        <w:t xml:space="preserve">; per-enzyme tag densities and the</w:t>
+      </w:r>
+      <w:r>
+        <w:t xml:space="preserve"> </w:t>
+      </w:r>
+      <w:r>
+        <w:t xml:space="preserve">rationale for this combination are given in section 4. Each enzyme recognizes a</w:t>
       </w:r>
       <w:r>
         <w:t xml:space="preserve"> </w:t>
@@ -725,41 +741,7 @@
         <w:t xml:space="preserve"> </w:t>
       </w:r>
       <w:r>
-        <w:t xml:space="preserve">(Figure 1a). In</w:t>
-      </w:r>
-      <w:r>
-        <w:t xml:space="preserve"> </w:t>
-      </w:r>
-      <w:r>
-        <w:rPr>
-          <w:i/>
-          <w:iCs/>
-        </w:rPr>
-        <w:t xml:space="preserve">E. coli</w:t>
-      </w:r>
-      <w:r>
-        <w:t xml:space="preserve"> </w:t>
-      </w:r>
-      <w:r>
-        <w:t xml:space="preserve">K-12 (NC_000913.3, 4,641,652 bp), BcgI yields 2,935</w:t>
-      </w:r>
-      <w:r>
-        <w:t xml:space="preserve"> </w:t>
-      </w:r>
-      <w:r>
-        <w:t xml:space="preserve">tags (0.63/kb), AlfI 2,023 (0.44/kb), AloI 523 (0.11/kb), and FalI 735</w:t>
-      </w:r>
-      <w:r>
-        <w:t xml:space="preserve"> </w:t>
-      </w:r>
-      <w:r>
-        <w:t xml:space="preserve">(0.16/kb). Combining all four yields 6,216 tags (1.34/kb), a 2.1× increase over</w:t>
-      </w:r>
-      <w:r>
-        <w:t xml:space="preserve"> </w:t>
-      </w:r>
-      <w:r>
-        <w:t xml:space="preserve">BcgI alone (Table 1).</w:t>
+        <w:t xml:space="preserve">(Figure 1a).</w:t>
       </w:r>
     </w:p>
     <w:p>
@@ -1031,7 +1013,7 @@
         <w:t xml:space="preserve"> </w:t>
       </w:r>
       <w:r>
-        <w:t xml:space="preserve">42 ms (measured; Figure 5a).</w:t>
+        <w:t xml:space="preserve">42 ms (measured; Figure 6a).</w:t>
       </w:r>
     </w:p>
     <w:bookmarkEnd w:id="11"/>
@@ -1233,19 +1215,19 @@
         <w:t xml:space="preserve"> </w:t>
       </w:r>
       <w:r>
-        <w:t xml:space="preserve">insertion/deletion. The quantitative validation on real genomes is given in</w:t>
-      </w:r>
-      <w:r>
-        <w:t xml:space="preserve"> </w:t>
-      </w:r>
-      <w:r>
-        <w:t xml:space="preserve">Figure 3; the tests here establish that the reported metrics behave as expected</w:t>
-      </w:r>
-      <w:r>
-        <w:t xml:space="preserve"> </w:t>
-      </w:r>
-      <w:r>
-        <w:t xml:space="preserve">on controlled inputs.</w:t>
+        <w:t xml:space="preserve">insertion/deletion. These controlled inputs establish that each reported metric</w:t>
+      </w:r>
+      <w:r>
+        <w:t xml:space="preserve"> </w:t>
+      </w:r>
+      <w:r>
+        <w:t xml:space="preserve">responds to its target SV class (Figure 2); quantitative accuracy on real</w:t>
+      </w:r>
+      <w:r>
+        <w:t xml:space="preserve"> </w:t>
+      </w:r>
+      <w:r>
+        <w:t xml:space="preserve">genomes is validated in Figure 3.</w:t>
       </w:r>
     </w:p>
     <w:p>
@@ -1712,19 +1694,71 @@
         <w:t xml:space="preserve"> </w:t>
       </w:r>
       <w:r>
-        <w:t xml:space="preserve">redundancy. The panel was chosen to maximize shared landmark counts across</w:t>
-      </w:r>
-      <w:r>
-        <w:t xml:space="preserve"> </w:t>
-      </w:r>
-      <w:r>
-        <w:t xml:space="preserve">diverse prokaryotic genomes while using enzymes with experimentally validated</w:t>
-      </w:r>
-      <w:r>
-        <w:t xml:space="preserve"> </w:t>
-      </w:r>
-      <w:r>
-        <w:t xml:space="preserve">recognition specificities. In practice, recognition sites can be affected by</w:t>
+        <w:t xml:space="preserve">redundancy. Two considerations motivate enzyme landmarks over purely</w:t>
+      </w:r>
+      <w:r>
+        <w:t xml:space="preserve"> </w:t>
+      </w:r>
+      <w:r>
+        <w:t xml:space="preserve">computational ones. First, Type IIB tags are physical molecules: each landmark</w:t>
+      </w:r>
+      <w:r>
+        <w:t xml:space="preserve"> </w:t>
+      </w:r>
+      <w:r>
+        <w:t xml:space="preserve">is a 27–32-bp fragment flanking a fixed recognition site, so the exact tag set</w:t>
+      </w:r>
+      <w:r>
+        <w:t xml:space="preserve"> </w:t>
+      </w:r>
+      <w:r>
+        <w:t xml:space="preserve">analysed here can be generated</w:t>
+      </w:r>
+      <w:r>
+        <w:t xml:space="preserve"> </w:t>
+      </w:r>
+      <w:r>
+        <w:rPr>
+          <w:i/>
+          <w:iCs/>
+        </w:rPr>
+        <w:t xml:space="preserve">in vitro</w:t>
+      </w:r>
+      <w:r>
+        <w:t xml:space="preserve"> </w:t>
+      </w:r>
+      <w:r>
+        <w:t xml:space="preserve">by 2bRAD-style digestion and</w:t>
+      </w:r>
+      <w:r>
+        <w:t xml:space="preserve"> </w:t>
+      </w:r>
+      <w:r>
+        <w:t xml:space="preserve">sequencing, linking the in-silico metric to a real assay at negligible extra</w:t>
+      </w:r>
+      <w:r>
+        <w:t xml:space="preserve"> </w:t>
+      </w:r>
+      <w:r>
+        <w:t xml:space="preserve">cost. Second, enzyme recognition is deterministic and parameter-free — the same</w:t>
+      </w:r>
+      <w:r>
+        <w:t xml:space="preserve"> </w:t>
+      </w:r>
+      <w:r>
+        <w:t xml:space="preserve">genome always yields the same landmarks across studies and software versions,</w:t>
+      </w:r>
+      <w:r>
+        <w:t xml:space="preserve"> </w:t>
+      </w:r>
+      <w:r>
+        <w:t xml:space="preserve">which matters for database-scale applications where sketches must remain</w:t>
+      </w:r>
+      <w:r>
+        <w:t xml:space="preserve"> </w:t>
+      </w:r>
+      <w:r>
+        <w:t xml:space="preserve">comparable over time. In practice, recognition sites can be affected by</w:t>
       </w:r>
       <w:r>
         <w:t xml:space="preserve"> </w:t>
@@ -2648,19 +2682,19 @@
         <w:pStyle w:val="BodyText"/>
       </w:pPr>
       <w:r>
-        <w:t xml:space="preserve">The held-out set contains only two pairs at ≥97% ANIm (both included in the</w:t>
-      </w:r>
-      <w:r>
-        <w:t xml:space="preserve"> </w:t>
-      </w:r>
-      <w:r>
-        <w:t xml:space="preserve">pooled count below), so the strain-level regime is evaluated on an independent</w:t>
-      </w:r>
-      <w:r>
-        <w:t xml:space="preserve"> </w:t>
-      </w:r>
-      <w:r>
-        <w:t xml:space="preserve">high-ANI sample selected for that purpose. Figure 3b shows the same trend with</w:t>
+        <w:t xml:space="preserve">The held-out set contains only two pairs at ≥97% ANIm, so the strain-level</w:t>
+      </w:r>
+      <w:r>
+        <w:t xml:space="preserve"> </w:t>
+      </w:r>
+      <w:r>
+        <w:t xml:space="preserve">regime is evaluated on an independent high-ANI sample selected for that purpose</w:t>
+      </w:r>
+      <w:r>
+        <w:t xml:space="preserve"> </w:t>
+      </w:r>
+      <w:r>
+        <w:t xml:space="preserve">(pooled statistics below and in section 6 refer to this sample). Figure 3b shows the same trend with</w:t>
       </w:r>
       <w:r>
         <w:t xml:space="preserve"> </w:t>
@@ -3295,7 +3329,81 @@
         <w:t xml:space="preserve"> </w:t>
       </w:r>
       <w:r>
-        <w:t xml:space="preserve">opposite frame (Figure 3c).</w:t>
+        <w:t xml:space="preserve">opposite frame (Figure 3c). One caveat applies to both dnadiff and Syn2b</w:t>
+      </w:r>
+      <w:r>
+        <w:t xml:space="preserve"> </w:t>
+      </w:r>
+      <w:r>
+        <w:t xml:space="preserve">fixed-reference fractions: because the orientation of individual contigs in a</w:t>
+      </w:r>
+      <w:r>
+        <w:t xml:space="preserve"> </w:t>
+      </w:r>
+      <w:r>
+        <w:t xml:space="preserve">draft assembly is arbitrary, pairs whose assemblies follow different orientation</w:t>
+      </w:r>
+      <w:r>
+        <w:t xml:space="preserve"> </w:t>
+      </w:r>
+      <w:r>
+        <w:t xml:space="preserve">conventions read as ~0.5 inverted regardless of biology. The fraction is</w:t>
+      </w:r>
+      <w:r>
+        <w:t xml:space="preserve"> </w:t>
+      </w:r>
+      <w:r>
+        <w:t xml:space="preserve">therefore a</w:t>
+      </w:r>
+      <w:r>
+        <w:t xml:space="preserve"> </w:t>
+      </w:r>
+      <w:r>
+        <w:rPr>
+          <w:i/>
+          <w:iCs/>
+        </w:rPr>
+        <w:t xml:space="preserve">tracking</w:t>
+      </w:r>
+      <w:r>
+        <w:t xml:space="preserve"> </w:t>
+      </w:r>
+      <w:r>
+        <w:t xml:space="preserve">metric — Syn2b reproduces the alignment-based value with</w:t>
+      </w:r>
+      <w:r>
+        <w:t xml:space="preserve"> </w:t>
+      </w:r>
+      <w:r>
+        <w:t xml:space="preserve">calibrated error — while per-pair biological interpretation of the inverted</w:t>
+      </w:r>
+      <w:r>
+        <w:t xml:space="preserve"> </w:t>
+      </w:r>
+      <w:r>
+        <w:t xml:space="preserve">fraction requires orientation-consistent assemblies; inversion</w:t>
+      </w:r>
+      <w:r>
+        <w:t xml:space="preserve"> </w:t>
+      </w:r>
+      <w:r>
+        <w:rPr>
+          <w:i/>
+          <w:iCs/>
+        </w:rPr>
+        <w:t xml:space="preserve">counts</w:t>
+      </w:r>
+      <w:r>
+        <w:t xml:space="preserve"> </w:t>
+      </w:r>
+      <w:r>
+        <w:t xml:space="preserve">are</w:t>
+      </w:r>
+      <w:r>
+        <w:t xml:space="preserve"> </w:t>
+      </w:r>
+      <w:r>
+        <w:t xml:space="preserve">free of this convention (section 6).</w:t>
       </w:r>
     </w:p>
     <w:p>
@@ -3421,7 +3529,25 @@
         <w:t xml:space="preserve"> </w:t>
       </w:r>
       <w:r>
-        <w:t xml:space="preserve">alignment fragmentation at 85–90% ANIm.</w:t>
+        <w:t xml:space="preserve">alignment fragmentation at 85–90% ANIm. The contamination is directly visible:</w:t>
+      </w:r>
+      <w:r>
+        <w:t xml:space="preserve"> </w:t>
+      </w:r>
+      <w:r>
+        <w:t xml:space="preserve">across the held-out set, dnadiff’s breakpoint count correlates with assembly</w:t>
+      </w:r>
+      <w:r>
+        <w:t xml:space="preserve"> </w:t>
+      </w:r>
+      <w:r>
+        <w:t xml:space="preserve">contig count at Spearman ρ = 0.28 (partial ρ = 0.34 controlling ANIm), and</w:t>
+      </w:r>
+      <w:r>
+        <w:t xml:space="preserve"> </w:t>
+      </w:r>
+      <w:r>
+        <w:t xml:space="preserve">62% of</w:t>
       </w:r>
       <w:r>
         <w:t xml:space="preserve"> </w:t>
@@ -3436,41 +3562,313 @@
         <w:t xml:space="preserve"> </w:t>
       </w:r>
       <w:r>
-        <w:t xml:space="preserve">is even more severely</w:t>
-      </w:r>
-      <w:r>
-        <w:t xml:space="preserve"> </w:t>
-      </w:r>
-      <w:r>
-        <w:t xml:space="preserve">contaminated: 62% of blocks are contig starts, and it correlates with contig</w:t>
-      </w:r>
-      <w:r>
-        <w:t xml:space="preserve"> </w:t>
-      </w:r>
-      <w:r>
-        <w:t xml:space="preserve">count at r = 0.771. These results support the fragmentation principle and argue</w:t>
-      </w:r>
-      <w:r>
-        <w:t xml:space="preserve"> </w:t>
-      </w:r>
-      <w:r>
-        <w:t xml:space="preserve">for prioritizing length-weighted ratios in structural comparison of draft</w:t>
-      </w:r>
-      <w:r>
-        <w:t xml:space="preserve"> </w:t>
-      </w:r>
-      <w:r>
-        <w:t xml:space="preserve">assemblies.</w:t>
+        <w:t xml:space="preserve">are contig starts (correlation with contig count</w:t>
+      </w:r>
+      <w:r>
+        <w:t xml:space="preserve"> </w:t>
+      </w:r>
+      <w:r>
+        <w:t xml:space="preserve">r = 0.771). Syn2b’s junction count, once the same contig correction is applied,</w:t>
+      </w:r>
+      <w:r>
+        <w:t xml:space="preserve"> </w:t>
+      </w:r>
+      <w:r>
+        <w:t xml:space="preserve">shows no residual contig-count dependence. These results support the</w:t>
+      </w:r>
+      <w:r>
+        <w:t xml:space="preserve"> </w:t>
+      </w:r>
+      <w:r>
+        <w:t xml:space="preserve">fragmentation principle and argue for prioritizing length-weighted ratios in</w:t>
+      </w:r>
+      <w:r>
+        <w:t xml:space="preserve"> </w:t>
+      </w:r>
+      <w:r>
+        <w:t xml:space="preserve">structural comparison of draft assemblies.</w:t>
       </w:r>
     </w:p>
     <w:bookmarkEnd w:id="15"/>
-    <w:bookmarkStart w:id="16" w:name="Xf6b0eddf9c0c3e42eb314c229d743bb331206ea"/>
+    <w:bookmarkStart w:id="16" w:name="X63ef91bfde80d80856d8f5fc6d8bcb8e9757653"/>
     <w:p>
       <w:pPr>
         <w:pStyle w:val="Heading3"/>
       </w:pPr>
       <w:r>
-        <w:t xml:space="preserve">6. SynTracker cohorts show ANI–synteny decoupling</w:t>
+        <w:t xml:space="preserve">6. One third of strain-level GTDB pairs carry invisible rearrangements</w:t>
+      </w:r>
+    </w:p>
+    <w:p>
+      <w:pPr>
+        <w:pStyle w:val="FirstParagraph"/>
+      </w:pPr>
+      <w:r>
+        <w:t xml:space="preserve">The validations above ask how faithfully Syn2b reproduces alignment-based</w:t>
+      </w:r>
+      <w:r>
+        <w:t xml:space="preserve"> </w:t>
+      </w:r>
+      <w:r>
+        <w:t xml:space="preserve">metrics; we now ask what those metrics reveal when applied genome-wide. We</w:t>
+      </w:r>
+      <w:r>
+        <w:t xml:space="preserve"> </w:t>
+      </w:r>
+      <w:r>
+        <w:t xml:space="preserve">merged the held-out set with the ANIm-verified high-ANI sample (47,748 pairs</w:t>
+      </w:r>
+      <w:r>
+        <w:t xml:space="preserve"> </w:t>
+      </w:r>
+      <w:r>
+        <w:t xml:space="preserve">with per-pair ANIm, dnadiff structural events, and Syn2b metrics) and counted</w:t>
+      </w:r>
+      <w:r>
+        <w:t xml:space="preserve"> </w:t>
+      </w:r>
+      <w:r>
+        <w:t xml:space="preserve">dnadiff inversion events per pair. Because inversion</w:t>
+      </w:r>
+      <w:r>
+        <w:t xml:space="preserve"> </w:t>
+      </w:r>
+      <w:r>
+        <w:rPr>
+          <w:i/>
+          <w:iCs/>
+        </w:rPr>
+        <w:t xml:space="preserve">counts</w:t>
+      </w:r>
+      <w:r>
+        <w:t xml:space="preserve"> </w:t>
+      </w:r>
+      <w:r>
+        <w:t xml:space="preserve">are insensitive to</w:t>
+      </w:r>
+      <w:r>
+        <w:t xml:space="preserve"> </w:t>
+      </w:r>
+      <w:r>
+        <w:t xml:space="preserve">the orientation conventions that affect length-based inverted fractions</w:t>
+      </w:r>
+      <w:r>
+        <w:t xml:space="preserve"> </w:t>
+      </w:r>
+      <w:r>
+        <w:t xml:space="preserve">(section 5), they provide a convention-free rearrangement truth.</w:t>
+      </w:r>
+    </w:p>
+    <w:p>
+      <w:pPr>
+        <w:pStyle w:val="BodyText"/>
+      </w:pPr>
+      <w:r>
+        <w:rPr>
+          <w:b/>
+          <w:bCs/>
+        </w:rPr>
+        <w:t xml:space="preserve">Rearrangement is common at strain-level ANI.</w:t>
+      </w:r>
+      <w:r>
+        <w:t xml:space="preserve"> </w:t>
+      </w:r>
+      <w:r>
+        <w:t xml:space="preserve">Of the 3,828 pairs with</w:t>
+      </w:r>
+      <w:r>
+        <w:t xml:space="preserve"> </w:t>
+      </w:r>
+      <w:r>
+        <w:t xml:space="preserve">ANIm ≥ 97%, 45% carry at least one dnadiff inversion and 1,295 (34%) carry two</w:t>
+      </w:r>
+      <w:r>
+        <w:t xml:space="preserve"> </w:t>
+      </w:r>
+      <w:r>
+        <w:t xml:space="preserve">or more — pairs that any ANI-based ranking would report as near-identical</w:t>
+      </w:r>
+      <w:r>
+        <w:t xml:space="preserve"> </w:t>
+      </w:r>
+      <w:r>
+        <w:t xml:space="preserve">(Figure 5a). The prevalence decays slowly with divergence: at ANIm ≥ 99%, 29%</w:t>
+      </w:r>
+      <w:r>
+        <w:t xml:space="preserve"> </w:t>
+      </w:r>
+      <w:r>
+        <w:t xml:space="preserve">of pairs still carry ≥1 inversion (18% ≥2; Figure 5b). Extreme cases include</w:t>
+      </w:r>
+      <w:r>
+        <w:t xml:space="preserve"> </w:t>
+      </w:r>
+      <w:r>
+        <w:t xml:space="preserve">two</w:t>
+      </w:r>
+      <w:r>
+        <w:t xml:space="preserve"> </w:t>
+      </w:r>
+      <w:r>
+        <w:rPr>
+          <w:i/>
+          <w:iCs/>
+        </w:rPr>
+        <w:t xml:space="preserve">Streptomyces</w:t>
+      </w:r>
+      <w:r>
+        <w:t xml:space="preserve"> </w:t>
+      </w:r>
+      <w:r>
+        <w:t xml:space="preserve">assemblies of the same species (ANIm 97.1%) with 129</w:t>
+      </w:r>
+      <w:r>
+        <w:t xml:space="preserve"> </w:t>
+      </w:r>
+      <w:r>
+        <w:t xml:space="preserve">dnadiff inversions between them (top cases in Supplementary Table 6).</w:t>
+      </w:r>
+    </w:p>
+    <w:p>
+      <w:pPr>
+        <w:pStyle w:val="BodyText"/>
+      </w:pPr>
+      <w:r>
+        <w:rPr>
+          <w:b/>
+          <w:bCs/>
+        </w:rPr>
+        <w:t xml:space="preserve">Discordant pairs are taxonomically structured.</w:t>
+      </w:r>
+      <w:r>
+        <w:t xml:space="preserve"> </w:t>
+      </w:r>
+      <w:r>
+        <w:t xml:space="preserve">Relative to concordant</w:t>
+      </w:r>
+      <w:r>
+        <w:t xml:space="preserve"> </w:t>
+      </w:r>
+      <w:r>
+        <w:t xml:space="preserve">high-ANI pairs, discordant pairs (ANIm ≥ 97%, ≥2 inversions) are enriched in</w:t>
+      </w:r>
+      <w:r>
+        <w:t xml:space="preserve"> </w:t>
+      </w:r>
+      <w:r>
+        <w:t xml:space="preserve">Proteobacteria (1.3×), Firmicutes (1.4×), Firmicutes_A (1.4×), and</w:t>
+      </w:r>
+      <w:r>
+        <w:t xml:space="preserve"> </w:t>
+      </w:r>
+      <w:r>
+        <w:t xml:space="preserve">Actinobacteriota (1.3×), and depleted in Spirochaetota (0.74×;</w:t>
+      </w:r>
+      <w:r>
+        <w:t xml:space="preserve"> </w:t>
+      </w:r>
+      <w:r>
+        <w:t xml:space="preserve">Figure 5c), consistent with known variation in genome rearrangement rates</w:t>
+      </w:r>
+      <w:r>
+        <w:t xml:space="preserve"> </w:t>
+      </w:r>
+      <w:r>
+        <w:t xml:space="preserve">across phyla.</w:t>
+      </w:r>
+    </w:p>
+    <w:p>
+      <w:pPr>
+        <w:pStyle w:val="BodyText"/>
+      </w:pPr>
+      <w:r>
+        <w:rPr>
+          <w:b/>
+          <w:bCs/>
+        </w:rPr>
+        <w:t xml:space="preserve">Syn2b flags discordant pairs at screening cost.</w:t>
+      </w:r>
+      <w:r>
+        <w:t xml:space="preserve"> </w:t>
+      </w:r>
+      <w:r>
+        <w:t xml:space="preserve">Syn2b’s junction count</w:t>
+      </w:r>
+      <w:r>
+        <w:t xml:space="preserve"> </w:t>
+      </w:r>
+      <w:r>
+        <w:t xml:space="preserve">ranks ≥97%-ANIm pairs by rearrangement burden with AUC 0.80 against dnadiff</w:t>
+      </w:r>
+      <w:r>
+        <w:t xml:space="preserve"> </w:t>
+      </w:r>
+      <w:r>
+        <w:t xml:space="preserve">inversion counts and shows no dependence on assembly contig number</w:t>
+      </w:r>
+      <w:r>
+        <w:t xml:space="preserve"> </w:t>
+      </w:r>
+      <w:r>
+        <w:t xml:space="preserve">(section 5). At a screening threshold of ≥12 junctions it flags 30% of</w:t>
+      </w:r>
+      <w:r>
+        <w:t xml:space="preserve"> </w:t>
+      </w:r>
+      <w:r>
+        <w:t xml:space="preserve">discordant pairs at a 4.6% false-positive rate on concordant pairs; flagged</w:t>
+      </w:r>
+      <w:r>
+        <w:t xml:space="preserve"> </w:t>
+      </w:r>
+      <w:r>
+        <w:t xml:space="preserve">pairs can then be committed to alignment-based validation. The remaining</w:t>
+      </w:r>
+      <w:r>
+        <w:t xml:space="preserve"> </w:t>
+      </w:r>
+      <w:r>
+        <w:t xml:space="preserve">discrepancy is expected from the sampling model: junction counts underestimate</w:t>
+      </w:r>
+      <w:r>
+        <w:t xml:space="preserve"> </w:t>
+      </w:r>
+      <w:r>
+        <w:t xml:space="preserve">rearrangements that fall between landmarks, and the ratio metric is blind to</w:t>
+      </w:r>
+      <w:r>
+        <w:t xml:space="preserve"> </w:t>
+      </w:r>
+      <w:r>
+        <w:t xml:space="preserve">event multiplicity. For database-scale applications the practical consequence</w:t>
+      </w:r>
+      <w:r>
+        <w:t xml:space="preserve"> </w:t>
+      </w:r>
+      <w:r>
+        <w:t xml:space="preserve">is direct: a genome search that reports only ANI will rank 1,295 structurally</w:t>
+      </w:r>
+      <w:r>
+        <w:t xml:space="preserve"> </w:t>
+      </w:r>
+      <w:r>
+        <w:t xml:space="preserve">divergent GTDB pairs as top hits, and Syn2b recovers this signal in</w:t>
+      </w:r>
+      <w:r>
+        <w:t xml:space="preserve"> </w:t>
+      </w:r>
+      <w:r>
+        <w:t xml:space="preserve">~19 ms per pair without any alignment.</w:t>
+      </w:r>
+    </w:p>
+    <w:bookmarkEnd w:id="16"/>
+    <w:bookmarkStart w:id="17" w:name="Xf6b0eddf9c0c3e42eb314c229d743bb331206ea"/>
+    <w:p>
+      <w:pPr>
+        <w:pStyle w:val="Heading3"/>
+      </w:pPr>
+      <w:r>
+        <w:t xml:space="preserve">7. SynTracker cohorts show ANI–synteny decoupling</w:t>
       </w:r>
     </w:p>
     <w:p>
@@ -3889,14 +4287,14 @@
         <w:t xml:space="preserve">only restriction-enzyme tags.</w:t>
       </w:r>
     </w:p>
-    <w:bookmarkEnd w:id="16"/>
-    <w:bookmarkStart w:id="17" w:name="runtime-benchmarking"/>
+    <w:bookmarkEnd w:id="17"/>
+    <w:bookmarkStart w:id="18" w:name="runtime-benchmarking"/>
     <w:p>
       <w:pPr>
         <w:pStyle w:val="Heading3"/>
       </w:pPr>
       <w:r>
-        <w:t xml:space="preserve">7. Runtime benchmarking</w:t>
+        <w:t xml:space="preserve">8. Runtime benchmarking</w:t>
       </w:r>
     </w:p>
     <w:p>
@@ -3944,7 +4342,7 @@
         <w:t xml:space="preserve"> </w:t>
       </w:r>
       <w:r>
-        <w:t xml:space="preserve">(BcgI) (Figure 5a). Pairwise structural comparison scales sub-linearly</w:t>
+        <w:t xml:space="preserve">(BcgI) (Figure 6a). Pairwise structural comparison scales sub-linearly</w:t>
       </w:r>
       <w:r>
         <w:t xml:space="preserve"> </w:t>
@@ -3962,7 +4360,7 @@
         <w:t xml:space="preserve"> </w:t>
       </w:r>
       <w:r>
-        <w:t xml:space="preserve">ms/pair for 22 genomes (Figure 5b). The n = 2 case is dominated by startup</w:t>
+        <w:t xml:space="preserve">ms/pair for 22 genomes (Figure 6b; Table 3). The n = 2 case is dominated by startup</w:t>
       </w:r>
       <w:r>
         <w:t xml:space="preserve"> </w:t>
@@ -4046,9 +4444,9 @@
         </w:pict>
       </w:r>
     </w:p>
-    <w:bookmarkEnd w:id="17"/>
     <w:bookmarkEnd w:id="18"/>
-    <w:bookmarkStart w:id="19" w:name="discussion"/>
+    <w:bookmarkEnd w:id="19"/>
+    <w:bookmarkStart w:id="20" w:name="discussion"/>
     <w:p>
       <w:pPr>
         <w:pStyle w:val="Heading2"/>
@@ -4062,7 +4460,7 @@
         <w:pStyle w:val="FirstParagraph"/>
       </w:pPr>
       <w:r>
-        <w:t xml:space="preserve">We have presented Strain2b (Syn2b), a rapid, alignment-free method for</w:t>
+        <w:t xml:space="preserve">We have presented Syn2b, a rapid, alignment-free method for</w:t>
       </w:r>
       <w:r>
         <w:t xml:space="preserve"> </w:t>
@@ -4098,19 +4496,19 @@
           <w:b/>
           <w:bCs/>
         </w:rPr>
-        <w:t xml:space="preserve">Comparison to microsynteny and alignment-based workflows.</w:t>
-      </w:r>
-      <w:r>
-        <w:t xml:space="preserve"> </w:t>
-      </w:r>
-      <w:r>
-        <w:t xml:space="preserve">SynTracker</w:t>
-      </w:r>
-      <w:r>
-        <w:t xml:space="preserve"> </w:t>
-      </w:r>
-      <w:r>
-        <w:t xml:space="preserve">pioneered microsynteny for strain comparison but requires BLAST databases and</w:t>
+        <w:t xml:space="preserve">Comparison to existing structural workflows.</w:t>
+      </w:r>
+      <w:r>
+        <w:t xml:space="preserve"> </w:t>
+      </w:r>
+      <w:r>
+        <w:t xml:space="preserve">SynTracker pioneered</w:t>
+      </w:r>
+      <w:r>
+        <w:t xml:space="preserve"> </w:t>
+      </w:r>
+      <w:r>
+        <w:t xml:space="preserve">microsynteny for strain comparison but requires BLAST databases and</w:t>
       </w:r>
       <w:r>
         <w:t xml:space="preserve"> </w:t>
@@ -4122,61 +4520,79 @@
         <w:t xml:space="preserve"> </w:t>
       </w:r>
       <w:r>
-        <w:t xml:space="preserve">18.1 h on 16 cores (135 s per pair; Supplementary Table 4), about 15,000 times</w:t>
-      </w:r>
-      <w:r>
-        <w:t xml:space="preserve"> </w:t>
-      </w:r>
-      <w:r>
-        <w:t xml:space="preserve">slower than Syn2b for a comparable structural read-out. Alignment-based SV</w:t>
-      </w:r>
-      <w:r>
-        <w:t xml:space="preserve"> </w:t>
-      </w:r>
-      <w:r>
-        <w:t xml:space="preserve">callers such as dnadiff</w:t>
-      </w:r>
-      <w:r>
-        <w:t xml:space="preserve"> </w:t>
-      </w:r>
-      <w:r>
-        <w:t xml:space="preserve">provide ground truth but require a pairwise nucmer alignment per genome pair</w:t>
-      </w:r>
-      <w:r>
-        <w:t xml:space="preserve"> </w:t>
-      </w:r>
-      <w:r>
-        <w:t xml:space="preserve">(~3.8 s per pair on our benchmark; Supplementary Table 4). Syn2b achieves the</w:t>
-      </w:r>
-      <w:r>
-        <w:t xml:space="preserve"> </w:t>
-      </w:r>
-      <w:r>
-        <w:t xml:space="preserve">same structural signal through Type IIB tag adjacency, without pairwise</w:t>
-      </w:r>
-      <w:r>
-        <w:t xml:space="preserve"> </w:t>
-      </w:r>
-      <w:r>
-        <w:t xml:space="preserve">alignment or a pre-built database, and is therefore orders of magnitude faster</w:t>
-      </w:r>
-      <w:r>
-        <w:t xml:space="preserve"> </w:t>
-      </w:r>
-      <w:r>
-        <w:t xml:space="preserve">for large panels (~19 ms per unique pair). The GTDB validation shows that the</w:t>
-      </w:r>
-      <w:r>
-        <w:t xml:space="preserve"> </w:t>
-      </w:r>
-      <w:r>
-        <w:t xml:space="preserve">orientation ratio alone matches dnadiff at r = 0.94 overall and r = 0.996 at</w:t>
-      </w:r>
-      <w:r>
-        <w:t xml:space="preserve"> </w:t>
-      </w:r>
-      <w:r>
-        <w:t xml:space="preserve">ANIm ≥ 97%.</w:t>
+        <w:t xml:space="preserve">18.1 h on 16 cores (135 s per ordered pair; Supplementary Table 4), about</w:t>
+      </w:r>
+      <w:r>
+        <w:t xml:space="preserve"> </w:t>
+      </w:r>
+      <w:r>
+        <w:t xml:space="preserve">15,000 times slower than Syn2b for a comparable structural read-out.</w:t>
+      </w:r>
+      <w:r>
+        <w:t xml:space="preserve"> </w:t>
+      </w:r>
+      <w:r>
+        <w:t xml:space="preserve">Alignment-based callers such as dnadiff provide ground truth but require a</w:t>
+      </w:r>
+      <w:r>
+        <w:t xml:space="preserve"> </w:t>
+      </w:r>
+      <w:r>
+        <w:t xml:space="preserve">pairwise nucmer alignment per genome pair (~8.0 s per unique pair on our</w:t>
+      </w:r>
+      <w:r>
+        <w:t xml:space="preserve"> </w:t>
+      </w:r>
+      <w:r>
+        <w:t xml:space="preserve">benchmark; Supplementary Table 4). Syn2b achieves the same structural signal</w:t>
+      </w:r>
+      <w:r>
+        <w:t xml:space="preserve"> </w:t>
+      </w:r>
+      <w:r>
+        <w:t xml:space="preserve">through Type IIB tag adjacency, without pairwise alignment or a pre-built</w:t>
+      </w:r>
+      <w:r>
+        <w:t xml:space="preserve"> </w:t>
+      </w:r>
+      <w:r>
+        <w:t xml:space="preserve">database, at ~19 ms per unique pair. Other alignment-free approaches — MinHash</w:t>
+      </w:r>
+      <w:r>
+        <w:t xml:space="preserve"> </w:t>
+      </w:r>
+      <w:r>
+        <w:t xml:space="preserve">distances (Mash¹⁸) and sparse chaining (skani²¹) — summarize genomes as k-mer</w:t>
+      </w:r>
+      <w:r>
+        <w:t xml:space="preserve"> </w:t>
+      </w:r>
+      <w:r>
+        <w:t xml:space="preserve">sets and are by construction blind to adjacency, as our controlled benchmarks</w:t>
+      </w:r>
+      <w:r>
+        <w:t xml:space="preserve"> </w:t>
+      </w:r>
+      <w:r>
+        <w:t xml:space="preserve">confirm (Figure 2d); Syn2b retains ordered landmarks at comparable cost and is,</w:t>
+      </w:r>
+      <w:r>
+        <w:t xml:space="preserve"> </w:t>
+      </w:r>
+      <w:r>
+        <w:t xml:space="preserve">to our knowledge, the fastest method that reports any length-resolved</w:t>
+      </w:r>
+      <w:r>
+        <w:t xml:space="preserve"> </w:t>
+      </w:r>
+      <w:r>
+        <w:t xml:space="preserve">structural quantity. The GTDB validation shows that the orientation ratio alone</w:t>
+      </w:r>
+      <w:r>
+        <w:t xml:space="preserve"> </w:t>
+      </w:r>
+      <w:r>
+        <w:t xml:space="preserve">matches dnadiff at r = 0.94 overall and r = 0.996 at ANIm ≥ 97%.</w:t>
       </w:r>
     </w:p>
     <w:p>
@@ -4188,55 +4604,55 @@
           <w:b/>
           <w:bCs/>
         </w:rPr>
-        <w:t xml:space="preserve">Comparison to alignment-based SV callers.</w:t>
-      </w:r>
-      <w:r>
-        <w:t xml:space="preserve"> </w:t>
-      </w:r>
-      <w:r>
-        <w:t xml:space="preserve">dnadiff and minimap2 provide</w:t>
-      </w:r>
-      <w:r>
-        <w:t xml:space="preserve"> </w:t>
-      </w:r>
-      <w:r>
-        <w:t xml:space="preserve">ground-truth structural information but are slow and require pairwise alignment.</w:t>
-      </w:r>
-      <w:r>
-        <w:t xml:space="preserve"> </w:t>
-      </w:r>
-      <w:r>
-        <w:t xml:space="preserve">Syn2b approximates their length-weighted orientation signal at a small fraction</w:t>
-      </w:r>
-      <w:r>
-        <w:t xml:space="preserve"> </w:t>
-      </w:r>
-      <w:r>
-        <w:t xml:space="preserve">of the cost, making structural prescreening of large genome collections</w:t>
-      </w:r>
-      <w:r>
-        <w:t xml:space="preserve"> </w:t>
-      </w:r>
-      <w:r>
-        <w:t xml:space="preserve">practical before committing selected pairs to alignment-based validation.</w:t>
-      </w:r>
-      <w:r>
-        <w:t xml:space="preserve"> </w:t>
-      </w:r>
-      <w:r>
-        <w:t xml:space="preserve">Transition-count metrics</w:t>
-      </w:r>
-      <w:r>
-        <w:t xml:space="preserve"> </w:t>
-      </w:r>
-      <w:r>
-        <w:t xml:space="preserve">from both Syn2b and dnadiff are confounded by fragmentation at the</w:t>
-      </w:r>
-      <w:r>
-        <w:t xml:space="preserve"> </w:t>
-      </w:r>
-      <w:r>
-        <w:t xml:space="preserve">inter-species ANI range, which is why we emphasize ratios for draft genomes.</w:t>
+        <w:t xml:space="preserve">What genome-wide screening reveals.</w:t>
+      </w:r>
+      <w:r>
+        <w:t xml:space="preserve"> </w:t>
+      </w:r>
+      <w:r>
+        <w:t xml:space="preserve">The discordance survey in section 6</w:t>
+      </w:r>
+      <w:r>
+        <w:t xml:space="preserve"> </w:t>
+      </w:r>
+      <w:r>
+        <w:t xml:space="preserve">gives a concrete use case. GTDB-R207 contains 1,295 genome pairs that any</w:t>
+      </w:r>
+      <w:r>
+        <w:t xml:space="preserve"> </w:t>
+      </w:r>
+      <w:r>
+        <w:t xml:space="preserve">ANI-only search will rank as near-identical (ANIm ≥ 97%) yet that carry ≥2</w:t>
+      </w:r>
+      <w:r>
+        <w:t xml:space="preserve"> </w:t>
+      </w:r>
+      <w:r>
+        <w:t xml:space="preserve">alignment-visible inversions. Fast adjacency-based metrics make such pairs</w:t>
+      </w:r>
+      <w:r>
+        <w:t xml:space="preserve"> </w:t>
+      </w:r>
+      <w:r>
+        <w:t xml:space="preserve">discoverable at database scale and in real time during genome search, at which</w:t>
+      </w:r>
+      <w:r>
+        <w:t xml:space="preserve"> </w:t>
+      </w:r>
+      <w:r>
+        <w:t xml:space="preserve">point selected pairs can be committed to alignment-based validation. We expect</w:t>
+      </w:r>
+      <w:r>
+        <w:t xml:space="preserve"> </w:t>
+      </w:r>
+      <w:r>
+        <w:t xml:space="preserve">this screening role — rather than replacement of alignment-based callers — to</w:t>
+      </w:r>
+      <w:r>
+        <w:t xml:space="preserve"> </w:t>
+      </w:r>
+      <w:r>
+        <w:t xml:space="preserve">be the primary mode of use.</w:t>
       </w:r>
     </w:p>
     <w:p>
@@ -4314,19 +4730,37 @@
         <w:t xml:space="preserve"> </w:t>
       </w:r>
       <w:r>
-        <w:t xml:space="preserve">and it is most reliable when the inverted fraction is below 0.5 unless the</w:t>
-      </w:r>
-      <w:r>
-        <w:t xml:space="preserve"> </w:t>
-      </w:r>
-      <w:r>
-        <w:t xml:space="preserve">fixed-reference convention is used. Transition-count metrics can be used on</w:t>
-      </w:r>
-      <w:r>
-        <w:t xml:space="preserve"> </w:t>
-      </w:r>
-      <w:r>
-        <w:t xml:space="preserve">closed genomes or after explicit contig correction. Repeated sequences and</w:t>
+        <w:t xml:space="preserve">and per-pair biological interpretation of the inverted fraction requires</w:t>
+      </w:r>
+      <w:r>
+        <w:t xml:space="preserve"> </w:t>
+      </w:r>
+      <w:r>
+        <w:t xml:space="preserve">orientation-consistent assemblies, because arbitrary contig orientation in draft</w:t>
+      </w:r>
+      <w:r>
+        <w:t xml:space="preserve"> </w:t>
+      </w:r>
+      <w:r>
+        <w:t xml:space="preserve">assemblies drives fixed-reference fractions toward 0.5 even between identical</w:t>
+      </w:r>
+      <w:r>
+        <w:t xml:space="preserve"> </w:t>
+      </w:r>
+      <w:r>
+        <w:t xml:space="preserve">genomes; inversion counts are free of this convention but carry the</w:t>
+      </w:r>
+      <w:r>
+        <w:t xml:space="preserve"> </w:t>
+      </w:r>
+      <w:r>
+        <w:t xml:space="preserve">fragmentation dependence of all transition counts, and are best used on</w:t>
+      </w:r>
+      <w:r>
+        <w:t xml:space="preserve"> </w:t>
+      </w:r>
+      <w:r>
+        <w:t xml:space="preserve">low-contig or contig-corrected assemblies. Repeated sequences and</w:t>
       </w:r>
       <w:r>
         <w:t xml:space="preserve"> </w:t>
@@ -4372,8 +4806,8 @@
         </w:pict>
       </w:r>
     </w:p>
-    <w:bookmarkEnd w:id="19"/>
-    <w:bookmarkStart w:id="27" w:name="methods"/>
+    <w:bookmarkEnd w:id="20"/>
+    <w:bookmarkStart w:id="29" w:name="methods"/>
     <w:p>
       <w:pPr>
         <w:pStyle w:val="Heading2"/>
@@ -4382,7 +4816,7 @@
         <w:t xml:space="preserve">Methods</w:t>
       </w:r>
     </w:p>
-    <w:bookmarkStart w:id="20" w:name="in-silico-genome-simulation"/>
+    <w:bookmarkStart w:id="21" w:name="in-silico-genome-simulation"/>
     <w:p>
       <w:pPr>
         <w:pStyle w:val="Heading3"/>
@@ -4472,8 +4906,8 @@
         <w:t xml:space="preserve">hardcoded.</w:t>
       </w:r>
     </w:p>
-    <w:bookmarkEnd w:id="20"/>
-    <w:bookmarkStart w:id="21" w:name="type-iib-enzyme-digestion"/>
+    <w:bookmarkEnd w:id="21"/>
+    <w:bookmarkStart w:id="22" w:name="type-iib-enzyme-digestion"/>
     <w:p>
       <w:pPr>
         <w:pStyle w:val="Heading3"/>
@@ -4587,8 +5021,8 @@
         <w:t xml:space="preserve">(27-bp tag): offset 8=AAG, offset 16=CTT (palindromic).</w:t>
       </w:r>
     </w:p>
-    <w:bookmarkEnd w:id="21"/>
-    <w:bookmarkStart w:id="22" w:name="syn2b-metrics"/>
+    <w:bookmarkEnd w:id="22"/>
+    <w:bookmarkStart w:id="23" w:name="syn2b-metrics"/>
     <w:p>
       <w:pPr>
         <w:pStyle w:val="Heading3"/>
@@ -4828,8 +5262,8 @@
         <w:t xml:space="preserve">blocks originate at contig starts (Results, GTDB-R207 validation).</w:t>
       </w:r>
     </w:p>
-    <w:bookmarkEnd w:id="22"/>
-    <w:bookmarkStart w:id="23" w:name="gtdb-r207-validation"/>
+    <w:bookmarkEnd w:id="23"/>
+    <w:bookmarkStart w:id="24" w:name="gtdb-r207-validation"/>
     <w:p>
       <w:pPr>
         <w:pStyle w:val="Heading3"/>
@@ -5005,8 +5439,8 @@
         <w:t xml:space="preserve">Fisher z-transformation.</w:t>
       </w:r>
     </w:p>
-    <w:bookmarkEnd w:id="23"/>
-    <w:bookmarkStart w:id="24" w:name="skani-ani-for-cohort-analysis"/>
+    <w:bookmarkEnd w:id="24"/>
+    <w:bookmarkStart w:id="25" w:name="skani-ani-for-cohort-analysis"/>
     <w:p>
       <w:pPr>
         <w:pStyle w:val="Heading3"/>
@@ -5044,13 +5478,172 @@
         <w:t xml:space="preserve">assembly sets to obtain the ANI values used in Figure 4.</w:t>
       </w:r>
     </w:p>
-    <w:bookmarkEnd w:id="24"/>
-    <w:bookmarkStart w:id="25" w:name="software-availability"/>
+    <w:bookmarkEnd w:id="25"/>
+    <w:bookmarkStart w:id="26" w:name="X8a39519311735125bd69615251976c20069db80"/>
     <w:p>
       <w:pPr>
         <w:pStyle w:val="Heading3"/>
       </w:pPr>
       <w:r>
+        <w:t xml:space="preserve">Genome-wide ANI–rearrangement discordance analysis</w:t>
+      </w:r>
+    </w:p>
+    <w:p>
+      <w:pPr>
+        <w:pStyle w:val="FirstParagraph"/>
+      </w:pPr>
+      <w:r>
+        <w:t xml:space="preserve">The held-out set and the ANIm-verified high-ANI sample were merged on</w:t>
+      </w:r>
+      <w:r>
+        <w:t xml:space="preserve"> </w:t>
+      </w:r>
+      <w:r>
+        <w:rPr>
+          <w:rStyle w:val="VerbatimChar"/>
+        </w:rPr>
+        <w:t xml:space="preserve">pairid</w:t>
+      </w:r>
+      <w:r>
+        <w:t xml:space="preserve"> </w:t>
+      </w:r>
+      <w:r>
+        <w:t xml:space="preserve">(no overlap between the two sets). Per-pair ANIm, dnadiff inversion</w:t>
+      </w:r>
+      <w:r>
+        <w:t xml:space="preserve"> </w:t>
+      </w:r>
+      <w:r>
+        <w:t xml:space="preserve">counts (</w:t>
+      </w:r>
+      <w:r>
+        <w:rPr>
+          <w:rStyle w:val="VerbatimChar"/>
+        </w:rPr>
+        <w:t xml:space="preserve">max</w:t>
+      </w:r>
+      <w:r>
+        <w:t xml:space="preserve"> </w:t>
+      </w:r>
+      <w:r>
+        <w:t xml:space="preserve">of the reference-side and query-side</w:t>
+      </w:r>
+      <w:r>
+        <w:t xml:space="preserve"> </w:t>
+      </w:r>
+      <w:r>
+        <w:rPr>
+          <w:rStyle w:val="VerbatimChar"/>
+        </w:rPr>
+        <w:t xml:space="preserve">dd_inversions</w:t>
+      </w:r>
+      <w:r>
+        <w:t xml:space="preserve"> </w:t>
+      </w:r>
+      <w:r>
+        <w:t xml:space="preserve">columns of</w:t>
+      </w:r>
+      <w:r>
+        <w:t xml:space="preserve"> </w:t>
+      </w:r>
+      <w:r>
+        <w:t xml:space="preserve">the dnadiff</w:t>
+      </w:r>
+      <w:r>
+        <w:t xml:space="preserve"> </w:t>
+      </w:r>
+      <w:r>
+        <w:rPr>
+          <w:rStyle w:val="VerbatimChar"/>
+        </w:rPr>
+        <w:t xml:space="preserve">.report</w:t>
+      </w:r>
+      <w:r>
+        <w:t xml:space="preserve"> </w:t>
+      </w:r>
+      <w:r>
+        <w:t xml:space="preserve">output), dnadiff breakpoint counts, Syn2b junction</w:t>
+      </w:r>
+      <w:r>
+        <w:t xml:space="preserve"> </w:t>
+      </w:r>
+      <w:r>
+        <w:t xml:space="preserve">counts, and per-genome contig numbers (from GTDB-R207 metadata) were combined</w:t>
+      </w:r>
+      <w:r>
+        <w:t xml:space="preserve"> </w:t>
+      </w:r>
+      <w:r>
+        <w:t xml:space="preserve">with the analysis script</w:t>
+      </w:r>
+      <w:r>
+        <w:t xml:space="preserve"> </w:t>
+      </w:r>
+      <w:r>
+        <w:rPr>
+          <w:rStyle w:val="VerbatimChar"/>
+        </w:rPr>
+        <w:t xml:space="preserve">scripts/analyze_ani_synteny_discordance.py</w:t>
+      </w:r>
+      <w:r>
+        <w:t xml:space="preserve">, which</w:t>
+      </w:r>
+      <w:r>
+        <w:t xml:space="preserve"> </w:t>
+      </w:r>
+      <w:r>
+        <w:t xml:space="preserve">also produces Figure 5 and all discordance summary statistics. A pair was</w:t>
+      </w:r>
+      <w:r>
+        <w:t xml:space="preserve"> </w:t>
+      </w:r>
+      <w:r>
+        <w:t xml:space="preserve">called discordant if ANIm ≥ 97% and it carried ≥2 dnadiff inversion events.</w:t>
+      </w:r>
+      <w:r>
+        <w:t xml:space="preserve"> </w:t>
+      </w:r>
+      <w:r>
+        <w:t xml:space="preserve">Phylum-level enrichment was computed against the concordant (ANIm ≥ 97%,</w:t>
+      </w:r>
+      <w:r>
+        <w:t xml:space="preserve"> </w:t>
+      </w:r>
+      <w:r>
+        <w:t xml:space="preserve">&lt;2 inversions) background. Syn2b flagging performance was quantified as the</w:t>
+      </w:r>
+      <w:r>
+        <w:t xml:space="preserve"> </w:t>
+      </w:r>
+      <w:r>
+        <w:t xml:space="preserve">ROC AUC of the Syn2b junction count for discriminating discordant from</w:t>
+      </w:r>
+      <w:r>
+        <w:t xml:space="preserve"> </w:t>
+      </w:r>
+      <w:r>
+        <w:t xml:space="preserve">concordant pairs. Fragmentation dependence of breakpoint-style counts was</w:t>
+      </w:r>
+      <w:r>
+        <w:t xml:space="preserve"> </w:t>
+      </w:r>
+      <w:r>
+        <w:t xml:space="preserve">assessed by Spearman correlation with the per-pair maximum contig count and by</w:t>
+      </w:r>
+      <w:r>
+        <w:t xml:space="preserve"> </w:t>
+      </w:r>
+      <w:r>
+        <w:t xml:space="preserve">partial correlation controlling for ANIm.</w:t>
+      </w:r>
+    </w:p>
+    <w:bookmarkEnd w:id="26"/>
+    <w:bookmarkStart w:id="27" w:name="software-availability"/>
+    <w:p>
+      <w:pPr>
+        <w:pStyle w:val="Heading3"/>
+      </w:pPr>
+      <w:r>
         <w:t xml:space="preserve">Software availability</w:t>
       </w:r>
     </w:p>
@@ -5074,8 +5667,8 @@
         <w:t xml:space="preserve">Companion ANI tool and paper: https://github.com/HuangShiLab/Syn2bANI-paper</w:t>
       </w:r>
     </w:p>
-    <w:bookmarkEnd w:id="25"/>
-    <w:bookmarkStart w:id="26" w:name="data-availability"/>
+    <w:bookmarkEnd w:id="27"/>
+    <w:bookmarkStart w:id="28" w:name="data-availability"/>
     <w:p>
       <w:pPr>
         <w:pStyle w:val="Heading3"/>
@@ -5182,9 +5775,9 @@
         </w:pict>
       </w:r>
     </w:p>
-    <w:bookmarkEnd w:id="26"/>
-    <w:bookmarkEnd w:id="27"/>
-    <w:bookmarkStart w:id="28" w:name="references"/>
+    <w:bookmarkEnd w:id="28"/>
+    <w:bookmarkEnd w:id="29"/>
+    <w:bookmarkStart w:id="30" w:name="references"/>
     <w:p>
       <w:pPr>
         <w:pStyle w:val="Heading2"/>
@@ -6301,8 +6894,8 @@
         </w:pict>
       </w:r>
     </w:p>
-    <w:bookmarkEnd w:id="28"/>
-    <w:bookmarkStart w:id="29" w:name="figures-and-tables"/>
+    <w:bookmarkEnd w:id="30"/>
+    <w:bookmarkStart w:id="31" w:name="figures-and-tables"/>
     <w:p>
       <w:pPr>
         <w:pStyle w:val="Heading2"/>
@@ -6698,7 +7291,76 @@
           <w:b/>
           <w:bCs/>
         </w:rPr>
-        <w:t xml:space="preserve">Figure 5. Runtime and scaling.</w:t>
+        <w:t xml:space="preserve">Figure 5. Genome-wide ANI–rearrangement discordance in GTDB-R207.</w:t>
+      </w:r>
+      <w:r>
+        <w:t xml:space="preserve"> </w:t>
+      </w:r>
+      <w:r>
+        <w:t xml:space="preserve">(a) Pair-density map of ANIm versus dnadiff inversion-event count across</w:t>
+      </w:r>
+      <w:r>
+        <w:t xml:space="preserve"> </w:t>
+      </w:r>
+      <w:r>
+        <w:t xml:space="preserve">47,748 pairs (held-out set plus ANIm-verified high-ANI sample); the red line</w:t>
+      </w:r>
+      <w:r>
+        <w:t xml:space="preserve"> </w:t>
+      </w:r>
+      <w:r>
+        <w:t xml:space="preserve">marks the species-level ANI threshold and the annotation gives the number of</w:t>
+      </w:r>
+      <w:r>
+        <w:t xml:space="preserve"> </w:t>
+      </w:r>
+      <w:r>
+        <w:t xml:space="preserve">discordant pairs (ANIm ≥ 97%, ≥2 inversions). (b) Percentage of pairs carrying</w:t>
+      </w:r>
+      <w:r>
+        <w:t xml:space="preserve"> </w:t>
+      </w:r>
+      <w:r>
+        <w:t xml:space="preserve">at least 1, 2, or 5 dnadiff inversions per 1% ANIm bin — rearrangement</w:t>
+      </w:r>
+      <w:r>
+        <w:t xml:space="preserve"> </w:t>
+      </w:r>
+      <w:r>
+        <w:t xml:space="preserve">prevalence decays slowly as ANI approaches 100%. (c) Phylum composition of</w:t>
+      </w:r>
+      <w:r>
+        <w:t xml:space="preserve"> </w:t>
+      </w:r>
+      <w:r>
+        <w:t xml:space="preserve">discordant pairs (dark blue) versus concordant ANIm ≥ 97% pairs (light blue);</w:t>
+      </w:r>
+      <w:r>
+        <w:t xml:space="preserve"> </w:t>
+      </w:r>
+      <w:r>
+        <w:t xml:space="preserve">numbers give the enrichment fold. (</w:t>
+      </w:r>
+      <w:r>
+        <w:rPr>
+          <w:rStyle w:val="VerbatimChar"/>
+        </w:rPr>
+        <w:t xml:space="preserve">figures/main/fig5_discordance_overview.png</w:t>
+      </w:r>
+      <w:r>
+        <w:t xml:space="preserve">).</w:t>
+      </w:r>
+    </w:p>
+    <w:p>
+      <w:pPr>
+        <w:pStyle w:val="BodyText"/>
+      </w:pPr>
+      <w:r>
+        <w:rPr>
+          <w:b/>
+          <w:bCs/>
+        </w:rPr>
+        <w:t xml:space="preserve">Figure 6. Runtime and scaling.</w:t>
       </w:r>
       <w:r>
         <w:t xml:space="preserve"> </w:t>
@@ -7808,7 +8470,7 @@
           <w:b/>
           <w:bCs/>
         </w:rPr>
-        <w:t xml:space="preserve">Table 4. Runtime and scaling of Syn2b structural comparison.</w:t>
+        <w:t xml:space="preserve">Table 3. Runtime and scaling of Syn2b structural comparison.</w:t>
       </w:r>
     </w:p>
     <w:p>
@@ -7852,7 +8514,13 @@
         <w:t xml:space="preserve"> </w:t>
       </w:r>
       <w:r>
-        <w:t xml:space="preserve">unordered genome pairs used for the per-pair estimate.</w:t>
+        <w:t xml:space="preserve">unordered genome pairs used for the per-pair estimate. Per-pair times are</w:t>
+      </w:r>
+      <w:r>
+        <w:t xml:space="preserve"> </w:t>
+      </w:r>
+      <w:r>
+        <w:t xml:space="preserve">reported per unique pair throughout the paper.</w:t>
       </w:r>
     </w:p>
     <w:tbl>
@@ -8250,7 +8918,7 @@
         <w:t xml:space="preserve"> </w:t>
       </w:r>
       <w:r>
-        <w:t xml:space="preserve">excluded from the amortized scaling curve in Figure 5b.</w:t>
+        <w:t xml:space="preserve">excluded from the amortized scaling curve in Figure 6b.</w:t>
       </w:r>
     </w:p>
     <w:p>
@@ -8260,8 +8928,8 @@
         </w:pict>
       </w:r>
     </w:p>
-    <w:bookmarkEnd w:id="29"/>
-    <w:bookmarkStart w:id="33" w:name="supplementary-information"/>
+    <w:bookmarkEnd w:id="31"/>
+    <w:bookmarkStart w:id="35" w:name="supplementary-information"/>
     <w:p>
       <w:pPr>
         <w:pStyle w:val="Heading2"/>
@@ -8270,7 +8938,7 @@
         <w:t xml:space="preserve">Supplementary Information</w:t>
       </w:r>
     </w:p>
-    <w:bookmarkStart w:id="30" w:name="supplementary-notes"/>
+    <w:bookmarkStart w:id="32" w:name="supplementary-notes"/>
     <w:p>
       <w:pPr>
         <w:pStyle w:val="Heading3"/>
@@ -8362,8 +9030,8 @@
         <w:t xml:space="preserve">).</w:t>
       </w:r>
     </w:p>
-    <w:bookmarkEnd w:id="30"/>
-    <w:bookmarkStart w:id="31" w:name="supplementary-tables"/>
+    <w:bookmarkEnd w:id="32"/>
+    <w:bookmarkStart w:id="33" w:name="supplementary-tables"/>
     <w:p>
       <w:pPr>
         <w:pStyle w:val="Heading3"/>
@@ -8514,7 +9182,7 @@
         <w:t xml:space="preserve"> </w:t>
       </w:r>
       <w:r>
-        <w:t xml:space="preserve">(484 ordered pairs) (</w:t>
+        <w:t xml:space="preserve">(231 unique pairs) (</w:t>
       </w:r>
       <w:r>
         <w:rPr>
@@ -8581,13 +9249,86 @@
     </w:p>
     <w:p>
       <w:pPr>
-        <w:pStyle w:val="FirstParagraph"/>
+        <w:pStyle w:val="Compact"/>
+        <w:numPr>
+          <w:ilvl w:val="0"/>
+          <w:numId w:val="1005"/>
+        </w:numPr>
       </w:pPr>
       <w:r>
         <w:rPr>
           <w:b/>
           <w:bCs/>
         </w:rPr>
+        <w:t xml:space="preserve">Supplementary Table 6:</w:t>
+      </w:r>
+      <w:r>
+        <w:t xml:space="preserve"> </w:t>
+      </w:r>
+      <w:r>
+        <w:t xml:space="preserve">ANI–rearrangement discordance across GTDB-R207:</w:t>
+      </w:r>
+      <w:r>
+        <w:t xml:space="preserve"> </w:t>
+      </w:r>
+      <w:r>
+        <w:t xml:space="preserve">inversion-event rates per ANIm band, top discordant pairs with taxonomy, and</w:t>
+      </w:r>
+      <w:r>
+        <w:t xml:space="preserve"> </w:t>
+      </w:r>
+      <w:r>
+        <w:t xml:space="preserve">Syn2b flagging performance</w:t>
+      </w:r>
+      <w:r>
+        <w:t xml:space="preserve"> </w:t>
+      </w:r>
+      <w:r>
+        <w:t xml:space="preserve">(</w:t>
+      </w:r>
+      <w:r>
+        <w:rPr>
+          <w:rStyle w:val="VerbatimChar"/>
+        </w:rPr>
+        <w:t xml:space="preserve">results/discordance/discordance_by_band.tsv</w:t>
+      </w:r>
+      <w:r>
+        <w:t xml:space="preserve">,</w:t>
+      </w:r>
+      <w:r>
+        <w:t xml:space="preserve"> </w:t>
+      </w:r>
+      <w:r>
+        <w:rPr>
+          <w:rStyle w:val="VerbatimChar"/>
+        </w:rPr>
+        <w:t xml:space="preserve">results/discordance/discordant_pairs_top.tsv</w:t>
+      </w:r>
+      <w:r>
+        <w:t xml:space="preserve">,</w:t>
+      </w:r>
+      <w:r>
+        <w:t xml:space="preserve"> </w:t>
+      </w:r>
+      <w:r>
+        <w:rPr>
+          <w:rStyle w:val="VerbatimChar"/>
+        </w:rPr>
+        <w:t xml:space="preserve">results/discordance/syn2b_flagging.tsv</w:t>
+      </w:r>
+      <w:r>
+        <w:t xml:space="preserve">).</w:t>
+      </w:r>
+    </w:p>
+    <w:p>
+      <w:pPr>
+        <w:pStyle w:val="FirstParagraph"/>
+      </w:pPr>
+      <w:r>
+        <w:rPr>
+          <w:b/>
+          <w:bCs/>
+        </w:rPr>
         <w:t xml:space="preserve">Supplementary Table 2.</w:t>
       </w:r>
       <w:r>
@@ -8606,7 +9347,13 @@
         <w:t xml:space="preserve"> </w:t>
       </w:r>
       <w:r>
-        <w:t xml:space="preserve">Per-pair times use the n² ordered pairs recorded in the benchmark.</w:t>
+        <w:t xml:space="preserve">Per-pair times are per unique unordered pair C(n,2); the benchmark recorded</w:t>
+      </w:r>
+      <w:r>
+        <w:t xml:space="preserve"> </w:t>
+      </w:r>
+      <w:r>
+        <w:t xml:space="preserve">n² ordered (self-plus-reciprocal) comparisons.</w:t>
       </w:r>
     </w:p>
     <w:tbl>
@@ -8771,55 +9518,55 @@
               <w:jc w:val="right"/>
             </w:pPr>
             <w:r>
-              <w:t xml:space="preserve">128.9</w:t>
-            </w:r>
-          </w:p>
-        </w:tc>
-        <w:tc>
-          <w:tcPr/>
-          <w:p>
-            <w:pPr>
-              <w:pStyle w:val="Compact"/>
-              <w:jc w:val="right"/>
-            </w:pPr>
-            <w:r>
-              <w:t xml:space="preserve">41.9</w:t>
-            </w:r>
-          </w:p>
-        </w:tc>
-        <w:tc>
-          <w:tcPr/>
-          <w:p>
-            <w:pPr>
-              <w:pStyle w:val="Compact"/>
-              <w:jc w:val="right"/>
-            </w:pPr>
-            <w:r>
-              <w:t xml:space="preserve">4.91</w:t>
-            </w:r>
-          </w:p>
-        </w:tc>
-        <w:tc>
-          <w:tcPr/>
-          <w:p>
-            <w:pPr>
-              <w:pStyle w:val="Compact"/>
-              <w:jc w:val="right"/>
-            </w:pPr>
-            <w:r>
-              <w:t xml:space="preserve">4.95</w:t>
-            </w:r>
-          </w:p>
-        </w:tc>
-        <w:tc>
-          <w:tcPr/>
-          <w:p>
-            <w:pPr>
-              <w:pStyle w:val="Compact"/>
-              <w:jc w:val="right"/>
-            </w:pPr>
-            <w:r>
-              <w:t xml:space="preserve">1,116.8</w:t>
+              <w:t xml:space="preserve">515.7</w:t>
+            </w:r>
+          </w:p>
+        </w:tc>
+        <w:tc>
+          <w:tcPr/>
+          <w:p>
+            <w:pPr>
+              <w:pStyle w:val="Compact"/>
+              <w:jc w:val="right"/>
+            </w:pPr>
+            <w:r>
+              <w:t xml:space="preserve">167.7</w:t>
+            </w:r>
+          </w:p>
+        </w:tc>
+        <w:tc>
+          <w:tcPr/>
+          <w:p>
+            <w:pPr>
+              <w:pStyle w:val="Compact"/>
+              <w:jc w:val="right"/>
+            </w:pPr>
+            <w:r>
+              <w:t xml:space="preserve">19.63</w:t>
+            </w:r>
+          </w:p>
+        </w:tc>
+        <w:tc>
+          <w:tcPr/>
+          <w:p>
+            <w:pPr>
+              <w:pStyle w:val="Compact"/>
+              <w:jc w:val="right"/>
+            </w:pPr>
+            <w:r>
+              <w:t xml:space="preserve">19.80</w:t>
+            </w:r>
+          </w:p>
+        </w:tc>
+        <w:tc>
+          <w:tcPr/>
+          <w:p>
+            <w:pPr>
+              <w:pStyle w:val="Compact"/>
+              <w:jc w:val="right"/>
+            </w:pPr>
+            <w:r>
+              <w:t xml:space="preserve">4,467.0</w:t>
             </w:r>
           </w:p>
         </w:tc>
@@ -8880,55 +9627,55 @@
               <w:jc w:val="right"/>
             </w:pPr>
             <w:r>
-              <w:t xml:space="preserve">15.9</w:t>
-            </w:r>
-          </w:p>
-        </w:tc>
-        <w:tc>
-          <w:tcPr/>
-          <w:p>
-            <w:pPr>
-              <w:pStyle w:val="Compact"/>
-              <w:jc w:val="right"/>
-            </w:pPr>
-            <w:r>
-              <w:t xml:space="preserve">5.9</w:t>
-            </w:r>
-          </w:p>
-        </w:tc>
-        <w:tc>
-          <w:tcPr/>
-          <w:p>
-            <w:pPr>
-              <w:pStyle w:val="Compact"/>
-              <w:jc w:val="right"/>
-            </w:pPr>
-            <w:r>
-              <w:t xml:space="preserve">1.62</w:t>
-            </w:r>
-          </w:p>
-        </w:tc>
-        <w:tc>
-          <w:tcPr/>
-          <w:p>
-            <w:pPr>
-              <w:pStyle w:val="Compact"/>
-              <w:jc w:val="right"/>
-            </w:pPr>
-            <w:r>
-              <w:t xml:space="preserve">1.62</w:t>
-            </w:r>
-          </w:p>
-        </w:tc>
-        <w:tc>
-          <w:tcPr/>
-          <w:p>
-            <w:pPr>
-              <w:pStyle w:val="Compact"/>
-              <w:jc w:val="right"/>
-            </w:pPr>
-            <w:r>
-              <w:t xml:space="preserve">748.4</w:t>
+              <w:t xml:space="preserve">39.8</w:t>
+            </w:r>
+          </w:p>
+        </w:tc>
+        <w:tc>
+          <w:tcPr/>
+          <w:p>
+            <w:pPr>
+              <w:pStyle w:val="Compact"/>
+              <w:jc w:val="right"/>
+            </w:pPr>
+            <w:r>
+              <w:t xml:space="preserve">14.8</w:t>
+            </w:r>
+          </w:p>
+        </w:tc>
+        <w:tc>
+          <w:tcPr/>
+          <w:p>
+            <w:pPr>
+              <w:pStyle w:val="Compact"/>
+              <w:jc w:val="right"/>
+            </w:pPr>
+            <w:r>
+              <w:t xml:space="preserve">4.05</w:t>
+            </w:r>
+          </w:p>
+        </w:tc>
+        <w:tc>
+          <w:tcPr/>
+          <w:p>
+            <w:pPr>
+              <w:pStyle w:val="Compact"/>
+              <w:jc w:val="right"/>
+            </w:pPr>
+            <w:r>
+              <w:t xml:space="preserve">4.05</w:t>
+            </w:r>
+          </w:p>
+        </w:tc>
+        <w:tc>
+          <w:tcPr/>
+          <w:p>
+            <w:pPr>
+              <w:pStyle w:val="Compact"/>
+              <w:jc w:val="right"/>
+            </w:pPr>
+            <w:r>
+              <w:t xml:space="preserve">1,871.0</w:t>
             </w:r>
           </w:p>
         </w:tc>
@@ -8989,55 +9736,55 @@
               <w:jc w:val="right"/>
             </w:pPr>
             <w:r>
-              <w:t xml:space="preserve">10.4</w:t>
-            </w:r>
-          </w:p>
-        </w:tc>
-        <w:tc>
-          <w:tcPr/>
-          <w:p>
-            <w:pPr>
-              <w:pStyle w:val="Compact"/>
-              <w:jc w:val="right"/>
-            </w:pPr>
-            <w:r>
-              <w:t xml:space="preserve">3.0</w:t>
-            </w:r>
-          </w:p>
-        </w:tc>
-        <w:tc>
-          <w:tcPr/>
-          <w:p>
-            <w:pPr>
-              <w:pStyle w:val="Compact"/>
-              <w:jc w:val="right"/>
-            </w:pPr>
-            <w:r>
-              <w:t xml:space="preserve">2.62</w:t>
-            </w:r>
-          </w:p>
-        </w:tc>
-        <w:tc>
-          <w:tcPr/>
-          <w:p>
-            <w:pPr>
-              <w:pStyle w:val="Compact"/>
-              <w:jc w:val="right"/>
-            </w:pPr>
-            <w:r>
-              <w:t xml:space="preserve">2.63</w:t>
-            </w:r>
-          </w:p>
-        </w:tc>
-        <w:tc>
-          <w:tcPr/>
-          <w:p>
-            <w:pPr>
-              <w:pStyle w:val="Compact"/>
-              <w:jc w:val="right"/>
-            </w:pPr>
-            <w:r>
-              <w:t xml:space="preserve">388.4</w:t>
+              <w:t xml:space="preserve">23.2</w:t>
+            </w:r>
+          </w:p>
+        </w:tc>
+        <w:tc>
+          <w:tcPr/>
+          <w:p>
+            <w:pPr>
+              <w:pStyle w:val="Compact"/>
+              <w:jc w:val="right"/>
+            </w:pPr>
+            <w:r>
+              <w:t xml:space="preserve">6.6</w:t>
+            </w:r>
+          </w:p>
+        </w:tc>
+        <w:tc>
+          <w:tcPr/>
+          <w:p>
+            <w:pPr>
+              <w:pStyle w:val="Compact"/>
+              <w:jc w:val="right"/>
+            </w:pPr>
+            <w:r>
+              <w:t xml:space="preserve">5.83</w:t>
+            </w:r>
+          </w:p>
+        </w:tc>
+        <w:tc>
+          <w:tcPr/>
+          <w:p>
+            <w:pPr>
+              <w:pStyle w:val="Compact"/>
+              <w:jc w:val="right"/>
+            </w:pPr>
+            <w:r>
+              <w:t xml:space="preserve">5.83</w:t>
+            </w:r>
+          </w:p>
+        </w:tc>
+        <w:tc>
+          <w:tcPr/>
+          <w:p>
+            <w:pPr>
+              <w:pStyle w:val="Compact"/>
+              <w:jc w:val="right"/>
+            </w:pPr>
+            <w:r>
+              <w:t xml:space="preserve">863.2</w:t>
             </w:r>
           </w:p>
         </w:tc>
@@ -9098,43 +9845,43 @@
               <w:jc w:val="right"/>
             </w:pPr>
             <w:r>
-              <w:t xml:space="preserve">10.3</w:t>
-            </w:r>
-          </w:p>
-        </w:tc>
-        <w:tc>
-          <w:tcPr/>
-          <w:p>
-            <w:pPr>
-              <w:pStyle w:val="Compact"/>
-              <w:jc w:val="right"/>
-            </w:pPr>
-            <w:r>
-              <w:t xml:space="preserve">2.3</w:t>
-            </w:r>
-          </w:p>
-        </w:tc>
-        <w:tc>
-          <w:tcPr/>
-          <w:p>
-            <w:pPr>
-              <w:pStyle w:val="Compact"/>
-              <w:jc w:val="right"/>
-            </w:pPr>
-            <w:r>
-              <w:t xml:space="preserve">7.01</w:t>
-            </w:r>
-          </w:p>
-        </w:tc>
-        <w:tc>
-          <w:tcPr/>
-          <w:p>
-            <w:pPr>
-              <w:pStyle w:val="Compact"/>
-              <w:jc w:val="right"/>
-            </w:pPr>
-            <w:r>
-              <w:t xml:space="preserve">7.02</w:t>
+              <w:t xml:space="preserve">22.1</w:t>
+            </w:r>
+          </w:p>
+        </w:tc>
+        <w:tc>
+          <w:tcPr/>
+          <w:p>
+            <w:pPr>
+              <w:pStyle w:val="Compact"/>
+              <w:jc w:val="right"/>
+            </w:pPr>
+            <w:r>
+              <w:t xml:space="preserve">4.9</w:t>
+            </w:r>
+          </w:p>
+        </w:tc>
+        <w:tc>
+          <w:tcPr/>
+          <w:p>
+            <w:pPr>
+              <w:pStyle w:val="Compact"/>
+              <w:jc w:val="right"/>
+            </w:pPr>
+            <w:r>
+              <w:t xml:space="preserve">15.02</w:t>
+            </w:r>
+          </w:p>
+        </w:tc>
+        <w:tc>
+          <w:tcPr/>
+          <w:p>
+            <w:pPr>
+              <w:pStyle w:val="Compact"/>
+              <w:jc w:val="right"/>
+            </w:pPr>
+            <w:r>
+              <w:t xml:space="preserve">15.04</w:t>
             </w:r>
           </w:p>
         </w:tc>
@@ -9207,55 +9954,55 @@
               <w:jc w:val="right"/>
             </w:pPr>
             <w:r>
-              <w:t xml:space="preserve">9.0</w:t>
-            </w:r>
-          </w:p>
-        </w:tc>
-        <w:tc>
-          <w:tcPr/>
-          <w:p>
-            <w:pPr>
-              <w:pStyle w:val="Compact"/>
-              <w:jc w:val="right"/>
-            </w:pPr>
-            <w:r>
-              <w:t xml:space="preserve">1.1</w:t>
-            </w:r>
-          </w:p>
-        </w:tc>
-        <w:tc>
-          <w:tcPr/>
-          <w:p>
-            <w:pPr>
-              <w:pStyle w:val="Compact"/>
-              <w:jc w:val="right"/>
-            </w:pPr>
-            <w:r>
-              <w:t xml:space="preserve">3.81</w:t>
-            </w:r>
-          </w:p>
-        </w:tc>
-        <w:tc>
-          <w:tcPr/>
-          <w:p>
-            <w:pPr>
-              <w:pStyle w:val="Compact"/>
-              <w:jc w:val="right"/>
-            </w:pPr>
-            <w:r>
-              <w:t xml:space="preserve">3.81</w:t>
-            </w:r>
-          </w:p>
-        </w:tc>
-        <w:tc>
-          <w:tcPr/>
-          <w:p>
-            <w:pPr>
-              <w:pStyle w:val="Compact"/>
-              <w:jc w:val="right"/>
-            </w:pPr>
-            <w:r>
-              <w:t xml:space="preserve">134.6</w:t>
+              <w:t xml:space="preserve">18.9</w:t>
+            </w:r>
+          </w:p>
+        </w:tc>
+        <w:tc>
+          <w:tcPr/>
+          <w:p>
+            <w:pPr>
+              <w:pStyle w:val="Compact"/>
+              <w:jc w:val="right"/>
+            </w:pPr>
+            <w:r>
+              <w:t xml:space="preserve">2.3</w:t>
+            </w:r>
+          </w:p>
+        </w:tc>
+        <w:tc>
+          <w:tcPr/>
+          <w:p>
+            <w:pPr>
+              <w:pStyle w:val="Compact"/>
+              <w:jc w:val="right"/>
+            </w:pPr>
+            <w:r>
+              <w:t xml:space="preserve">7.98</w:t>
+            </w:r>
+          </w:p>
+        </w:tc>
+        <w:tc>
+          <w:tcPr/>
+          <w:p>
+            <w:pPr>
+              <w:pStyle w:val="Compact"/>
+              <w:jc w:val="right"/>
+            </w:pPr>
+            <w:r>
+              <w:t xml:space="preserve">7.98</w:t>
+            </w:r>
+          </w:p>
+        </w:tc>
+        <w:tc>
+          <w:tcPr/>
+          <w:p>
+            <w:pPr>
+              <w:pStyle w:val="Compact"/>
+              <w:jc w:val="right"/>
+            </w:pPr>
+            <w:r>
+              <w:t xml:space="preserve">282.0</w:t>
             </w:r>
           </w:p>
         </w:tc>
@@ -9306,7 +10053,43 @@
         <w:t xml:space="preserve"> </w:t>
       </w:r>
       <w:r>
-        <w:t xml:space="preserve">(484 ordered pairs, mean of three replicates; SynTracker single run).</w:t>
+        <w:t xml:space="preserve">(231 unique pairs; mean of three replicates, SynTracker single run). Syn2b</w:t>
+      </w:r>
+      <w:r>
+        <w:t xml:space="preserve"> </w:t>
+      </w:r>
+      <w:r>
+        <w:t xml:space="preserve">reports structural metrics only; the companion tool Syn2bANI reuses the same</w:t>
+      </w:r>
+      <w:r>
+        <w:t xml:space="preserve"> </w:t>
+      </w:r>
+      <w:r>
+        <w:t xml:space="preserve">tag framework to report ANI together with structural metrics. SynTracker was</w:t>
+      </w:r>
+      <w:r>
+        <w:t xml:space="preserve"> </w:t>
+      </w:r>
+      <w:r>
+        <w:t xml:space="preserve">run with its default pipeline on 16 cores; its output (average pairwise</w:t>
+      </w:r>
+      <w:r>
+        <w:t xml:space="preserve"> </w:t>
+      </w:r>
+      <w:r>
+        <w:t xml:space="preserve">synteny score over gene blocks) differs in content from Syn2b’s junction and</w:t>
+      </w:r>
+      <w:r>
+        <w:t xml:space="preserve"> </w:t>
+      </w:r>
+      <w:r>
+        <w:t xml:space="preserve">ratio metrics, so the comparison is of workflows rather than identical</w:t>
+      </w:r>
+      <w:r>
+        <w:t xml:space="preserve"> </w:t>
+      </w:r>
+      <w:r>
+        <w:t xml:space="preserve">quantities.</w:t>
       </w:r>
     </w:p>
     <w:tbl>
@@ -9358,7 +10141,7 @@
               <w:jc w:val="right"/>
             </w:pPr>
             <w:r>
-              <w:t xml:space="preserve">per pair (s)</w:t>
+              <w:t xml:space="preserve">per unique pair (s)</w:t>
             </w:r>
           </w:p>
         </w:tc>
@@ -9417,7 +10200,7 @@
               <w:jc w:val="right"/>
             </w:pPr>
             <w:r>
-              <w:t xml:space="preserve">0.009</w:t>
+              <w:t xml:space="preserve">0.019</w:t>
             </w:r>
           </w:p>
         </w:tc>
@@ -9476,7 +10259,7 @@
               <w:jc w:val="right"/>
             </w:pPr>
             <w:r>
-              <w:t xml:space="preserve">0.001</w:t>
+              <w:t xml:space="preserve">0.002</w:t>
             </w:r>
           </w:p>
         </w:tc>
@@ -9535,7 +10318,7 @@
               <w:jc w:val="right"/>
             </w:pPr>
             <w:r>
-              <w:t xml:space="preserve">3.810</w:t>
+              <w:t xml:space="preserve">7.979</w:t>
             </w:r>
           </w:p>
         </w:tc>
@@ -9594,7 +10377,7 @@
               <w:jc w:val="right"/>
             </w:pPr>
             <w:r>
-              <w:t xml:space="preserve">134.632</w:t>
+              <w:t xml:space="preserve">282.086</w:t>
             </w:r>
           </w:p>
         </w:tc>
@@ -9653,7 +10436,7 @@
               <w:jc w:val="right"/>
             </w:pPr>
             <w:r>
-              <w:t xml:space="preserve">3.811</w:t>
+              <w:t xml:space="preserve">7.984</w:t>
             </w:r>
           </w:p>
         </w:tc>
@@ -9681,8 +10464,8 @@
         </w:tc>
       </w:tr>
     </w:tbl>
-    <w:bookmarkEnd w:id="31"/>
-    <w:bookmarkStart w:id="32" w:name="supplementary-figures"/>
+    <w:bookmarkEnd w:id="33"/>
+    <w:bookmarkStart w:id="34" w:name="supplementary-figures"/>
     <w:p>
       <w:pPr>
         <w:pStyle w:val="Heading3"/>
@@ -10053,9 +10836,9 @@
         </w:pict>
       </w:r>
     </w:p>
-    <w:bookmarkEnd w:id="32"/>
-    <w:bookmarkEnd w:id="33"/>
-    <w:bookmarkStart w:id="34" w:name="acknowledgements"/>
+    <w:bookmarkEnd w:id="34"/>
+    <w:bookmarkEnd w:id="35"/>
+    <w:bookmarkStart w:id="36" w:name="acknowledgements"/>
     <w:p>
       <w:pPr>
         <w:pStyle w:val="Heading2"/>
@@ -10072,8 +10855,8 @@
         <w:t xml:space="preserve">Funding information to be added.</w:t>
       </w:r>
     </w:p>
-    <w:bookmarkEnd w:id="34"/>
-    <w:bookmarkStart w:id="35" w:name="author-contributions"/>
+    <w:bookmarkEnd w:id="36"/>
+    <w:bookmarkStart w:id="37" w:name="author-contributions"/>
     <w:p>
       <w:pPr>
         <w:pStyle w:val="Heading2"/>
@@ -10102,8 +10885,8 @@
         <w:t xml:space="preserve">manuscript.</w:t>
       </w:r>
     </w:p>
-    <w:bookmarkEnd w:id="35"/>
-    <w:bookmarkStart w:id="36" w:name="competing-interests"/>
+    <w:bookmarkEnd w:id="37"/>
+    <w:bookmarkStart w:id="38" w:name="competing-interests"/>
     <w:p>
       <w:pPr>
         <w:pStyle w:val="Heading2"/>
@@ -10120,8 +10903,8 @@
         <w:t xml:space="preserve">The authors declare no competing interests.</w:t>
       </w:r>
     </w:p>
-    <w:bookmarkEnd w:id="36"/>
-    <w:bookmarkEnd w:id="37"/>
+    <w:bookmarkEnd w:id="38"/>
+    <w:bookmarkEnd w:id="39"/>
     <w:sectPr>
       <w:footnotePr>
         <w:numRestart w:val="eachSect"/>

</xml_diff>

<commit_message>
Add census validation and revise manuscript for submission
</commit_message>
<xml_diff>
--- a/Syn2b_Manuscript.docx
+++ b/Syn2b_Manuscript.docx
@@ -2,7 +2,7 @@
 <file path=word/document.xml><?xml version="1.0" encoding="utf-8"?>
 <w:document xmlns:w="http://schemas.openxmlformats.org/wordprocessingml/2006/main" xmlns:m="http://schemas.openxmlformats.org/officeDocument/2006/math" xmlns:r="http://schemas.openxmlformats.org/officeDocument/2006/relationships" xmlns:o="urn:schemas-microsoft-com:office:office" xmlns:v="urn:schemas-microsoft-com:vml" xmlns:w10="urn:schemas-microsoft-com:office:word" xmlns:a="http://schemas.openxmlformats.org/drawingml/2006/main" xmlns:pic="http://schemas.openxmlformats.org/drawingml/2006/picture" xmlns:wp="http://schemas.openxmlformats.org/drawingml/2006/wordprocessingDrawing">
   <w:body>
-    <w:bookmarkStart w:id="40" w:name="Xec573160e92fa6b8ce6bac14bd269bf20145b31"/>
+    <w:bookmarkStart w:id="44" w:name="Xec573160e92fa6b8ce6bac14bd269bf20145b31"/>
     <w:p>
       <w:pPr>
         <w:pStyle w:val="Heading1"/>
@@ -155,13 +155,37 @@
         <w:t xml:space="preserve"> </w:t>
       </w:r>
       <w:r>
-        <w:t xml:space="preserve">ANIm ≥ 97% carry ≥2 alignment-visible inversion events — rearrangements</w:t>
-      </w:r>
-      <w:r>
-        <w:t xml:space="preserve"> </w:t>
-      </w:r>
-      <w:r>
-        <w:t xml:space="preserve">invisible to ANI ranking. Syn2b is available at</w:t>
+        <w:t xml:space="preserve">ANIm ≥ 97% carry ≥2 alignment-defined inversion events, rearrangements that</w:t>
+      </w:r>
+      <w:r>
+        <w:t xml:space="preserve"> </w:t>
+      </w:r>
+      <w:r>
+        <w:t xml:space="preserve">ANI ranking alone does not report. Two application-scale censuses established</w:t>
+      </w:r>
+      <w:r>
+        <w:t xml:space="preserve"> </w:t>
+      </w:r>
+      <w:r>
+        <w:t xml:space="preserve">feasibility: 502,819,691 of 646,012,820 effective GTDB-R207 species pairs</w:t>
+      </w:r>
+      <w:r>
+        <w:t xml:space="preserve"> </w:t>
+      </w:r>
+      <w:r>
+        <w:t xml:space="preserve">(77.83%) had ≥2 landmark-defined breakpoints, while an independent HROM census</w:t>
+      </w:r>
+      <w:r>
+        <w:t xml:space="preserve"> </w:t>
+      </w:r>
+      <w:r>
+        <w:t xml:space="preserve">found 17,535,013 of 62,872,901 conspecific pairs (27.89%) positive. Both surveys</w:t>
+      </w:r>
+      <w:r>
+        <w:t xml:space="preserve"> </w:t>
+      </w:r>
+      <w:r>
+        <w:t xml:space="preserve">showed wide taxon-specific variation. Syn2b is available at</w:t>
       </w:r>
       <w:r>
         <w:t xml:space="preserve"> </w:t>
@@ -204,13 +228,13 @@
         <w:t xml:space="preserve"> </w:t>
       </w:r>
       <w:r>
-        <w:t xml:space="preserve">and structural genomic changes — insertions, deletions, inversions,</w:t>
-      </w:r>
-      <w:r>
-        <w:t xml:space="preserve"> </w:t>
-      </w:r>
-      <w:r>
-        <w:t xml:space="preserve">translocations, and homologous recombination — that together determine phenotype,</w:t>
+        <w:t xml:space="preserve">and structural genomic changes, including insertions, deletions, inversions,</w:t>
+      </w:r>
+      <w:r>
+        <w:t xml:space="preserve"> </w:t>
+      </w:r>
+      <w:r>
+        <w:t xml:space="preserve">translocations, and homologous recombination, that together determine phenotype,</w:t>
       </w:r>
       <w:r>
         <w:t xml:space="preserve"> </w:t>
@@ -624,7 +648,7 @@
         <w:pStyle w:val="BodyText"/>
       </w:pPr>
       <w:r>
-        <w:t xml:space="preserve">We validate Syn2b through four lines of evidence: (1) in-silico simulations of</w:t>
+        <w:t xml:space="preserve">We validate Syn2b through five lines of evidence: (1) in-silico simulations of</w:t>
       </w:r>
       <w:r>
         <w:t xml:space="preserve"> </w:t>
@@ -648,7 +672,7 @@
         <w:t xml:space="preserve"> </w:t>
       </w:r>
       <w:r>
-        <w:t xml:space="preserve">model for the strain-level regime; and (4) a genome-wide survey of</w:t>
+        <w:t xml:space="preserve">model for the strain-level regime; (4) a genome-wide survey of</w:t>
       </w:r>
       <w:r>
         <w:t xml:space="preserve"> </w:t>
@@ -660,7 +684,19 @@
         <w:t xml:space="preserve"> </w:t>
       </w:r>
       <w:r>
-        <w:t xml:space="preserve">carry multiple inversion events that ANI ranking cannot see.</w:t>
+        <w:t xml:space="preserve">carry multiple inversion events that ANI ranking does not report; and (5) large</w:t>
+      </w:r>
+      <w:r>
+        <w:t xml:space="preserve"> </w:t>
+      </w:r>
+      <w:r>
+        <w:t xml:space="preserve">GTDB-R207 and independent HROM structural censuses demonstrating scalable</w:t>
+      </w:r>
+      <w:r>
+        <w:t xml:space="preserve"> </w:t>
+      </w:r>
+      <w:r>
+        <w:t xml:space="preserve">application and taxon-specific variation.</w:t>
       </w:r>
     </w:p>
     <w:p>
@@ -671,7 +707,7 @@
       </w:r>
     </w:p>
     <w:bookmarkEnd w:id="10"/>
-    <w:bookmarkStart w:id="19" w:name="results"/>
+    <w:bookmarkStart w:id="21" w:name="results"/>
     <w:p>
       <w:pPr>
         <w:pStyle w:val="Heading2"/>
@@ -784,10 +820,7 @@
         <w:t xml:space="preserve">Adjacency conservation</w:t>
       </w:r>
       <w:r>
-        <w:t xml:space="preserve"> </w:t>
-      </w:r>
-      <w:r>
-        <w:t xml:space="preserve">— shared adjacent tag pairs between genomes,</w:t>
+        <w:t xml:space="preserve">: shared adjacent tag pairs between genomes,</w:t>
       </w:r>
       <w:r>
         <w:t xml:space="preserve"> </w:t>
@@ -812,10 +845,7 @@
         <w:t xml:space="preserve">Breakpoint / junction count</w:t>
       </w:r>
       <w:r>
-        <w:t xml:space="preserve"> </w:t>
-      </w:r>
-      <w:r>
-        <w:t xml:space="preserve">— adjacent tag pairs present in one genome but</w:t>
+        <w:t xml:space="preserve">: adjacent tag pairs present in one genome but</w:t>
       </w:r>
       <w:r>
         <w:t xml:space="preserve"> </w:t>
@@ -846,10 +876,7 @@
         <w:t xml:space="preserve">Length-weighted ratios</w:t>
       </w:r>
       <w:r>
-        <w:t xml:space="preserve"> </w:t>
-      </w:r>
-      <w:r>
-        <w:t xml:space="preserve">— the fraction of total length that carries a</w:t>
+        <w:t xml:space="preserve">: the fraction of total length that carries a</w:t>
       </w:r>
       <w:r>
         <w:t xml:space="preserve"> </w:t>
@@ -1147,13 +1174,13 @@
         <w:t xml:space="preserve"> </w:t>
       </w:r>
       <w:r>
-        <w:t xml:space="preserve">argument applies verbatim — splitting a segment cannot remove a landmark from</w:t>
-      </w:r>
-      <w:r>
-        <w:t xml:space="preserve"> </w:t>
-      </w:r>
-      <w:r>
-        <w:t xml:space="preserve">either the numerator or the denominator — so the count ratio is exactly</w:t>
+        <w:t xml:space="preserve">argument applies verbatim: splitting a segment cannot remove a landmark from</w:t>
+      </w:r>
+      <w:r>
+        <w:t xml:space="preserve"> </w:t>
+      </w:r>
+      <w:r>
+        <w:t xml:space="preserve">either the numerator or the denominator, so the count ratio is exactly</w:t>
       </w:r>
       <w:r>
         <w:t xml:space="preserve"> </w:t>
@@ -1581,7 +1608,7 @@
         <w:t xml:space="preserve"> </w:t>
       </w:r>
       <w:r>
-        <w:t xml:space="preserve">only ~5 × 10⁻⁷ — five orders of magnitude below the SNP signal (Figure 2d) —</w:t>
+        <w:t xml:space="preserve">only ~5 × 10⁻⁷, five orders of magnitude below the SNP signal (Figure 2d).</w:t>
       </w:r>
       <w:r>
         <w:t xml:space="preserve"> </w:t>
@@ -1806,7 +1833,7 @@
         <w:t xml:space="preserve"> </w:t>
       </w:r>
       <w:r>
-        <w:t xml:space="preserve">cost. Second, enzyme recognition is deterministic and parameter-free — the same</w:t>
+        <w:t xml:space="preserve">cost. Second, enzyme recognition is deterministic and parameter-free: the same</w:t>
       </w:r>
       <w:r>
         <w:t xml:space="preserve"> </w:t>
@@ -1836,13 +1863,13 @@
         <w:t xml:space="preserve"> </w:t>
       </w:r>
       <w:r>
-        <w:t xml:space="preserve">Syn2b reports ratios over many landmarks, the metric is robust</w:t>
-      </w:r>
-      <w:r>
-        <w:t xml:space="preserve"> </w:t>
-      </w:r>
-      <w:r>
-        <w:t xml:space="preserve">to the occasional missing or extra site, which enters the error model as</w:t>
+        <w:t xml:space="preserve">Syn2b reports ratios over many landmarks, the metric remains stable</w:t>
+      </w:r>
+      <w:r>
+        <w:t xml:space="preserve"> </w:t>
+      </w:r>
+      <w:r>
+        <w:t xml:space="preserve">when occasional sites are missing or extra, which enters the error model as</w:t>
       </w:r>
       <w:r>
         <w:t xml:space="preserve"> </w:t>
@@ -3287,7 +3314,7 @@
         <w:t xml:space="preserve"> </w:t>
       </w:r>
       <w:r>
-        <w:t xml:space="preserve">inside inverted segments — the difference between the landmark-count fraction</w:t>
+        <w:t xml:space="preserve">inside inverted segments; the difference between the landmark-count fraction</w:t>
       </w:r>
       <w:r>
         <w:t xml:space="preserve"> </w:t>
@@ -3447,13 +3474,13 @@
         <w:t xml:space="preserve"> </w:t>
       </w:r>
       <w:r>
-        <w:t xml:space="preserve">metric — Syn2b reproduces the alignment-based value with</w:t>
-      </w:r>
-      <w:r>
-        <w:t xml:space="preserve"> </w:t>
-      </w:r>
-      <w:r>
-        <w:t xml:space="preserve">calibrated error — while per-pair biological interpretation of the inverted</w:t>
+        <w:t xml:space="preserve">metric: Syn2b reproduces the alignment-based value with</w:t>
+      </w:r>
+      <w:r>
+        <w:t xml:space="preserve"> </w:t>
+      </w:r>
+      <w:r>
+        <w:t xml:space="preserve">calibrated error, while per-pair biological interpretation of the inverted</w:t>
       </w:r>
       <w:r>
         <w:t xml:space="preserve"> </w:t>
@@ -3547,7 +3574,7 @@
         <w:t xml:space="preserve"> </w:t>
       </w:r>
       <w:r>
-        <w:t xml:space="preserve">model — closed genomes remove the fragmentation bias, and the remaining</w:t>
+        <w:t xml:space="preserve">model: closed genomes remove the fragmentation bias, and the remaining</w:t>
       </w:r>
       <w:r>
         <w:t xml:space="preserve"> </w:t>
@@ -3595,7 +3622,7 @@
         <w:t xml:space="preserve"> </w:t>
       </w:r>
       <w:r>
-        <w:t xml:space="preserve">Spearman ρ = 0.28 (partial ρ = 0.34 controlling ANIm) — on draft assemblies a</w:t>
+        <w:t xml:space="preserve">Spearman ρ = 0.28 (partial ρ = 0.34 controlling ANIm); on draft assemblies a</w:t>
       </w:r>
       <w:r>
         <w:t xml:space="preserve"> </w:t>
@@ -3643,7 +3670,7 @@
         <w:t xml:space="preserve"> </w:t>
       </w:r>
       <w:r>
-        <w:t xml:space="preserve">control comparisons — both report 0 junctions for a genome compared with a</w:t>
+        <w:t xml:space="preserve">control comparisons: both report 0 junctions for a genome compared with a</w:t>
       </w:r>
       <w:r>
         <w:t xml:space="preserve"> </w:t>
@@ -3665,7 +3692,7 @@
         <w:t xml:space="preserve"> </w:t>
       </w:r>
       <w:r>
-        <w:t xml:space="preserve">O157:H7 EDL933 vs Sakai — and,</w:t>
+        <w:t xml:space="preserve">O157:H7 EDL933 vs Sakai, and,</w:t>
       </w:r>
       <w:r>
         <w:t xml:space="preserve"> </w:t>
@@ -3749,7 +3776,7 @@
         <w:t xml:space="preserve"> </w:t>
       </w:r>
       <w:r>
-        <w:t xml:space="preserve">metrics; we now ask what those metrics reveal when applied genome-wide. We</w:t>
+        <w:t xml:space="preserve">metrics; we now ask what those metrics indicate when applied genome-wide. We</w:t>
       </w:r>
       <w:r>
         <w:t xml:space="preserve"> </w:t>
@@ -3825,7 +3852,7 @@
         <w:t xml:space="preserve"> </w:t>
       </w:r>
       <w:r>
-        <w:t xml:space="preserve">pair bootstrap) and 1,295 (34%, CI 32.4–35.3) carry two or more — pairs that</w:t>
+        <w:t xml:space="preserve">pair bootstrap) and 1,295 (34%, CI 32.4–35.3) carry two or more, pairs that</w:t>
       </w:r>
       <w:r>
         <w:t xml:space="preserve"> </w:t>
@@ -3911,7 +3938,7 @@
         <w:t xml:space="preserve"> </w:t>
       </w:r>
       <w:r>
-        <w:t xml:space="preserve">inside aligned segments, fragmented assemblies under-count events — the 45%</w:t>
+        <w:t xml:space="preserve">inside aligned segments, fragmented assemblies under-count events; the 45%</w:t>
       </w:r>
       <w:r>
         <w:t xml:space="preserve"> </w:t>
@@ -4023,7 +4050,7 @@
         <w:t xml:space="preserve"> </w:t>
       </w:r>
       <w:r>
-        <w:t xml:space="preserve">junction count is 0 — the structurally hyper-conserved negative control.</w:t>
+        <w:t xml:space="preserve">junction count is 0, the structurally hyper-conserved negative control.</w:t>
       </w:r>
       <w:r>
         <w:t xml:space="preserve"> </w:t>
@@ -4042,16 +4069,13 @@
         <w:t xml:space="preserve">Shigella</w:t>
       </w:r>
       <w:r>
-        <w:t xml:space="preserve"> </w:t>
-      </w:r>
-      <w:r>
-        <w:t xml:space="preserve">— whose chromosomes rearrange through</w:t>
-      </w:r>
-      <w:r>
-        <w:t xml:space="preserve"> </w:t>
-      </w:r>
-      <w:r>
-        <w:t xml:space="preserve">IS-element-mediated recombination — shows 84–88% of pairs carrying ≥2</w:t>
+        <w:t xml:space="preserve">, whose chromosomes rearrange through</w:t>
+      </w:r>
+      <w:r>
+        <w:t xml:space="preserve"> </w:t>
+      </w:r>
+      <w:r>
+        <w:t xml:space="preserve">IS-element-mediated recombination, shows 84–88% of pairs carrying ≥2</w:t>
       </w:r>
       <w:r>
         <w:t xml:space="preserve"> </w:t>
@@ -4207,13 +4231,13 @@
         <w:t xml:space="preserve"> </w:t>
       </w:r>
       <w:r>
-        <w:t xml:space="preserve">aligning only the flagged pairs costs ~1.1 s per pair on average — ~7.5× less</w:t>
-      </w:r>
-      <w:r>
-        <w:t xml:space="preserve"> </w:t>
-      </w:r>
-      <w:r>
-        <w:t xml:space="preserve">than aligning every pair — and at the scale of all 711M within-species GTDB</w:t>
+        <w:t xml:space="preserve">aligning only the flagged pairs costs ~1.1 s per pair on average, ~7.5× less</w:t>
+      </w:r>
+      <w:r>
+        <w:t xml:space="preserve"> </w:t>
+      </w:r>
+      <w:r>
+        <w:t xml:space="preserve">than aligning every pair, and at the scale of all 711M within-species GTDB</w:t>
       </w:r>
       <w:r>
         <w:t xml:space="preserve"> </w:t>
@@ -4259,13 +4283,364 @@
       </w:r>
     </w:p>
     <w:bookmarkEnd w:id="16"/>
-    <w:bookmarkStart w:id="17" w:name="Xf6b0eddf9c0c3e42eb314c229d743bb331206ea"/>
+    <w:bookmarkStart w:id="17" w:name="Xd33ba60f870f82387d1d5309181bf4a40bd85d4"/>
     <w:p>
       <w:pPr>
         <w:pStyle w:val="Heading3"/>
       </w:pPr>
       <w:r>
-        <w:t xml:space="preserve">7. SynTracker cohorts show ANI–synteny decoupling</w:t>
+        <w:t xml:space="preserve">7. Effective within-species GTDB-R207 structural census</w:t>
+      </w:r>
+    </w:p>
+    <w:p>
+      <w:pPr>
+        <w:pStyle w:val="FirstParagraph"/>
+      </w:pPr>
+      <w:r>
+        <w:t xml:space="preserve">To test whether the strain-level observations scale beyond curated representative pairs, we applied the same production enzyme panel to all multi-genome GTDB-R207 species clusters. The planned set contained 274,374 genomes in 22,535 clusters (711,020,841 unique pairs). After removing 12,637 genomes without usable digests and normalizing legacy contig-level output identifiers to accessions, the effective scope was</w:t>
+      </w:r>
+      <w:r>
+        <w:t xml:space="preserve"> </w:t>
+      </w:r>
+      <w:r>
+        <w:rPr>
+          <w:b/>
+          <w:bCs/>
+        </w:rPr>
+        <w:t xml:space="preserve">261,737 genomes in 21,973 clusters</w:t>
+      </w:r>
+      <w:r>
+        <w:t xml:space="preserve">, corresponding to</w:t>
+      </w:r>
+      <w:r>
+        <w:t xml:space="preserve"> </w:t>
+      </w:r>
+      <w:r>
+        <w:rPr>
+          <w:b/>
+          <w:bCs/>
+        </w:rPr>
+        <w:t xml:space="preserve">653,584,719 unique unordered pairs</w:t>
+      </w:r>
+      <w:r>
+        <w:t xml:space="preserve">. Global canonicalization and external-sort deduplication produced</w:t>
+      </w:r>
+      <w:r>
+        <w:t xml:space="preserve"> </w:t>
+      </w:r>
+      <w:r>
+        <w:rPr>
+          <w:b/>
+          <w:bCs/>
+        </w:rPr>
+        <w:t xml:space="preserve">646,012,820 structurally reported pairs</w:t>
+      </w:r>
+      <w:r>
+        <w:t xml:space="preserve">.</w:t>
+      </w:r>
+    </w:p>
+    <w:p>
+      <w:pPr>
+        <w:pStyle w:val="BodyText"/>
+      </w:pPr>
+      <w:r>
+        <w:t xml:space="preserve">In this observed effective set,</w:t>
+      </w:r>
+      <w:r>
+        <w:t xml:space="preserve"> </w:t>
+      </w:r>
+      <w:r>
+        <w:rPr>
+          <w:b/>
+          <w:bCs/>
+        </w:rPr>
+        <w:t xml:space="preserve">502,819,691 pairs (77.83%) carried at least two landmark-defined breakpoints</w:t>
+      </w:r>
+      <w:r>
+        <w:t xml:space="preserve">. Species-level rates spanned nearly the full range even among clusters with ≥1,000 effective pairs (Supplementary Figure 6). High-rate examples included</w:t>
+      </w:r>
+      <w:r>
+        <w:t xml:space="preserve"> </w:t>
+      </w:r>
+      <w:r>
+        <w:rPr>
+          <w:i/>
+          <w:iCs/>
+        </w:rPr>
+        <w:t xml:space="preserve">Pseudomonas_E viridiflava</w:t>
+      </w:r>
+      <w:r>
+        <w:t xml:space="preserve"> </w:t>
+      </w:r>
+      <w:r>
+        <w:t xml:space="preserve">(943,251/943,251 informative pairs; 97.88%),</w:t>
+      </w:r>
+      <w:r>
+        <w:t xml:space="preserve"> </w:t>
+      </w:r>
+      <w:r>
+        <w:rPr>
+          <w:i/>
+          <w:iCs/>
+        </w:rPr>
+        <w:t xml:space="preserve">Streptococcus pneumoniae</w:t>
+      </w:r>
+      <w:r>
+        <w:t xml:space="preserve"> </w:t>
+      </w:r>
+      <w:r>
+        <w:t xml:space="preserve">(97.81% of 29.42M pairs), and several</w:t>
+      </w:r>
+      <w:r>
+        <w:t xml:space="preserve"> </w:t>
+      </w:r>
+      <w:r>
+        <w:rPr>
+          <w:i/>
+          <w:iCs/>
+        </w:rPr>
+        <w:t xml:space="preserve">Mesorhizobium/Rhizobium</w:t>
+      </w:r>
+      <w:r>
+        <w:t xml:space="preserve"> </w:t>
+      </w:r>
+      <w:r>
+        <w:t xml:space="preserve">lineages (&gt;99%). Low-rate examples included</w:t>
+      </w:r>
+      <w:r>
+        <w:t xml:space="preserve"> </w:t>
+      </w:r>
+      <w:r>
+        <w:rPr>
+          <w:i/>
+          <w:iCs/>
+        </w:rPr>
+        <w:t xml:space="preserve">Chlamydia trachomatis</w:t>
+      </w:r>
+      <w:r>
+        <w:t xml:space="preserve"> </w:t>
+      </w:r>
+      <w:r>
+        <w:t xml:space="preserve">(2.95%),</w:t>
+      </w:r>
+      <w:r>
+        <w:t xml:space="preserve"> </w:t>
+      </w:r>
+      <w:r>
+        <w:rPr>
+          <w:i/>
+          <w:iCs/>
+        </w:rPr>
+        <w:t xml:space="preserve">Treponema pallidum</w:t>
+      </w:r>
+      <w:r>
+        <w:t xml:space="preserve"> </w:t>
+      </w:r>
+      <w:r>
+        <w:t xml:space="preserve">(2.33%),</w:t>
+      </w:r>
+      <w:r>
+        <w:t xml:space="preserve"> </w:t>
+      </w:r>
+      <w:r>
+        <w:rPr>
+          <w:i/>
+          <w:iCs/>
+        </w:rPr>
+        <w:t xml:space="preserve">Francisella tularensis</w:t>
+      </w:r>
+      <w:r>
+        <w:t xml:space="preserve"> </w:t>
+      </w:r>
+      <w:r>
+        <w:t xml:space="preserve">(9.50%), and</w:t>
+      </w:r>
+      <w:r>
+        <w:t xml:space="preserve"> </w:t>
+      </w:r>
+      <w:r>
+        <w:rPr>
+          <w:i/>
+          <w:iCs/>
+        </w:rPr>
+        <w:t xml:space="preserve">Wolbachia pipientis</w:t>
+      </w:r>
+      <w:r>
+        <w:t xml:space="preserve"> </w:t>
+      </w:r>
+      <w:r>
+        <w:t xml:space="preserve">(11.15%). These differences persisted after restricting to clusters with ≥1,000 pairs, but are reported here as digest-effective structural prevalence rather than direct evolutionary-rate estimates.</w:t>
+      </w:r>
+    </w:p>
+    <w:p>
+      <w:pPr>
+        <w:pStyle w:val="BodyText"/>
+      </w:pPr>
+      <w:r>
+        <w:t xml:space="preserve">Quality control found one cluster-level discrepancy:</w:t>
+      </w:r>
+      <w:r>
+        <w:t xml:space="preserve"> </w:t>
+      </w:r>
+      <w:r>
+        <w:rPr>
+          <w:i/>
+          <w:iCs/>
+        </w:rPr>
+        <w:t xml:space="preserve">E. coli</w:t>
+      </w:r>
+      <w:r>
+        <w:t xml:space="preserve"> </w:t>
+      </w:r>
+      <w:r>
+        <w:t xml:space="preserve">had 331,221,566 reported pairs versus 338,793,465 expected from its effective genome list. All other clusters matched</w:t>
+      </w:r>
+      <w:r>
+        <w:t xml:space="preserve"> </w:t>
+      </w:r>
+      <w:r>
+        <w:rPr>
+          <w:rStyle w:val="VerbatimChar"/>
+        </w:rPr>
+        <w:t xml:space="preserve">C(n,2)</w:t>
+      </w:r>
+      <w:r>
+        <w:t xml:space="preserve">. Because this shortfall affects only 1.16% of the effective pairs and does not change the ordering of the other species, it is reported transparently rather than imputed. The paired ANI layer for the complete effective census is still being generated; therefore, this section updates the structural layer only and does not yet make species-level hypermutator or hyper-recombinant calls.</w:t>
+      </w:r>
+    </w:p>
+    <w:bookmarkEnd w:id="17"/>
+    <w:bookmarkStart w:id="18" w:name="X422b81198986dd416db71a2c6612906e090ee88"/>
+    <w:p>
+      <w:pPr>
+        <w:pStyle w:val="Heading3"/>
+      </w:pPr>
+      <w:r>
+        <w:t xml:space="preserve">8. Independent HROM census replicates taxon-specific structural variation</w:t>
+      </w:r>
+    </w:p>
+    <w:p>
+      <w:pPr>
+        <w:pStyle w:val="FirstParagraph"/>
+      </w:pPr>
+      <w:r>
+        <w:t xml:space="preserve">To ask whether database-scale structural screening generalizes beyond GTDB, we</w:t>
+      </w:r>
+      <w:r>
+        <w:t xml:space="preserve"> </w:t>
+      </w:r>
+      <w:r>
+        <w:t xml:space="preserve">analysed all 142,277 genomes in the 2,241 multi-genome clusters of the Human</w:t>
+      </w:r>
+      <w:r>
+        <w:t xml:space="preserve"> </w:t>
+      </w:r>
+      <w:r>
+        <w:t xml:space="preserve">Reference Oral Microbiome (HROM) database. The analysis evaluated all</w:t>
+      </w:r>
+      <w:r>
+        <w:t xml:space="preserve"> </w:t>
+      </w:r>
+      <w:r>
+        <w:t xml:space="preserve">62,872,901 unordered conspecific pairs with the same Syn2b structural channel</w:t>
+      </w:r>
+      <w:r>
+        <w:t xml:space="preserve"> </w:t>
+      </w:r>
+      <w:r>
+        <w:t xml:space="preserve">and paired each structural row with skani 0.3.2 ANI. Of these pairs,</w:t>
+      </w:r>
+      <w:r>
+        <w:t xml:space="preserve"> </w:t>
+      </w:r>
+      <w:r>
+        <w:rPr>
+          <w:b/>
+          <w:bCs/>
+        </w:rPr>
+        <w:t xml:space="preserve">17,535,013 (27.89%; Wilson 95% CI 27.88–27.90%) carried ≥2 landmark-defined</w:t>
+      </w:r>
+      <w:r>
+        <w:rPr>
+          <w:b/>
+          <w:bCs/>
+        </w:rPr>
+        <w:t xml:space="preserve"> </w:t>
+      </w:r>
+      <w:r>
+        <w:rPr>
+          <w:b/>
+          <w:bCs/>
+        </w:rPr>
+        <w:t xml:space="preserve">breakpoints</w:t>
+      </w:r>
+      <w:r>
+        <w:t xml:space="preserve">, and every row received a matched ANI value.</w:t>
+      </w:r>
+    </w:p>
+    <w:p>
+      <w:pPr>
+        <w:pStyle w:val="BodyText"/>
+      </w:pPr>
+      <w:r>
+        <w:t xml:space="preserve">The taxon-specific signal was broad. Among the 367 HROM clusters with at least</w:t>
+      </w:r>
+      <w:r>
+        <w:t xml:space="preserve"> </w:t>
+      </w:r>
+      <w:r>
+        <w:t xml:space="preserve">1,000 pairs, the fraction of pairs with ≥2 breakpoints ranged from 0.66% to</w:t>
+      </w:r>
+      <w:r>
+        <w:t xml:space="preserve"> </w:t>
+      </w:r>
+      <w:r>
+        <w:t xml:space="preserve">83.29%, with a median of 17.92%. This independent census therefore reproduced</w:t>
+      </w:r>
+      <w:r>
+        <w:t xml:space="preserve"> </w:t>
+      </w:r>
+      <w:r>
+        <w:t xml:space="preserve">two central patterns from the GTDB survey: structural variation is widespread</w:t>
+      </w:r>
+      <w:r>
+        <w:t xml:space="preserve"> </w:t>
+      </w:r>
+      <w:r>
+        <w:t xml:space="preserve">within named species clusters, and its prevalence differs greatly among taxa.</w:t>
+      </w:r>
+      <w:r>
+        <w:t xml:space="preserve"> </w:t>
+      </w:r>
+      <w:r>
+        <w:t xml:space="preserve">The lower overall prevalence than in GTDB should not be interpreted as a direct</w:t>
+      </w:r>
+      <w:r>
+        <w:t xml:space="preserve"> </w:t>
+      </w:r>
+      <w:r>
+        <w:t xml:space="preserve">evolutionary-rate difference because the two resources differ in genome</w:t>
+      </w:r>
+      <w:r>
+        <w:t xml:space="preserve"> </w:t>
+      </w:r>
+      <w:r>
+        <w:t xml:space="preserve">catalogues, sampling, assembly continuity, clustering criteria, and quality</w:t>
+      </w:r>
+      <w:r>
+        <w:t xml:space="preserve"> </w:t>
+      </w:r>
+      <w:r>
+        <w:t xml:space="preserve">structure.</w:t>
+      </w:r>
+    </w:p>
+    <w:bookmarkEnd w:id="18"/>
+    <w:bookmarkStart w:id="19" w:name="Xf6b0eddf9c0c3e42eb314c229d743bb331206ea"/>
+    <w:p>
+      <w:pPr>
+        <w:pStyle w:val="Heading3"/>
+      </w:pPr>
+      <w:r>
+        <w:t xml:space="preserve">9. SynTracker cohorts show ANI–synteny decoupling</w:t>
       </w:r>
     </w:p>
     <w:p>
@@ -4630,14 +5005,14 @@
         <w:t xml:space="preserve">only restriction-enzyme tags.</w:t>
       </w:r>
     </w:p>
-    <w:bookmarkEnd w:id="17"/>
-    <w:bookmarkStart w:id="18" w:name="runtime-benchmarking"/>
+    <w:bookmarkEnd w:id="19"/>
+    <w:bookmarkStart w:id="20" w:name="runtime-benchmarking"/>
     <w:p>
       <w:pPr>
         <w:pStyle w:val="Heading3"/>
       </w:pPr>
       <w:r>
-        <w:t xml:space="preserve">8. Runtime benchmarking</w:t>
+        <w:t xml:space="preserve">10. Runtime benchmarking</w:t>
       </w:r>
     </w:p>
     <w:p>
@@ -4747,7 +5122,7 @@
         <w:t xml:space="preserve"> </w:t>
       </w:r>
       <w:r>
-        <w:t xml:space="preserve">in 4.4 s, versus 1,844 s for the skani+dnadiff workflow — a ~420-fold speedup</w:t>
+        <w:t xml:space="preserve">in 4.4 s, versus 1,844 s for the skani+dnadiff workflow, a ~420-fold speedup</w:t>
       </w:r>
       <w:r>
         <w:t xml:space="preserve"> </w:t>
@@ -4765,7 +5140,7 @@
         <w:t xml:space="preserve"> </w:t>
       </w:r>
       <w:r>
-        <w:t xml:space="preserve">the same 22-genome panel even with 16 cores — ~15,000-fold slower than Syn2b —</w:t>
+        <w:t xml:space="preserve">the same 22-genome panel even with 16 cores, ~15,000-fold slower than Syn2b,</w:t>
       </w:r>
       <w:r>
         <w:t xml:space="preserve"> </w:t>
@@ -4787,9 +5162,9 @@
         </w:pict>
       </w:r>
     </w:p>
-    <w:bookmarkEnd w:id="18"/>
-    <w:bookmarkEnd w:id="19"/>
-    <w:bookmarkStart w:id="20" w:name="discussion"/>
+    <w:bookmarkEnd w:id="20"/>
+    <w:bookmarkEnd w:id="21"/>
+    <w:bookmarkStart w:id="22" w:name="discussion"/>
     <w:p>
       <w:pPr>
         <w:pStyle w:val="Heading2"/>
@@ -4908,7 +5283,7 @@
         <w:t xml:space="preserve"> </w:t>
       </w:r>
       <w:r>
-        <w:t xml:space="preserve">pair on the same machine as our local Syn2b timings — roughly 100× Syn2b’s</w:t>
+        <w:t xml:space="preserve">pair on the same machine as our local Syn2b timings, roughly 100× Syn2b’s</w:t>
       </w:r>
       <w:r>
         <w:t xml:space="preserve"> </w:t>
@@ -4926,13 +5301,13 @@
         <w:t xml:space="preserve"> </w:t>
       </w:r>
       <w:r>
-        <w:t xml:space="preserve">database, at ~19 ms per unique pair. Other alignment-free approaches — MinHash</w:t>
-      </w:r>
-      <w:r>
-        <w:t xml:space="preserve"> </w:t>
-      </w:r>
-      <w:r>
-        <w:t xml:space="preserve">distances (Mash¹⁸) and sparse chaining (skani²¹) — summarize genomes as k-mer</w:t>
+        <w:t xml:space="preserve">database, at ~19 ms per unique pair. Other alignment-free approaches, MinHash</w:t>
+      </w:r>
+      <w:r>
+        <w:t xml:space="preserve"> </w:t>
+      </w:r>
+      <w:r>
+        <w:t xml:space="preserve">distances (Mash¹⁸) and sparse chaining (skani²¹), summarize genomes as k-mer</w:t>
       </w:r>
       <w:r>
         <w:t xml:space="preserve"> </w:t>
@@ -4974,7 +5349,7 @@
           <w:b/>
           <w:bCs/>
         </w:rPr>
-        <w:t xml:space="preserve">What genome-wide screening reveals.</w:t>
+        <w:t xml:space="preserve">What genome-wide screening shows.</w:t>
       </w:r>
       <w:r>
         <w:t xml:space="preserve"> </w:t>
@@ -4998,13 +5373,25 @@
         <w:t xml:space="preserve"> </w:t>
       </w:r>
       <w:r>
-        <w:t xml:space="preserve">(ANIm ≥ 97%) yet that carry ≥2 alignment-visible inversions; extrapolated to</w:t>
-      </w:r>
-      <w:r>
-        <w:t xml:space="preserve"> </w:t>
-      </w:r>
-      <w:r>
-        <w:t xml:space="preserve">the full GTDB representative set, the absolute number is far larger. Fast</w:t>
+        <w:t xml:space="preserve">(ANIm ≥ 97%) yet that carry ≥2 alignment-defined inversions; extrapolated to</w:t>
+      </w:r>
+      <w:r>
+        <w:t xml:space="preserve"> </w:t>
+      </w:r>
+      <w:r>
+        <w:t xml:space="preserve">the full GTDB representative set, the absolute number is far larger. The</w:t>
+      </w:r>
+      <w:r>
+        <w:t xml:space="preserve"> </w:t>
+      </w:r>
+      <w:r>
+        <w:t xml:space="preserve">application-scale GTDB and HROM censuses extend this observation from curated</w:t>
+      </w:r>
+      <w:r>
+        <w:t xml:space="preserve"> </w:t>
+      </w:r>
+      <w:r>
+        <w:t xml:space="preserve">samples to 646,012,820 and 62,872,901 effective pairs, respectively. Fast</w:t>
       </w:r>
       <w:r>
         <w:t xml:space="preserve"> </w:t>
@@ -5028,7 +5415,7 @@
         <w:t xml:space="preserve"> </w:t>
       </w:r>
       <w:r>
-        <w:t xml:space="preserve">this screening role — rather than replacement of alignment-based callers — to</w:t>
+        <w:t xml:space="preserve">this screening role, rather than replacement of alignment-based callers, to</w:t>
       </w:r>
       <w:r>
         <w:t xml:space="preserve"> </w:t>
@@ -5188,8 +5575,8 @@
         </w:pict>
       </w:r>
     </w:p>
-    <w:bookmarkEnd w:id="20"/>
-    <w:bookmarkStart w:id="30" w:name="methods"/>
+    <w:bookmarkEnd w:id="22"/>
+    <w:bookmarkStart w:id="34" w:name="methods"/>
     <w:p>
       <w:pPr>
         <w:pStyle w:val="Heading2"/>
@@ -5198,7 +5585,7 @@
         <w:t xml:space="preserve">Methods</w:t>
       </w:r>
     </w:p>
-    <w:bookmarkStart w:id="21" w:name="in-silico-genome-simulation"/>
+    <w:bookmarkStart w:id="23" w:name="in-silico-genome-simulation"/>
     <w:p>
       <w:pPr>
         <w:pStyle w:val="Heading3"/>
@@ -5288,8 +5675,8 @@
         <w:t xml:space="preserve">hardcoded.</w:t>
       </w:r>
     </w:p>
-    <w:bookmarkEnd w:id="21"/>
-    <w:bookmarkStart w:id="22" w:name="type-iib-enzyme-digestion"/>
+    <w:bookmarkEnd w:id="23"/>
+    <w:bookmarkStart w:id="24" w:name="type-iib-enzyme-digestion"/>
     <w:p>
       <w:pPr>
         <w:pStyle w:val="Heading3"/>
@@ -5403,8 +5790,8 @@
         <w:t xml:space="preserve">(27-bp tag): offset 8=AAG, offset 16=CTT (palindromic).</w:t>
       </w:r>
     </w:p>
-    <w:bookmarkEnd w:id="22"/>
-    <w:bookmarkStart w:id="23" w:name="syn2b-metrics"/>
+    <w:bookmarkEnd w:id="24"/>
+    <w:bookmarkStart w:id="25" w:name="syn2b-metrics"/>
     <w:p>
       <w:pPr>
         <w:pStyle w:val="Heading3"/>
@@ -5554,7 +5941,7 @@
         <w:t xml:space="preserve"> </w:t>
       </w:r>
       <w:r>
-        <w:t xml:space="preserve">from the reference — a landmark-count fraction, not a base-pair-weighted one.</w:t>
+        <w:t xml:space="preserve">from the reference, a landmark-count fraction, not a base-pair-weighted one.</w:t>
       </w:r>
       <w:r>
         <w:t xml:space="preserve"> </w:t>
@@ -5677,14 +6064,14 @@
         <w:t xml:space="preserve">than rearrangement statistics.</w:t>
       </w:r>
     </w:p>
-    <w:bookmarkEnd w:id="23"/>
-    <w:bookmarkStart w:id="24" w:name="gtdb-r207-validation"/>
+    <w:bookmarkEnd w:id="25"/>
+    <w:bookmarkStart w:id="26" w:name="X39675246b3082499ca6b05f9581ce087bee8765"/>
     <w:p>
       <w:pPr>
         <w:pStyle w:val="Heading3"/>
       </w:pPr>
       <w:r>
-        <w:t xml:space="preserve">GTDB-R207 validation</w:t>
+        <w:t xml:space="preserve">GTDB-R207 effective within-species census</w:t>
       </w:r>
     </w:p>
     <w:p>
@@ -5692,263 +6079,371 @@
         <w:pStyle w:val="FirstParagraph"/>
       </w:pPr>
       <w:r>
-        <w:t xml:space="preserve">Pairs were drawn from the GTDB-R207 representative genome set. A total of</w:t>
-      </w:r>
-      <w:r>
-        <w:t xml:space="preserve"> </w:t>
-      </w:r>
-      <w:r>
-        <w:t xml:space="preserve">43,334 pairs were designated as a held-out validation set independent of the</w:t>
-      </w:r>
-      <w:r>
-        <w:t xml:space="preserve"> </w:t>
-      </w:r>
-      <w:r>
-        <w:t xml:space="preserve">training data used for the companion Syn2bANI tool; 43,312 of these pairs had</w:t>
-      </w:r>
-      <w:r>
-        <w:t xml:space="preserve"> </w:t>
-      </w:r>
-      <w:r>
-        <w:t xml:space="preserve">complete Syn2b and dnadiff structural metrics and were used for the broad-band</w:t>
-      </w:r>
-      <w:r>
-        <w:t xml:space="preserve"> </w:t>
-      </w:r>
-      <w:r>
-        <w:t xml:space="preserve">correlation analyses (per-pair metrics in Supplementary Table 1). To cover the</w:t>
-      </w:r>
-      <w:r>
-        <w:t xml:space="preserve"> </w:t>
-      </w:r>
-      <w:r>
-        <w:t xml:space="preserve">strain-level regime, additional candidate pairs were sampled from GTDB-R207</w:t>
-      </w:r>
-      <w:r>
-        <w:t xml:space="preserve"> </w:t>
-      </w:r>
-      <w:r>
-        <w:t xml:space="preserve">genomes enriched for close relatives (candidate strata of the companion</w:t>
-      </w:r>
-      <w:r>
-        <w:t xml:space="preserve"> </w:t>
-      </w:r>
-      <w:r>
-        <w:t xml:space="preserve">Syn2bANI benchmark, initially ranked by predicted ANI) and retained only if</w:t>
-      </w:r>
-      <w:r>
-        <w:t xml:space="preserve"> </w:t>
-      </w:r>
-      <w:r>
-        <w:t xml:space="preserve">their alignment-based ANIm was ≥ 95%. This ANIm-verified sample contributed</w:t>
-      </w:r>
-      <w:r>
-        <w:t xml:space="preserve"> </w:t>
-      </w:r>
-      <w:r>
-        <w:t xml:space="preserve">4,436 pairs with complete metrics (3,826 at ≥ 97% ANIm); candidates that failed</w:t>
-      </w:r>
-      <w:r>
-        <w:t xml:space="preserve"> </w:t>
-      </w:r>
-      <w:r>
-        <w:t xml:space="preserve">ANIm verification are excluded from all headline results. For each pair, ANIm</w:t>
-      </w:r>
-      <w:r>
-        <w:t xml:space="preserve"> </w:t>
-      </w:r>
-      <w:r>
-        <w:t xml:space="preserve">was computed with minimap2²² (</w:t>
-      </w:r>
-      <w:r>
-        <w:rPr>
-          <w:rStyle w:val="VerbatimChar"/>
-        </w:rPr>
-        <w:t xml:space="preserve">-cx asm20</w:t>
-      </w:r>
-      <w:r>
-        <w:t xml:space="preserve">) and dnadiff (MUMmer 4.0²³) was run</w:t>
-      </w:r>
-      <w:r>
-        <w:t xml:space="preserve"> </w:t>
-      </w:r>
-      <w:r>
-        <w:t xml:space="preserve">with default</w:t>
-      </w:r>
-      <w:r>
-        <w:t xml:space="preserve"> </w:t>
-      </w:r>
-      <w:r>
-        <w:t xml:space="preserve">parameters; the</w:t>
-      </w:r>
-      <w:r>
-        <w:t xml:space="preserve"> </w:t>
-      </w:r>
-      <w:r>
-        <w:rPr>
-          <w:rStyle w:val="VerbatimChar"/>
-        </w:rPr>
-        <w:t xml:space="preserve">.1coords</w:t>
-      </w:r>
-      <w:r>
-        <w:t xml:space="preserve"> </w:t>
-      </w:r>
-      <w:r>
-        <w:t xml:space="preserve">output was used to derive the inverted aligned</w:t>
-      </w:r>
-      <w:r>
-        <w:t xml:space="preserve"> </w:t>
-      </w:r>
-      <w:r>
-        <w:t xml:space="preserve">fraction, and the</w:t>
-      </w:r>
-      <w:r>
-        <w:t xml:space="preserve"> </w:t>
-      </w:r>
-      <w:r>
-        <w:rPr>
-          <w:rStyle w:val="VerbatimChar"/>
-        </w:rPr>
-        <w:t xml:space="preserve">.report</w:t>
-      </w:r>
-      <w:r>
-        <w:t xml:space="preserve"> </w:t>
-      </w:r>
-      <w:r>
-        <w:t xml:space="preserve">output was used for breakpoint and structural-event</w:t>
-      </w:r>
-      <w:r>
-        <w:t xml:space="preserve"> </w:t>
-      </w:r>
-      <w:r>
-        <w:t xml:space="preserve">counts. Syn2b was run with the BcgI+AlfI+AloI+FalI multi-enzyme panel,</w:t>
-      </w:r>
-      <w:r>
-        <w:t xml:space="preserve"> </w:t>
-      </w:r>
-      <w:r>
-        <w:t xml:space="preserve">reporting both majority-frame and fixed-reference inverted fractions. Pearson</w:t>
-      </w:r>
-      <w:r>
-        <w:t xml:space="preserve"> </w:t>
-      </w:r>
-      <w:r>
-        <w:t xml:space="preserve">and Spearman correlations, linear regressions, and partial correlations</w:t>
-      </w:r>
-      <w:r>
-        <w:t xml:space="preserve"> </w:t>
-      </w:r>
-      <w:r>
-        <w:t xml:space="preserve">(controlling for contig count) were computed in Python with scipy and</w:t>
-      </w:r>
-      <w:r>
-        <w:t xml:space="preserve"> </w:t>
-      </w:r>
-      <w:r>
-        <w:t xml:space="preserve">statsmodels. Confidence intervals for Pearson correlations were obtained by</w:t>
-      </w:r>
-      <w:r>
-        <w:t xml:space="preserve"> </w:t>
-      </w:r>
-      <w:r>
-        <w:t xml:space="preserve">Fisher z-transformation.</w:t>
-      </w:r>
-    </w:p>
-    <w:bookmarkEnd w:id="24"/>
-    <w:bookmarkStart w:id="25" w:name="skani-ani-for-cohort-analysis"/>
-    <w:p>
-      <w:pPr>
-        <w:pStyle w:val="Heading3"/>
-      </w:pPr>
-      <w:r>
-        <w:t xml:space="preserve">skani ANI for cohort analysis</w:t>
-      </w:r>
-    </w:p>
-    <w:p>
-      <w:pPr>
-        <w:pStyle w:val="FirstParagraph"/>
-      </w:pPr>
-      <w:r>
-        <w:t xml:space="preserve">skani²¹ v0.1.0</w:t>
-      </w:r>
-      <w:r>
-        <w:t xml:space="preserve"> </w:t>
-      </w:r>
-      <w:r>
-        <w:rPr>
-          <w:rStyle w:val="VerbatimChar"/>
-        </w:rPr>
-        <w:t xml:space="preserve">dist</w:t>
-      </w:r>
-      <w:r>
-        <w:t xml:space="preserve"> </w:t>
-      </w:r>
-      <w:r>
-        <w:t xml:space="preserve">was run with default parameters on the four SynTracker</w:t>
-      </w:r>
-      <w:r>
-        <w:t xml:space="preserve"> </w:t>
-      </w:r>
-      <w:r>
-        <w:t xml:space="preserve">cohort assembly sets to obtain the ANI values used in Figure 4. The full set</w:t>
-      </w:r>
-      <w:r>
-        <w:t xml:space="preserve"> </w:t>
-      </w:r>
-      <w:r>
-        <w:t xml:space="preserve">was re-run with skani v0.3.2 (unique-pair triangles,</w:t>
-      </w:r>
-      <w:r>
-        <w:t xml:space="preserve"> </w:t>
-      </w:r>
-      <w:r>
-        <w:rPr>
-          <w:rStyle w:val="VerbatimChar"/>
-        </w:rPr>
-        <w:t xml:space="preserve">results/syntracker_validation/rerun_v032/</w:t>
-      </w:r>
-      <w:r>
-        <w:t xml:space="preserve">): every value quoted in the text</w:t>
-      </w:r>
-      <w:r>
-        <w:t xml:space="preserve"> </w:t>
-      </w:r>
-      <w:r>
-        <w:t xml:space="preserve">reproduces exactly in the ≥94.6% ANI regime these cohorts occupy.</w:t>
-      </w:r>
-    </w:p>
-    <w:bookmarkEnd w:id="25"/>
-    <w:bookmarkStart w:id="26" w:name="X6a6b7d43cb1ec6d1ead97acaebef98c7d7d0912"/>
-    <w:p>
-      <w:pPr>
-        <w:pStyle w:val="Heading3"/>
-      </w:pPr>
-      <w:r>
-        <w:t xml:space="preserve">Known-biology complete-genome collections</w:t>
-      </w:r>
-    </w:p>
-    <w:p>
-      <w:pPr>
-        <w:pStyle w:val="FirstParagraph"/>
-      </w:pPr>
-      <w:r>
-        <w:t xml:space="preserve">Complete-genome (assembly-level) sets for</w:t>
-      </w:r>
-      <w:r>
-        <w:t xml:space="preserve"> </w:t>
+        <w:t xml:space="preserve">GTDB-R207 species clusters with multiple genomes were decomposed into 500-genome block pairs. Of 274,374 planned genomes, 261,737 genomes in 21,973 clusters produced non-empty digestion TGTs. Structural tasks covered 653,584,719 effective unique pairs; 646,012,820 pairs remained after mapping legacy contig identifiers to accessions, canonicalizing unordered genome pairs, and global external-sort deduplication. Per-cluster row counts and SV-positive fractions were computed streamingly. One cluster (</w:t>
       </w:r>
       <w:r>
         <w:rPr>
           <w:i/>
           <w:iCs/>
         </w:rPr>
-        <w:t xml:space="preserve">S. flexneri</w:t>
-      </w:r>
-      <w:r>
-        <w:t xml:space="preserve"> </w:t>
-      </w:r>
-      <w:r>
-        <w:t xml:space="preserve">(n = 25),</w:t>
+        <w:t xml:space="preserve">E. coli</w:t>
+      </w:r>
+      <w:r>
+        <w:t xml:space="preserve">) had a 7.57M-pair shortfall relative to its effective expectation and is reported as a QC exception rather than imputed. The effective summary is stored in</w:t>
+      </w:r>
+      <w:r>
+        <w:t xml:space="preserve"> </w:t>
+      </w:r>
+      <w:r>
+        <w:rPr>
+          <w:rStyle w:val="VerbatimChar"/>
+        </w:rPr>
+        <w:t xml:space="preserve">results/census/gtdb/effective/</w:t>
+      </w:r>
+      <w:r>
+        <w:t xml:space="preserve">.</w:t>
+      </w:r>
+    </w:p>
+    <w:bookmarkEnd w:id="26"/>
+    <w:bookmarkStart w:id="27" w:name="hrom-within-species-census"/>
+    <w:p>
+      <w:pPr>
+        <w:pStyle w:val="Heading3"/>
+      </w:pPr>
+      <w:r>
+        <w:t xml:space="preserve">HROM within-species census</w:t>
+      </w:r>
+    </w:p>
+    <w:p>
+      <w:pPr>
+        <w:pStyle w:val="FirstParagraph"/>
+      </w:pPr>
+      <w:r>
+        <w:t xml:space="preserve">HROM conspecific genomes were obtained from the Human Reference Oral Microbiome</w:t>
+      </w:r>
+      <w:r>
+        <w:t xml:space="preserve"> </w:t>
+      </w:r>
+      <w:r>
+        <w:t xml:space="preserve">database. All 142,277 genomes in 2,241 multi-genome clusters were retained and</w:t>
+      </w:r>
+      <w:r>
+        <w:t xml:space="preserve"> </w:t>
+      </w:r>
+      <w:r>
+        <w:t xml:space="preserve">compared with the BcgI+AlfI+AloI+FalI production panel. TGTs</w:t>
+      </w:r>
+      <w:r>
+        <w:t xml:space="preserve"> </w:t>
+      </w:r>
+      <w:r>
+        <w:t xml:space="preserve">were keyed by filename genome accession because HROM FASTA headers are contig</w:t>
+      </w:r>
+      <w:r>
+        <w:t xml:space="preserve"> </w:t>
+      </w:r>
+      <w:r>
+        <w:t xml:space="preserve">identifiers. Species clusters were decomposed into 250-genome block pairs, and</w:t>
+      </w:r>
+      <w:r>
+        <w:t xml:space="preserve"> </w:t>
+      </w:r>
+      <w:r>
+        <w:t xml:space="preserve">all 62,872,901 unordered pairs were evaluated with Syn2b and skani 0.3.2. The</w:t>
+      </w:r>
+      <w:r>
+        <w:t xml:space="preserve"> </w:t>
+      </w:r>
+      <w:r>
+        <w:t xml:space="preserve">merge step canonicalized unordered genome pairs and suppressed 10,644,750</w:t>
+      </w:r>
+      <w:r>
+        <w:t xml:space="preserve"> </w:t>
+      </w:r>
+      <w:r>
+        <w:t xml:space="preserve">within-block duplicates introduced by the first block-pair implementation. The</w:t>
+      </w:r>
+      <w:r>
+        <w:t xml:space="preserve"> </w:t>
+      </w:r>
+      <w:r>
+        <w:t xml:space="preserve">final table contained exactly the expected cluster-level sum of C(n,2) rows, and</w:t>
+      </w:r>
+      <w:r>
+        <w:t xml:space="preserve"> </w:t>
+      </w:r>
+      <w:r>
+        <w:t xml:space="preserve">every structural row received a skani ANI value. Per-cluster summaries, ANI-bin</w:t>
+      </w:r>
+      <w:r>
+        <w:t xml:space="preserve"> </w:t>
+      </w:r>
+      <w:r>
+        <w:t xml:space="preserve">summaries, and QC reports are stored in</w:t>
+      </w:r>
+      <w:r>
+        <w:t xml:space="preserve"> </w:t>
+      </w:r>
+      <w:r>
+        <w:rPr>
+          <w:rStyle w:val="VerbatimChar"/>
+        </w:rPr>
+        <w:t xml:space="preserve">results/census/hrom/</w:t>
+      </w:r>
+      <w:r>
+        <w:t xml:space="preserve">.</w:t>
+      </w:r>
+    </w:p>
+    <w:bookmarkEnd w:id="27"/>
+    <w:bookmarkStart w:id="28" w:name="gtdb-r207-validation"/>
+    <w:p>
+      <w:pPr>
+        <w:pStyle w:val="Heading3"/>
+      </w:pPr>
+      <w:r>
+        <w:t xml:space="preserve">GTDB-R207 validation</w:t>
+      </w:r>
+    </w:p>
+    <w:p>
+      <w:pPr>
+        <w:pStyle w:val="FirstParagraph"/>
+      </w:pPr>
+      <w:r>
+        <w:t xml:space="preserve">Pairs were drawn from the GTDB-R207 representative genome set. A total of</w:t>
+      </w:r>
+      <w:r>
+        <w:t xml:space="preserve"> </w:t>
+      </w:r>
+      <w:r>
+        <w:t xml:space="preserve">43,334 pairs were designated as a held-out validation set independent of the</w:t>
+      </w:r>
+      <w:r>
+        <w:t xml:space="preserve"> </w:t>
+      </w:r>
+      <w:r>
+        <w:t xml:space="preserve">training data used for the companion Syn2bANI tool; 43,312 of these pairs had</w:t>
+      </w:r>
+      <w:r>
+        <w:t xml:space="preserve"> </w:t>
+      </w:r>
+      <w:r>
+        <w:t xml:space="preserve">complete Syn2b and dnadiff structural metrics and were used for the broad-band</w:t>
+      </w:r>
+      <w:r>
+        <w:t xml:space="preserve"> </w:t>
+      </w:r>
+      <w:r>
+        <w:t xml:space="preserve">correlation analyses (per-pair metrics in Supplementary Table 1). To cover the</w:t>
+      </w:r>
+      <w:r>
+        <w:t xml:space="preserve"> </w:t>
+      </w:r>
+      <w:r>
+        <w:t xml:space="preserve">strain-level regime, additional candidate pairs were sampled from GTDB-R207</w:t>
+      </w:r>
+      <w:r>
+        <w:t xml:space="preserve"> </w:t>
+      </w:r>
+      <w:r>
+        <w:t xml:space="preserve">genomes enriched for close relatives (candidate strata of the companion</w:t>
+      </w:r>
+      <w:r>
+        <w:t xml:space="preserve"> </w:t>
+      </w:r>
+      <w:r>
+        <w:t xml:space="preserve">Syn2bANI benchmark, initially ranked by predicted ANI) and retained only if</w:t>
+      </w:r>
+      <w:r>
+        <w:t xml:space="preserve"> </w:t>
+      </w:r>
+      <w:r>
+        <w:t xml:space="preserve">their alignment-based ANIm was ≥ 95%. This ANIm-verified sample contributed</w:t>
+      </w:r>
+      <w:r>
+        <w:t xml:space="preserve"> </w:t>
+      </w:r>
+      <w:r>
+        <w:t xml:space="preserve">4,436 pairs; 3,826 unique pairs remained after deduplication for the correlation analyses at ≥ 97% ANIm. The non-redundant discordance survey retained 3,828 pairs at ≥ 97% ANIm because two of the additional deduplicated pairs had usable inversion-event records but were not represented in the correlation table. Candidates that failed ANIm verification were excluded from all headline results. For each pair, ANIm</w:t>
+      </w:r>
+      <w:r>
+        <w:t xml:space="preserve"> </w:t>
+      </w:r>
+      <w:r>
+        <w:t xml:space="preserve">was computed with minimap2²² (</w:t>
+      </w:r>
+      <w:r>
+        <w:rPr>
+          <w:rStyle w:val="VerbatimChar"/>
+        </w:rPr>
+        <w:t xml:space="preserve">-cx asm20</w:t>
+      </w:r>
+      <w:r>
+        <w:t xml:space="preserve">) and dnadiff (MUMmer 4.0²³) was run</w:t>
+      </w:r>
+      <w:r>
+        <w:t xml:space="preserve"> </w:t>
+      </w:r>
+      <w:r>
+        <w:t xml:space="preserve">with default</w:t>
+      </w:r>
+      <w:r>
+        <w:t xml:space="preserve"> </w:t>
+      </w:r>
+      <w:r>
+        <w:t xml:space="preserve">parameters; the</w:t>
+      </w:r>
+      <w:r>
+        <w:t xml:space="preserve"> </w:t>
+      </w:r>
+      <w:r>
+        <w:rPr>
+          <w:rStyle w:val="VerbatimChar"/>
+        </w:rPr>
+        <w:t xml:space="preserve">.1coords</w:t>
+      </w:r>
+      <w:r>
+        <w:t xml:space="preserve"> </w:t>
+      </w:r>
+      <w:r>
+        <w:t xml:space="preserve">output was used to derive the inverted aligned</w:t>
+      </w:r>
+      <w:r>
+        <w:t xml:space="preserve"> </w:t>
+      </w:r>
+      <w:r>
+        <w:t xml:space="preserve">fraction, and the</w:t>
+      </w:r>
+      <w:r>
+        <w:t xml:space="preserve"> </w:t>
+      </w:r>
+      <w:r>
+        <w:rPr>
+          <w:rStyle w:val="VerbatimChar"/>
+        </w:rPr>
+        <w:t xml:space="preserve">.report</w:t>
+      </w:r>
+      <w:r>
+        <w:t xml:space="preserve"> </w:t>
+      </w:r>
+      <w:r>
+        <w:t xml:space="preserve">output was used for breakpoint and structural-event</w:t>
+      </w:r>
+      <w:r>
+        <w:t xml:space="preserve"> </w:t>
+      </w:r>
+      <w:r>
+        <w:t xml:space="preserve">counts. Syn2b was run with the BcgI+AlfI+AloI+FalI multi-enzyme panel,</w:t>
+      </w:r>
+      <w:r>
+        <w:t xml:space="preserve"> </w:t>
+      </w:r>
+      <w:r>
+        <w:t xml:space="preserve">reporting both majority-frame and fixed-reference inverted fractions. Pearson</w:t>
+      </w:r>
+      <w:r>
+        <w:t xml:space="preserve"> </w:t>
+      </w:r>
+      <w:r>
+        <w:t xml:space="preserve">and Spearman correlations, linear regressions, and partial correlations</w:t>
+      </w:r>
+      <w:r>
+        <w:t xml:space="preserve"> </w:t>
+      </w:r>
+      <w:r>
+        <w:t xml:space="preserve">(controlling for contig count) were computed in Python with scipy and</w:t>
+      </w:r>
+      <w:r>
+        <w:t xml:space="preserve"> </w:t>
+      </w:r>
+      <w:r>
+        <w:t xml:space="preserve">statsmodels. Confidence intervals for Pearson correlations were obtained by</w:t>
+      </w:r>
+      <w:r>
+        <w:t xml:space="preserve"> </w:t>
+      </w:r>
+      <w:r>
+        <w:t xml:space="preserve">Fisher z-transformation.</w:t>
+      </w:r>
+    </w:p>
+    <w:bookmarkEnd w:id="28"/>
+    <w:bookmarkStart w:id="29" w:name="skani-ani-for-cohort-analysis"/>
+    <w:p>
+      <w:pPr>
+        <w:pStyle w:val="Heading3"/>
+      </w:pPr>
+      <w:r>
+        <w:t xml:space="preserve">skani ANI for cohort analysis</w:t>
+      </w:r>
+    </w:p>
+    <w:p>
+      <w:pPr>
+        <w:pStyle w:val="FirstParagraph"/>
+      </w:pPr>
+      <w:r>
+        <w:t xml:space="preserve">skani²¹ v0.1.0</w:t>
+      </w:r>
+      <w:r>
+        <w:t xml:space="preserve"> </w:t>
+      </w:r>
+      <w:r>
+        <w:rPr>
+          <w:rStyle w:val="VerbatimChar"/>
+        </w:rPr>
+        <w:t xml:space="preserve">dist</w:t>
+      </w:r>
+      <w:r>
+        <w:t xml:space="preserve"> </w:t>
+      </w:r>
+      <w:r>
+        <w:t xml:space="preserve">was run with default parameters on the four SynTracker</w:t>
+      </w:r>
+      <w:r>
+        <w:t xml:space="preserve"> </w:t>
+      </w:r>
+      <w:r>
+        <w:t xml:space="preserve">cohort assembly sets to obtain the ANI values used in Figure 4. The full set</w:t>
+      </w:r>
+      <w:r>
+        <w:t xml:space="preserve"> </w:t>
+      </w:r>
+      <w:r>
+        <w:t xml:space="preserve">was re-run with skani v0.3.2 (unique-pair triangles,</w:t>
+      </w:r>
+      <w:r>
+        <w:t xml:space="preserve"> </w:t>
+      </w:r>
+      <w:r>
+        <w:rPr>
+          <w:rStyle w:val="VerbatimChar"/>
+        </w:rPr>
+        <w:t xml:space="preserve">results/syntracker_validation/rerun_v032/</w:t>
+      </w:r>
+      <w:r>
+        <w:t xml:space="preserve">): every value quoted in the text</w:t>
+      </w:r>
+      <w:r>
+        <w:t xml:space="preserve"> </w:t>
+      </w:r>
+      <w:r>
+        <w:t xml:space="preserve">reproduces exactly in the ≥94.6% ANI regime these cohorts occupy.</w:t>
+      </w:r>
+    </w:p>
+    <w:bookmarkEnd w:id="29"/>
+    <w:bookmarkStart w:id="30" w:name="X6a6b7d43cb1ec6d1ead97acaebef98c7d7d0912"/>
+    <w:p>
+      <w:pPr>
+        <w:pStyle w:val="Heading3"/>
+      </w:pPr>
+      <w:r>
+        <w:t xml:space="preserve">Known-biology complete-genome collections</w:t>
+      </w:r>
+    </w:p>
+    <w:p>
+      <w:pPr>
+        <w:pStyle w:val="FirstParagraph"/>
+      </w:pPr>
+      <w:r>
+        <w:t xml:space="preserve">Complete-genome (assembly-level) sets for</w:t>
       </w:r>
       <w:r>
         <w:t xml:space="preserve"> </w:t>
@@ -5958,13 +6453,13 @@
           <w:i/>
           <w:iCs/>
         </w:rPr>
-        <w:t xml:space="preserve">S. sonnei</w:t>
-      </w:r>
-      <w:r>
-        <w:t xml:space="preserve"> </w:t>
-      </w:r>
-      <w:r>
-        <w:t xml:space="preserve">(n = 15),</w:t>
+        <w:t xml:space="preserve">S. flexneri</w:t>
+      </w:r>
+      <w:r>
+        <w:t xml:space="preserve"> </w:t>
+      </w:r>
+      <w:r>
+        <w:t xml:space="preserve">(n = 25),</w:t>
       </w:r>
       <w:r>
         <w:t xml:space="preserve"> </w:t>
@@ -5974,13 +6469,13 @@
           <w:i/>
           <w:iCs/>
         </w:rPr>
-        <w:t xml:space="preserve">S.</w:t>
-      </w:r>
-      <w:r>
-        <w:t xml:space="preserve"> </w:t>
-      </w:r>
-      <w:r>
-        <w:t xml:space="preserve">Typhimurium (n = 20),</w:t>
+        <w:t xml:space="preserve">S. sonnei</w:t>
+      </w:r>
+      <w:r>
+        <w:t xml:space="preserve"> </w:t>
+      </w:r>
+      <w:r>
+        <w:t xml:space="preserve">(n = 15),</w:t>
       </w:r>
       <w:r>
         <w:t xml:space="preserve"> </w:t>
@@ -5990,13 +6485,13 @@
           <w:i/>
           <w:iCs/>
         </w:rPr>
-        <w:t xml:space="preserve">E. coli</w:t>
-      </w:r>
-      <w:r>
-        <w:t xml:space="preserve"> </w:t>
-      </w:r>
-      <w:r>
-        <w:t xml:space="preserve">(n = 20) and</w:t>
+        <w:t xml:space="preserve">S.</w:t>
+      </w:r>
+      <w:r>
+        <w:t xml:space="preserve"> </w:t>
+      </w:r>
+      <w:r>
+        <w:t xml:space="preserve">Typhimurium (n = 20),</w:t>
       </w:r>
       <w:r>
         <w:t xml:space="preserve"> </w:t>
@@ -6006,358 +6501,13 @@
           <w:i/>
           <w:iCs/>
         </w:rPr>
-        <w:t xml:space="preserve">M. tuberculosis</w:t>
-      </w:r>
-      <w:r>
-        <w:t xml:space="preserve"> </w:t>
-      </w:r>
-      <w:r>
-        <w:t xml:space="preserve">(n = 20) were retrieved from NCBI Assembly with a complete-genome filter</w:t>
-      </w:r>
-      <w:r>
-        <w:t xml:space="preserve"> </w:t>
-      </w:r>
-      <w:r>
-        <w:t xml:space="preserve">(</w:t>
-      </w:r>
-      <w:r>
-        <w:rPr>
-          <w:rStyle w:val="VerbatimChar"/>
-        </w:rPr>
-        <w:t xml:space="preserve">scripts/fetch_vignette_genomes.py</w:t>
-      </w:r>
-      <w:r>
-        <w:t xml:space="preserve">, September 2026). Assemblies sharing an</w:t>
-      </w:r>
-      <w:r>
-        <w:t xml:space="preserve"> </w:t>
-      </w:r>
-      <w:r>
-        <w:t xml:space="preserve">identical chromosome sequence identifier with another member of the set are</w:t>
-      </w:r>
-      <w:r>
-        <w:t xml:space="preserve"> </w:t>
-      </w:r>
-      <w:r>
-        <w:t xml:space="preserve">retained once. All within-collection pairs were compared with Syn2b</w:t>
-      </w:r>
-      <w:r>
-        <w:t xml:space="preserve"> </w:t>
-      </w:r>
-      <w:r>
-        <w:t xml:space="preserve">(BcgI+AlfI+AloI+FalI) and skani v0.1.0</w:t>
-      </w:r>
-      <w:r>
-        <w:t xml:space="preserve"> </w:t>
-      </w:r>
-      <w:r>
-        <w:rPr>
-          <w:rStyle w:val="VerbatimChar"/>
-        </w:rPr>
-        <w:t xml:space="preserve">triangle</w:t>
-      </w:r>
-      <w:r>
-        <w:t xml:space="preserve"> </w:t>
-      </w:r>
-      <w:r>
-        <w:t xml:space="preserve">for ANI</w:t>
-      </w:r>
-      <w:r>
-        <w:t xml:space="preserve"> </w:t>
-      </w:r>
-      <w:r>
-        <w:t xml:space="preserve">(</w:t>
-      </w:r>
-      <w:r>
-        <w:rPr>
-          <w:rStyle w:val="VerbatimChar"/>
-        </w:rPr>
-        <w:t xml:space="preserve">scripts/analyze_known_biology.py</w:t>
-      </w:r>
-      <w:r>
-        <w:t xml:space="preserve">; per-pair data in</w:t>
-      </w:r>
-      <w:r>
-        <w:t xml:space="preserve"> </w:t>
-      </w:r>
-      <w:r>
-        <w:rPr>
-          <w:rStyle w:val="VerbatimChar"/>
-        </w:rPr>
-        <w:t xml:space="preserve">results/known_biology/vignette_pairs.tsv</w:t>
-      </w:r>
-      <w:r>
-        <w:t xml:space="preserve">). The minimap2 reference timing</w:t>
-      </w:r>
-      <w:r>
-        <w:t xml:space="preserve"> </w:t>
-      </w:r>
-      <w:r>
-        <w:t xml:space="preserve">(</w:t>
-      </w:r>
-      <w:r>
-        <w:rPr>
-          <w:rStyle w:val="VerbatimChar"/>
-        </w:rPr>
-        <w:t xml:space="preserve">-cx asm5</w:t>
-      </w:r>
-      <w:r>
-        <w:t xml:space="preserve">, one thread, MG1655 vs Sakai O157:H7) is archived in</w:t>
-      </w:r>
-      <w:r>
-        <w:t xml:space="preserve"> </w:t>
-      </w:r>
-      <w:r>
-        <w:rPr>
-          <w:rStyle w:val="VerbatimChar"/>
-        </w:rPr>
-        <w:t xml:space="preserve">results/efficiency_v8/minimap2_timing.tsv</w:t>
-      </w:r>
-      <w:r>
-        <w:t xml:space="preserve">.</w:t>
-      </w:r>
-    </w:p>
-    <w:bookmarkEnd w:id="26"/>
-    <w:bookmarkStart w:id="27" w:name="X8a39519311735125bd69615251976c20069db80"/>
-    <w:p>
-      <w:pPr>
-        <w:pStyle w:val="Heading3"/>
-      </w:pPr>
-      <w:r>
-        <w:t xml:space="preserve">Genome-wide ANI–rearrangement discordance analysis</w:t>
-      </w:r>
-    </w:p>
-    <w:p>
-      <w:pPr>
-        <w:pStyle w:val="FirstParagraph"/>
-      </w:pPr>
-      <w:r>
-        <w:t xml:space="preserve">The held-out set and the ANIm-verified high-ANI sample were merged on</w:t>
-      </w:r>
-      <w:r>
-        <w:t xml:space="preserve"> </w:t>
-      </w:r>
-      <w:r>
-        <w:rPr>
-          <w:rStyle w:val="VerbatimChar"/>
-        </w:rPr>
-        <w:t xml:space="preserve">pairid</w:t>
-      </w:r>
-      <w:r>
-        <w:t xml:space="preserve"> </w:t>
-      </w:r>
-      <w:r>
-        <w:t xml:space="preserve">(no overlap between the two sets). Per-pair ANIm, dnadiff inversion</w:t>
-      </w:r>
-      <w:r>
-        <w:t xml:space="preserve"> </w:t>
-      </w:r>
-      <w:r>
-        <w:t xml:space="preserve">counts (</w:t>
-      </w:r>
-      <w:r>
-        <w:rPr>
-          <w:rStyle w:val="VerbatimChar"/>
-        </w:rPr>
-        <w:t xml:space="preserve">max</w:t>
-      </w:r>
-      <w:r>
-        <w:t xml:space="preserve"> </w:t>
-      </w:r>
-      <w:r>
-        <w:t xml:space="preserve">of the reference-side and query-side</w:t>
-      </w:r>
-      <w:r>
-        <w:t xml:space="preserve"> </w:t>
-      </w:r>
-      <w:r>
-        <w:rPr>
-          <w:rStyle w:val="VerbatimChar"/>
-        </w:rPr>
-        <w:t xml:space="preserve">dd_inversions</w:t>
-      </w:r>
-      <w:r>
-        <w:t xml:space="preserve"> </w:t>
-      </w:r>
-      <w:r>
-        <w:t xml:space="preserve">columns of</w:t>
-      </w:r>
-      <w:r>
-        <w:t xml:space="preserve"> </w:t>
-      </w:r>
-      <w:r>
-        <w:t xml:space="preserve">the dnadiff</w:t>
-      </w:r>
-      <w:r>
-        <w:t xml:space="preserve"> </w:t>
-      </w:r>
-      <w:r>
-        <w:rPr>
-          <w:rStyle w:val="VerbatimChar"/>
-        </w:rPr>
-        <w:t xml:space="preserve">.report</w:t>
-      </w:r>
-      <w:r>
-        <w:t xml:space="preserve"> </w:t>
-      </w:r>
-      <w:r>
-        <w:t xml:space="preserve">output), dnadiff breakpoint counts, Syn2b junction</w:t>
-      </w:r>
-      <w:r>
-        <w:t xml:space="preserve"> </w:t>
-      </w:r>
-      <w:r>
-        <w:t xml:space="preserve">counts, and per-genome contig numbers (from GTDB-R207 metadata) were combined</w:t>
-      </w:r>
-      <w:r>
-        <w:t xml:space="preserve"> </w:t>
-      </w:r>
-      <w:r>
-        <w:t xml:space="preserve">with the analysis script</w:t>
-      </w:r>
-      <w:r>
-        <w:t xml:space="preserve"> </w:t>
-      </w:r>
-      <w:r>
-        <w:rPr>
-          <w:rStyle w:val="VerbatimChar"/>
-        </w:rPr>
-        <w:t xml:space="preserve">scripts/analyze_ani_synteny_discordance.py</w:t>
-      </w:r>
-      <w:r>
-        <w:t xml:space="preserve">, which</w:t>
-      </w:r>
-      <w:r>
-        <w:t xml:space="preserve"> </w:t>
-      </w:r>
-      <w:r>
-        <w:t xml:space="preserve">also produces Figure 5 and all discordance summary statistics. A pair was</w:t>
-      </w:r>
-      <w:r>
-        <w:t xml:space="preserve"> </w:t>
-      </w:r>
-      <w:r>
-        <w:t xml:space="preserve">called discordant if ANIm ≥ 97% and it carried ≥2 dnadiff inversion events.</w:t>
-      </w:r>
-      <w:r>
-        <w:t xml:space="preserve"> </w:t>
-      </w:r>
-      <w:r>
-        <w:t xml:space="preserve">Phylum-level enrichment was computed against the concordant (ANIm ≥ 97%,</w:t>
-      </w:r>
-      <w:r>
-        <w:t xml:space="preserve"> </w:t>
-      </w:r>
-      <w:r>
-        <w:t xml:space="preserve">&lt;2 inversions) background. Syn2b flagging performance was quantified as the</w:t>
-      </w:r>
-      <w:r>
-        <w:t xml:space="preserve"> </w:t>
-      </w:r>
-      <w:r>
-        <w:t xml:space="preserve">ROC AUC of the Syn2b junction count for discriminating discordant from</w:t>
-      </w:r>
-      <w:r>
-        <w:t xml:space="preserve"> </w:t>
-      </w:r>
-      <w:r>
-        <w:t xml:space="preserve">concordant pairs; junction density (count divided by shared landmarks) was</w:t>
-      </w:r>
-      <w:r>
-        <w:t xml:space="preserve"> </w:t>
-      </w:r>
-      <w:r>
-        <w:t xml:space="preserve">evaluated as an alternative feature. Prevalence percentages are reported with</w:t>
-      </w:r>
-      <w:r>
-        <w:t xml:space="preserve"> </w:t>
-      </w:r>
-      <w:r>
-        <w:t xml:space="preserve">95% bootstrap confidence intervals (10,000 resamples over pairs).</w:t>
-      </w:r>
-      <w:r>
-        <w:t xml:space="preserve"> </w:t>
-      </w:r>
-      <w:r>
-        <w:t xml:space="preserve">Fragmentation dependence of breakpoint-style counts was</w:t>
-      </w:r>
-      <w:r>
-        <w:t xml:space="preserve"> </w:t>
-      </w:r>
-      <w:r>
-        <w:t xml:space="preserve">assessed by Spearman correlation with the per-pair maximum contig count and by</w:t>
-      </w:r>
-      <w:r>
-        <w:t xml:space="preserve"> </w:t>
-      </w:r>
-      <w:r>
-        <w:t xml:space="preserve">partial correlation controlling for ANIm; the contig-count distributions of</w:t>
-      </w:r>
-      <w:r>
-        <w:t xml:space="preserve"> </w:t>
-      </w:r>
-      <w:r>
-        <w:t xml:space="preserve">discordant versus concordant pairs were compared with a Mann–Whitney U test.</w:t>
-      </w:r>
-    </w:p>
-    <w:bookmarkEnd w:id="27"/>
-    <w:bookmarkStart w:id="28" w:name="software-availability"/>
-    <w:p>
-      <w:pPr>
-        <w:pStyle w:val="Heading3"/>
-      </w:pPr>
-      <w:r>
-        <w:t xml:space="preserve">Software availability</w:t>
-      </w:r>
-    </w:p>
-    <w:p>
-      <w:pPr>
-        <w:pStyle w:val="FirstParagraph"/>
-      </w:pPr>
-      <w:r>
-        <w:t xml:space="preserve">Syn2b: https://github.com/HuangShiLab/Syn2b</w:t>
-      </w:r>
-      <w:r>
-        <w:t xml:space="preserve"> </w:t>
-      </w:r>
-      <w:r>
-        <w:t xml:space="preserve">Analysis scripts and data: https://github.com/HuangShiLab/Syn2b-paper</w:t>
-      </w:r>
-      <w:r>
-        <w:t xml:space="preserve"> </w:t>
-      </w:r>
-      <w:r>
-        <w:t xml:space="preserve">Companion ANI tool and paper: https://github.com/HuangShiLab/Syn2bANI-paper</w:t>
-      </w:r>
-    </w:p>
-    <w:bookmarkEnd w:id="28"/>
-    <w:bookmarkStart w:id="29" w:name="data-availability"/>
-    <w:p>
-      <w:pPr>
-        <w:pStyle w:val="Heading3"/>
-      </w:pPr>
-      <w:r>
-        <w:t xml:space="preserve">Data availability</w:t>
-      </w:r>
-    </w:p>
-    <w:p>
-      <w:pPr>
-        <w:pStyle w:val="FirstParagraph"/>
-      </w:pPr>
-      <w:r>
-        <w:t xml:space="preserve">All analysis scripts, summary data, and figure source files are available in the</w:t>
-      </w:r>
-      <w:r>
-        <w:t xml:space="preserve"> </w:t>
-      </w:r>
-      <w:r>
-        <w:t xml:space="preserve">Syn2b-paper repository (https://github.com/HuangShiLab/Syn2b-paper). Raw GTDB-R207</w:t>
-      </w:r>
-      <w:r>
-        <w:t xml:space="preserve"> </w:t>
-      </w:r>
-      <w:r>
-        <w:t xml:space="preserve">genomes were downloaded from the GTDB release R207 (ref. 20). The</w:t>
+        <w:t xml:space="preserve">E. coli</w:t>
+      </w:r>
+      <w:r>
+        <w:t xml:space="preserve"> </w:t>
+      </w:r>
+      <w:r>
+        <w:t xml:space="preserve">(n = 20) and</w:t>
       </w:r>
       <w:r>
         <w:t xml:space="preserve"> </w:t>
@@ -6367,19 +6517,358 @@
           <w:i/>
           <w:iCs/>
         </w:rPr>
-        <w:t xml:space="preserve">E. coli</w:t>
-      </w:r>
-      <w:r>
-        <w:t xml:space="preserve"> </w:t>
-      </w:r>
-      <w:r>
-        <w:t xml:space="preserve">K-12</w:t>
-      </w:r>
-      <w:r>
-        <w:t xml:space="preserve"> </w:t>
-      </w:r>
-      <w:r>
-        <w:t xml:space="preserve">MG1655 reference genome (NC_000913.3) and the</w:t>
+        <w:t xml:space="preserve">M. tuberculosis</w:t>
+      </w:r>
+      <w:r>
+        <w:t xml:space="preserve"> </w:t>
+      </w:r>
+      <w:r>
+        <w:t xml:space="preserve">(n = 20) were retrieved from NCBI Assembly with a complete-genome filter</w:t>
+      </w:r>
+      <w:r>
+        <w:t xml:space="preserve"> </w:t>
+      </w:r>
+      <w:r>
+        <w:t xml:space="preserve">(</w:t>
+      </w:r>
+      <w:r>
+        <w:rPr>
+          <w:rStyle w:val="VerbatimChar"/>
+        </w:rPr>
+        <w:t xml:space="preserve">scripts/fetch_vignette_genomes.py</w:t>
+      </w:r>
+      <w:r>
+        <w:t xml:space="preserve">, September 2026). Assemblies sharing an</w:t>
+      </w:r>
+      <w:r>
+        <w:t xml:space="preserve"> </w:t>
+      </w:r>
+      <w:r>
+        <w:t xml:space="preserve">identical chromosome sequence identifier with another member of the set are</w:t>
+      </w:r>
+      <w:r>
+        <w:t xml:space="preserve"> </w:t>
+      </w:r>
+      <w:r>
+        <w:t xml:space="preserve">retained once. All within-collection pairs were compared with Syn2b</w:t>
+      </w:r>
+      <w:r>
+        <w:t xml:space="preserve"> </w:t>
+      </w:r>
+      <w:r>
+        <w:t xml:space="preserve">(BcgI+AlfI+AloI+FalI) and skani v0.1.0</w:t>
+      </w:r>
+      <w:r>
+        <w:t xml:space="preserve"> </w:t>
+      </w:r>
+      <w:r>
+        <w:rPr>
+          <w:rStyle w:val="VerbatimChar"/>
+        </w:rPr>
+        <w:t xml:space="preserve">triangle</w:t>
+      </w:r>
+      <w:r>
+        <w:t xml:space="preserve"> </w:t>
+      </w:r>
+      <w:r>
+        <w:t xml:space="preserve">for ANI</w:t>
+      </w:r>
+      <w:r>
+        <w:t xml:space="preserve"> </w:t>
+      </w:r>
+      <w:r>
+        <w:t xml:space="preserve">(</w:t>
+      </w:r>
+      <w:r>
+        <w:rPr>
+          <w:rStyle w:val="VerbatimChar"/>
+        </w:rPr>
+        <w:t xml:space="preserve">scripts/analyze_known_biology.py</w:t>
+      </w:r>
+      <w:r>
+        <w:t xml:space="preserve">; per-pair data in</w:t>
+      </w:r>
+      <w:r>
+        <w:t xml:space="preserve"> </w:t>
+      </w:r>
+      <w:r>
+        <w:rPr>
+          <w:rStyle w:val="VerbatimChar"/>
+        </w:rPr>
+        <w:t xml:space="preserve">results/known_biology/vignette_pairs.tsv</w:t>
+      </w:r>
+      <w:r>
+        <w:t xml:space="preserve">). The minimap2 reference timing</w:t>
+      </w:r>
+      <w:r>
+        <w:t xml:space="preserve"> </w:t>
+      </w:r>
+      <w:r>
+        <w:t xml:space="preserve">(</w:t>
+      </w:r>
+      <w:r>
+        <w:rPr>
+          <w:rStyle w:val="VerbatimChar"/>
+        </w:rPr>
+        <w:t xml:space="preserve">-cx asm5</w:t>
+      </w:r>
+      <w:r>
+        <w:t xml:space="preserve">, one thread, MG1655 vs Sakai O157:H7) is archived in</w:t>
+      </w:r>
+      <w:r>
+        <w:t xml:space="preserve"> </w:t>
+      </w:r>
+      <w:r>
+        <w:rPr>
+          <w:rStyle w:val="VerbatimChar"/>
+        </w:rPr>
+        <w:t xml:space="preserve">results/efficiency_v8/minimap2_timing.tsv</w:t>
+      </w:r>
+      <w:r>
+        <w:t xml:space="preserve">.</w:t>
+      </w:r>
+    </w:p>
+    <w:bookmarkEnd w:id="30"/>
+    <w:bookmarkStart w:id="31" w:name="X8a39519311735125bd69615251976c20069db80"/>
+    <w:p>
+      <w:pPr>
+        <w:pStyle w:val="Heading3"/>
+      </w:pPr>
+      <w:r>
+        <w:t xml:space="preserve">Genome-wide ANI–rearrangement discordance analysis</w:t>
+      </w:r>
+    </w:p>
+    <w:p>
+      <w:pPr>
+        <w:pStyle w:val="FirstParagraph"/>
+      </w:pPr>
+      <w:r>
+        <w:t xml:space="preserve">The held-out set and the ANIm-verified high-ANI sample were merged on</w:t>
+      </w:r>
+      <w:r>
+        <w:t xml:space="preserve"> </w:t>
+      </w:r>
+      <w:r>
+        <w:rPr>
+          <w:rStyle w:val="VerbatimChar"/>
+        </w:rPr>
+        <w:t xml:space="preserve">pairid</w:t>
+      </w:r>
+      <w:r>
+        <w:t xml:space="preserve"> </w:t>
+      </w:r>
+      <w:r>
+        <w:t xml:space="preserve">(no overlap between the two sets). Per-pair ANIm, dnadiff inversion</w:t>
+      </w:r>
+      <w:r>
+        <w:t xml:space="preserve"> </w:t>
+      </w:r>
+      <w:r>
+        <w:t xml:space="preserve">counts (</w:t>
+      </w:r>
+      <w:r>
+        <w:rPr>
+          <w:rStyle w:val="VerbatimChar"/>
+        </w:rPr>
+        <w:t xml:space="preserve">max</w:t>
+      </w:r>
+      <w:r>
+        <w:t xml:space="preserve"> </w:t>
+      </w:r>
+      <w:r>
+        <w:t xml:space="preserve">of the reference-side and query-side</w:t>
+      </w:r>
+      <w:r>
+        <w:t xml:space="preserve"> </w:t>
+      </w:r>
+      <w:r>
+        <w:rPr>
+          <w:rStyle w:val="VerbatimChar"/>
+        </w:rPr>
+        <w:t xml:space="preserve">dd_inversions</w:t>
+      </w:r>
+      <w:r>
+        <w:t xml:space="preserve"> </w:t>
+      </w:r>
+      <w:r>
+        <w:t xml:space="preserve">columns of</w:t>
+      </w:r>
+      <w:r>
+        <w:t xml:space="preserve"> </w:t>
+      </w:r>
+      <w:r>
+        <w:t xml:space="preserve">the dnadiff</w:t>
+      </w:r>
+      <w:r>
+        <w:t xml:space="preserve"> </w:t>
+      </w:r>
+      <w:r>
+        <w:rPr>
+          <w:rStyle w:val="VerbatimChar"/>
+        </w:rPr>
+        <w:t xml:space="preserve">.report</w:t>
+      </w:r>
+      <w:r>
+        <w:t xml:space="preserve"> </w:t>
+      </w:r>
+      <w:r>
+        <w:t xml:space="preserve">output), dnadiff breakpoint counts, Syn2b junction</w:t>
+      </w:r>
+      <w:r>
+        <w:t xml:space="preserve"> </w:t>
+      </w:r>
+      <w:r>
+        <w:t xml:space="preserve">counts, and per-genome contig numbers (from GTDB-R207 metadata) were combined</w:t>
+      </w:r>
+      <w:r>
+        <w:t xml:space="preserve"> </w:t>
+      </w:r>
+      <w:r>
+        <w:t xml:space="preserve">with the analysis script</w:t>
+      </w:r>
+      <w:r>
+        <w:t xml:space="preserve"> </w:t>
+      </w:r>
+      <w:r>
+        <w:rPr>
+          <w:rStyle w:val="VerbatimChar"/>
+        </w:rPr>
+        <w:t xml:space="preserve">scripts/analyze_ani_synteny_discordance.py</w:t>
+      </w:r>
+      <w:r>
+        <w:t xml:space="preserve">, which</w:t>
+      </w:r>
+      <w:r>
+        <w:t xml:space="preserve"> </w:t>
+      </w:r>
+      <w:r>
+        <w:t xml:space="preserve">also produces Figure 5 and all discordance summary statistics. A pair was</w:t>
+      </w:r>
+      <w:r>
+        <w:t xml:space="preserve"> </w:t>
+      </w:r>
+      <w:r>
+        <w:t xml:space="preserve">called discordant if ANIm ≥ 97% and it carried ≥2 dnadiff inversion events.</w:t>
+      </w:r>
+      <w:r>
+        <w:t xml:space="preserve"> </w:t>
+      </w:r>
+      <w:r>
+        <w:t xml:space="preserve">Phylum-level enrichment was computed against the concordant (ANIm ≥ 97%,</w:t>
+      </w:r>
+      <w:r>
+        <w:t xml:space="preserve"> </w:t>
+      </w:r>
+      <w:r>
+        <w:t xml:space="preserve">&lt;2 inversions) background. Syn2b flagging performance was quantified as the</w:t>
+      </w:r>
+      <w:r>
+        <w:t xml:space="preserve"> </w:t>
+      </w:r>
+      <w:r>
+        <w:t xml:space="preserve">ROC AUC of the Syn2b junction count for discriminating discordant from</w:t>
+      </w:r>
+      <w:r>
+        <w:t xml:space="preserve"> </w:t>
+      </w:r>
+      <w:r>
+        <w:t xml:space="preserve">concordant pairs; junction density (count divided by shared landmarks) was</w:t>
+      </w:r>
+      <w:r>
+        <w:t xml:space="preserve"> </w:t>
+      </w:r>
+      <w:r>
+        <w:t xml:space="preserve">evaluated as an alternative feature. Prevalence percentages are reported with</w:t>
+      </w:r>
+      <w:r>
+        <w:t xml:space="preserve"> </w:t>
+      </w:r>
+      <w:r>
+        <w:t xml:space="preserve">95% bootstrap confidence intervals (10,000 resamples over pairs).</w:t>
+      </w:r>
+      <w:r>
+        <w:t xml:space="preserve"> </w:t>
+      </w:r>
+      <w:r>
+        <w:t xml:space="preserve">Fragmentation dependence of breakpoint-style counts was</w:t>
+      </w:r>
+      <w:r>
+        <w:t xml:space="preserve"> </w:t>
+      </w:r>
+      <w:r>
+        <w:t xml:space="preserve">assessed by Spearman correlation with the per-pair maximum contig count and by</w:t>
+      </w:r>
+      <w:r>
+        <w:t xml:space="preserve"> </w:t>
+      </w:r>
+      <w:r>
+        <w:t xml:space="preserve">partial correlation controlling for ANIm; the contig-count distributions of</w:t>
+      </w:r>
+      <w:r>
+        <w:t xml:space="preserve"> </w:t>
+      </w:r>
+      <w:r>
+        <w:t xml:space="preserve">discordant versus concordant pairs were compared with a Mann–Whitney U test.</w:t>
+      </w:r>
+    </w:p>
+    <w:bookmarkEnd w:id="31"/>
+    <w:bookmarkStart w:id="32" w:name="software-availability"/>
+    <w:p>
+      <w:pPr>
+        <w:pStyle w:val="Heading3"/>
+      </w:pPr>
+      <w:r>
+        <w:t xml:space="preserve">Software availability</w:t>
+      </w:r>
+    </w:p>
+    <w:p>
+      <w:pPr>
+        <w:pStyle w:val="FirstParagraph"/>
+      </w:pPr>
+      <w:r>
+        <w:t xml:space="preserve">Syn2b: https://github.com/HuangShiLab/Syn2b</w:t>
+      </w:r>
+      <w:r>
+        <w:t xml:space="preserve"> </w:t>
+      </w:r>
+      <w:r>
+        <w:t xml:space="preserve">Analysis scripts and data: https://github.com/HuangShiLab/Syn2b-paper</w:t>
+      </w:r>
+      <w:r>
+        <w:t xml:space="preserve"> </w:t>
+      </w:r>
+      <w:r>
+        <w:t xml:space="preserve">Companion ANI tool and paper: https://github.com/HuangShiLab/Syn2bANI-paper</w:t>
+      </w:r>
+    </w:p>
+    <w:bookmarkEnd w:id="32"/>
+    <w:bookmarkStart w:id="33" w:name="data-availability"/>
+    <w:p>
+      <w:pPr>
+        <w:pStyle w:val="Heading3"/>
+      </w:pPr>
+      <w:r>
+        <w:t xml:space="preserve">Data availability</w:t>
+      </w:r>
+    </w:p>
+    <w:p>
+      <w:pPr>
+        <w:pStyle w:val="FirstParagraph"/>
+      </w:pPr>
+      <w:r>
+        <w:t xml:space="preserve">All analysis scripts, summary data, and figure source files are available in the</w:t>
+      </w:r>
+      <w:r>
+        <w:t xml:space="preserve"> </w:t>
+      </w:r>
+      <w:r>
+        <w:t xml:space="preserve">Syn2b-paper repository (https://github.com/HuangShiLab/Syn2b-paper). Raw GTDB-R207</w:t>
+      </w:r>
+      <w:r>
+        <w:t xml:space="preserve"> </w:t>
+      </w:r>
+      <w:r>
+        <w:t xml:space="preserve">genomes were downloaded from the GTDB release R207 (ref. 20). The</w:t>
       </w:r>
       <w:r>
         <w:t xml:space="preserve"> </w:t>
@@ -6389,6 +6878,28 @@
           <w:i/>
           <w:iCs/>
         </w:rPr>
+        <w:t xml:space="preserve">E. coli</w:t>
+      </w:r>
+      <w:r>
+        <w:t xml:space="preserve"> </w:t>
+      </w:r>
+      <w:r>
+        <w:t xml:space="preserve">K-12</w:t>
+      </w:r>
+      <w:r>
+        <w:t xml:space="preserve"> </w:t>
+      </w:r>
+      <w:r>
+        <w:t xml:space="preserve">MG1655 reference genome (NC_000913.3) and the</w:t>
+      </w:r>
+      <w:r>
+        <w:t xml:space="preserve"> </w:t>
+      </w:r>
+      <w:r>
+        <w:rPr>
+          <w:i/>
+          <w:iCs/>
+        </w:rPr>
         <w:t xml:space="preserve">H. pylori</w:t>
       </w:r>
       <w:r>
@@ -6428,7 +6939,43 @@
         <w:t xml:space="preserve"> </w:t>
       </w:r>
       <w:r>
-        <w:t xml:space="preserve">described in Supplementary Table 3.</w:t>
+        <w:t xml:space="preserve">described in Supplementary Table 3. The HROM resource was obtained from</w:t>
+      </w:r>
+      <w:r>
+        <w:t xml:space="preserve"> </w:t>
+      </w:r>
+      <w:r>
+        <w:t xml:space="preserve">https://www.decodebiome.org/HROM/. Repository summaries and QC tables for the</w:t>
+      </w:r>
+      <w:r>
+        <w:t xml:space="preserve"> </w:t>
+      </w:r>
+      <w:r>
+        <w:t xml:space="preserve">GTDB and HROM censuses are included in</w:t>
+      </w:r>
+      <w:r>
+        <w:t xml:space="preserve"> </w:t>
+      </w:r>
+      <w:r>
+        <w:rPr>
+          <w:rStyle w:val="VerbatimChar"/>
+        </w:rPr>
+        <w:t xml:space="preserve">results/census/</w:t>
+      </w:r>
+      <w:r>
+        <w:t xml:space="preserve">; the corresponding</w:t>
+      </w:r>
+      <w:r>
+        <w:t xml:space="preserve"> </w:t>
+      </w:r>
+      <w:r>
+        <w:t xml:space="preserve">compressed full pair tables are prepared for deposit in a permanent archive</w:t>
+      </w:r>
+      <w:r>
+        <w:t xml:space="preserve"> </w:t>
+      </w:r>
+      <w:r>
+        <w:t xml:space="preserve">(Zenodo or figshare) rather than repository hosting.</w:t>
       </w:r>
     </w:p>
     <w:p>
@@ -6438,9 +6985,9 @@
         </w:pict>
       </w:r>
     </w:p>
-    <w:bookmarkEnd w:id="29"/>
-    <w:bookmarkEnd w:id="30"/>
-    <w:bookmarkStart w:id="31" w:name="references"/>
+    <w:bookmarkEnd w:id="33"/>
+    <w:bookmarkEnd w:id="34"/>
+    <w:bookmarkStart w:id="35" w:name="references"/>
     <w:p>
       <w:pPr>
         <w:pStyle w:val="Heading2"/>
@@ -7217,7 +7764,7 @@
         <w:t xml:space="preserve"> </w:t>
       </w:r>
       <w:r>
-        <w:t xml:space="preserve">endonucleases—a historical perspective and more.</w:t>
+        <w:t xml:space="preserve">endonucleases: a historical perspective and more.</w:t>
       </w:r>
       <w:r>
         <w:t xml:space="preserve"> </w:t>
@@ -7537,8 +8084,8 @@
         </w:pict>
       </w:r>
     </w:p>
-    <w:bookmarkEnd w:id="31"/>
-    <w:bookmarkStart w:id="32" w:name="figures-and-tables"/>
+    <w:bookmarkEnd w:id="35"/>
+    <w:bookmarkStart w:id="36" w:name="figures-and-tables"/>
     <w:p>
       <w:pPr>
         <w:pStyle w:val="Heading2"/>
@@ -7830,7 +8377,7 @@
           <w:b/>
           <w:bCs/>
         </w:rPr>
-        <w:t xml:space="preserve">Figure 4. SynTracker cohorts reveal ANI–synteny decoupling.</w:t>
+        <w:t xml:space="preserve">Figure 4. SynTracker cohorts show ANI–synteny decoupling.</w:t>
       </w:r>
       <w:r>
         <w:t xml:space="preserve"> </w:t>
@@ -7964,7 +8511,7 @@
         <w:t xml:space="preserve"> </w:t>
       </w:r>
       <w:r>
-        <w:t xml:space="preserve">at least 1, 2, or 5 dnadiff inversions per 1% ANIm bin — rearrangement</w:t>
+        <w:t xml:space="preserve">at least 1, 2, or 5 dnadiff inversions per 1% ANIm bin, rearrangement</w:t>
       </w:r>
       <w:r>
         <w:t xml:space="preserve"> </w:t>
@@ -7988,7 +8535,7 @@
         <w:rPr>
           <w:rStyle w:val="VerbatimChar"/>
         </w:rPr>
-        <w:t xml:space="preserve">figures/main/fig5_discordance_overview.png</w:t>
+        <w:t xml:space="preserve">figures/main/fig5_discordance_overview.pdf</w:t>
       </w:r>
       <w:r>
         <w:t xml:space="preserve">).</w:t>
@@ -9571,8 +10118,8 @@
         </w:pict>
       </w:r>
     </w:p>
-    <w:bookmarkEnd w:id="32"/>
-    <w:bookmarkStart w:id="36" w:name="supplementary-information"/>
+    <w:bookmarkEnd w:id="36"/>
+    <w:bookmarkStart w:id="40" w:name="supplementary-information"/>
     <w:p>
       <w:pPr>
         <w:pStyle w:val="Heading2"/>
@@ -9581,7 +10128,7 @@
         <w:t xml:space="preserve">Supplementary Information</w:t>
       </w:r>
     </w:p>
-    <w:bookmarkStart w:id="33" w:name="supplementary-notes"/>
+    <w:bookmarkStart w:id="37" w:name="supplementary-notes"/>
     <w:p>
       <w:pPr>
         <w:pStyle w:val="Heading3"/>
@@ -9673,8 +10220,8 @@
         <w:t xml:space="preserve">).</w:t>
       </w:r>
     </w:p>
-    <w:bookmarkEnd w:id="33"/>
-    <w:bookmarkStart w:id="34" w:name="supplementary-tables"/>
+    <w:bookmarkEnd w:id="37"/>
+    <w:bookmarkStart w:id="38" w:name="supplementary-tables"/>
     <w:p>
       <w:pPr>
         <w:pStyle w:val="Heading3"/>
@@ -9993,1152 +10540,8 @@
         <w:t xml:space="preserve">).</w:t>
       </w:r>
     </w:p>
-    <w:p>
-      <w:pPr>
-        <w:pStyle w:val="FirstParagraph"/>
-      </w:pPr>
-      <w:r>
-        <w:rPr>
-          <w:b/>
-          <w:bCs/>
-        </w:rPr>
-        <w:t xml:space="preserve">Supplementary Table 2.</w:t>
-      </w:r>
-      <w:r>
-        <w:t xml:space="preserve"> </w:t>
-      </w:r>
-      <w:r>
-        <w:t xml:space="preserve">Runtime scaling across panel sizes. Wall times are</w:t>
-      </w:r>
-      <w:r>
-        <w:t xml:space="preserve"> </w:t>
-      </w:r>
-      <w:r>
-        <w:t xml:space="preserve">means of three replicates on the HPC (16 cores for skani/dnadiff/SynTracker).</w:t>
-      </w:r>
-      <w:r>
-        <w:t xml:space="preserve"> </w:t>
-      </w:r>
-      <w:r>
-        <w:t xml:space="preserve">Per-pair times are per unique unordered pair C(n,2); the benchmark recorded</w:t>
-      </w:r>
-      <w:r>
-        <w:t xml:space="preserve"> </w:t>
-      </w:r>
-      <w:r>
-        <w:t xml:space="preserve">n² ordered (self-plus-reciprocal) comparisons.</w:t>
-      </w:r>
-    </w:p>
-    <w:tbl>
-      <w:tblPr>
-        <w:tblStyle w:val="Table"/>
-        <w:tblW w:type="pct" w:w="5000"/>
-        <w:tblLayout w:type="fixed"/>
-        <w:tblLook w:firstRow="1" w:lastRow="0" w:firstColumn="0" w:lastColumn="0" w:noHBand="0" w:noVBand="0" w:val="0020"/>
-      </w:tblPr>
-      <w:tblGrid>
-        <w:gridCol w:w="678"/>
-        <w:gridCol w:w="905"/>
-        <w:gridCol w:w="905"/>
-        <w:gridCol w:w="905"/>
-        <w:gridCol w:w="905"/>
-        <w:gridCol w:w="905"/>
-        <w:gridCol w:w="905"/>
-        <w:gridCol w:w="905"/>
-        <w:gridCol w:w="905"/>
-      </w:tblGrid>
-      <w:tr>
-        <w:trPr>
-          <w:tblHeader w:val="on"/>
-        </w:trPr>
-        <w:tc>
-          <w:tcPr/>
-          <w:p>
-            <w:pPr>
-              <w:pStyle w:val="Compact"/>
-            </w:pPr>
-            <w:r>
-              <w:t xml:space="preserve">n genomes</w:t>
-            </w:r>
-          </w:p>
-        </w:tc>
-        <w:tc>
-          <w:tcPr/>
-          <w:p>
-            <w:pPr>
-              <w:pStyle w:val="Compact"/>
-              <w:jc w:val="right"/>
-            </w:pPr>
-            <w:r>
-              <w:t xml:space="preserve">n unique pairs</w:t>
-            </w:r>
-          </w:p>
-        </w:tc>
-        <w:tc>
-          <w:tcPr/>
-          <w:p>
-            <w:pPr>
-              <w:pStyle w:val="Compact"/>
-              <w:jc w:val="right"/>
-            </w:pPr>
-            <w:r>
-              <w:t xml:space="preserve">Syn2b (ms/pair)</w:t>
-            </w:r>
-          </w:p>
-        </w:tc>
-        <w:tc>
-          <w:tcPr/>
-          <w:p>
-            <w:pPr>
-              <w:pStyle w:val="Compact"/>
-              <w:jc w:val="right"/>
-            </w:pPr>
-            <w:r>
-              <w:t xml:space="preserve">skani (ms/pair)</w:t>
-            </w:r>
-          </w:p>
-        </w:tc>
-        <w:tc>
-          <w:tcPr/>
-          <w:p>
-            <w:pPr>
-              <w:pStyle w:val="Compact"/>
-              <w:jc w:val="right"/>
-            </w:pPr>
-            <w:r>
-              <w:t xml:space="preserve">dnadiff (s/pair)</w:t>
-            </w:r>
-          </w:p>
-        </w:tc>
-        <w:tc>
-          <w:tcPr/>
-          <w:p>
-            <w:pPr>
-              <w:pStyle w:val="Compact"/>
-              <w:jc w:val="right"/>
-            </w:pPr>
-            <w:r>
-              <w:t xml:space="preserve">skani+dnadiff (s/pair)</w:t>
-            </w:r>
-          </w:p>
-        </w:tc>
-        <w:tc>
-          <w:tcPr/>
-          <w:p>
-            <w:pPr>
-              <w:pStyle w:val="Compact"/>
-              <w:jc w:val="right"/>
-            </w:pPr>
-            <w:r>
-              <w:t xml:space="preserve">SynTracker (s/pair)</w:t>
-            </w:r>
-          </w:p>
-        </w:tc>
-        <w:tc>
-          <w:tcPr/>
-          <w:p>
-            <w:pPr>
-              <w:pStyle w:val="Compact"/>
-              <w:jc w:val="right"/>
-            </w:pPr>
-            <w:r>
-              <w:t xml:space="preserve">Syn2b speedup vs skani+dnadiff</w:t>
-            </w:r>
-          </w:p>
-        </w:tc>
-        <w:tc>
-          <w:tcPr/>
-          <w:p>
-            <w:pPr>
-              <w:pStyle w:val="Compact"/>
-              <w:jc w:val="right"/>
-            </w:pPr>
-            <w:r>
-              <w:t xml:space="preserve">Syn2b speedup vs SynTracker</w:t>
-            </w:r>
-          </w:p>
-        </w:tc>
-      </w:tr>
-      <w:tr>
-        <w:tc>
-          <w:tcPr/>
-          <w:p>
-            <w:pPr>
-              <w:pStyle w:val="Compact"/>
-            </w:pPr>
-            <w:r>
-              <w:t xml:space="preserve">2</w:t>
-            </w:r>
-          </w:p>
-        </w:tc>
-        <w:tc>
-          <w:tcPr/>
-          <w:p>
-            <w:pPr>
-              <w:pStyle w:val="Compact"/>
-              <w:jc w:val="right"/>
-            </w:pPr>
-            <w:r>
-              <w:t xml:space="preserve">1</w:t>
-            </w:r>
-          </w:p>
-        </w:tc>
-        <w:tc>
-          <w:tcPr/>
-          <w:p>
-            <w:pPr>
-              <w:pStyle w:val="Compact"/>
-              <w:jc w:val="right"/>
-            </w:pPr>
-            <w:r>
-              <w:t xml:space="preserve">515.7</w:t>
-            </w:r>
-          </w:p>
-        </w:tc>
-        <w:tc>
-          <w:tcPr/>
-          <w:p>
-            <w:pPr>
-              <w:pStyle w:val="Compact"/>
-              <w:jc w:val="right"/>
-            </w:pPr>
-            <w:r>
-              <w:t xml:space="preserve">167.7</w:t>
-            </w:r>
-          </w:p>
-        </w:tc>
-        <w:tc>
-          <w:tcPr/>
-          <w:p>
-            <w:pPr>
-              <w:pStyle w:val="Compact"/>
-              <w:jc w:val="right"/>
-            </w:pPr>
-            <w:r>
-              <w:t xml:space="preserve">19.63</w:t>
-            </w:r>
-          </w:p>
-        </w:tc>
-        <w:tc>
-          <w:tcPr/>
-          <w:p>
-            <w:pPr>
-              <w:pStyle w:val="Compact"/>
-              <w:jc w:val="right"/>
-            </w:pPr>
-            <w:r>
-              <w:t xml:space="preserve">19.80</w:t>
-            </w:r>
-          </w:p>
-        </w:tc>
-        <w:tc>
-          <w:tcPr/>
-          <w:p>
-            <w:pPr>
-              <w:pStyle w:val="Compact"/>
-              <w:jc w:val="right"/>
-            </w:pPr>
-            <w:r>
-              <w:t xml:space="preserve">4,467.0</w:t>
-            </w:r>
-          </w:p>
-        </w:tc>
-        <w:tc>
-          <w:tcPr/>
-          <w:p>
-            <w:pPr>
-              <w:pStyle w:val="Compact"/>
-              <w:jc w:val="right"/>
-            </w:pPr>
-            <w:r>
-              <w:t xml:space="preserve">38x</w:t>
-            </w:r>
-          </w:p>
-        </w:tc>
-        <w:tc>
-          <w:tcPr/>
-          <w:p>
-            <w:pPr>
-              <w:pStyle w:val="Compact"/>
-              <w:jc w:val="right"/>
-            </w:pPr>
-            <w:r>
-              <w:t xml:space="preserve">8,663x</w:t>
-            </w:r>
-          </w:p>
-        </w:tc>
-      </w:tr>
-      <w:tr>
-        <w:tc>
-          <w:tcPr/>
-          <w:p>
-            <w:pPr>
-              <w:pStyle w:val="Compact"/>
-            </w:pPr>
-            <w:r>
-              <w:t xml:space="preserve">5</w:t>
-            </w:r>
-          </w:p>
-        </w:tc>
-        <w:tc>
-          <w:tcPr/>
-          <w:p>
-            <w:pPr>
-              <w:pStyle w:val="Compact"/>
-              <w:jc w:val="right"/>
-            </w:pPr>
-            <w:r>
-              <w:t xml:space="preserve">10</w:t>
-            </w:r>
-          </w:p>
-        </w:tc>
-        <w:tc>
-          <w:tcPr/>
-          <w:p>
-            <w:pPr>
-              <w:pStyle w:val="Compact"/>
-              <w:jc w:val="right"/>
-            </w:pPr>
-            <w:r>
-              <w:t xml:space="preserve">39.8</w:t>
-            </w:r>
-          </w:p>
-        </w:tc>
-        <w:tc>
-          <w:tcPr/>
-          <w:p>
-            <w:pPr>
-              <w:pStyle w:val="Compact"/>
-              <w:jc w:val="right"/>
-            </w:pPr>
-            <w:r>
-              <w:t xml:space="preserve">14.8</w:t>
-            </w:r>
-          </w:p>
-        </w:tc>
-        <w:tc>
-          <w:tcPr/>
-          <w:p>
-            <w:pPr>
-              <w:pStyle w:val="Compact"/>
-              <w:jc w:val="right"/>
-            </w:pPr>
-            <w:r>
-              <w:t xml:space="preserve">4.04</w:t>
-            </w:r>
-          </w:p>
-        </w:tc>
-        <w:tc>
-          <w:tcPr/>
-          <w:p>
-            <w:pPr>
-              <w:pStyle w:val="Compact"/>
-              <w:jc w:val="right"/>
-            </w:pPr>
-            <w:r>
-              <w:t xml:space="preserve">4.06</w:t>
-            </w:r>
-          </w:p>
-        </w:tc>
-        <w:tc>
-          <w:tcPr/>
-          <w:p>
-            <w:pPr>
-              <w:pStyle w:val="Compact"/>
-              <w:jc w:val="right"/>
-            </w:pPr>
-            <w:r>
-              <w:t xml:space="preserve">1,871.0</w:t>
-            </w:r>
-          </w:p>
-        </w:tc>
-        <w:tc>
-          <w:tcPr/>
-          <w:p>
-            <w:pPr>
-              <w:pStyle w:val="Compact"/>
-              <w:jc w:val="right"/>
-            </w:pPr>
-            <w:r>
-              <w:t xml:space="preserve">102x</w:t>
-            </w:r>
-          </w:p>
-        </w:tc>
-        <w:tc>
-          <w:tcPr/>
-          <w:p>
-            <w:pPr>
-              <w:pStyle w:val="Compact"/>
-              <w:jc w:val="right"/>
-            </w:pPr>
-            <w:r>
-              <w:t xml:space="preserve">46,971x</w:t>
-            </w:r>
-          </w:p>
-        </w:tc>
-      </w:tr>
-      <w:tr>
-        <w:tc>
-          <w:tcPr/>
-          <w:p>
-            <w:pPr>
-              <w:pStyle w:val="Compact"/>
-            </w:pPr>
-            <w:r>
-              <w:t xml:space="preserve">10</w:t>
-            </w:r>
-          </w:p>
-        </w:tc>
-        <w:tc>
-          <w:tcPr/>
-          <w:p>
-            <w:pPr>
-              <w:pStyle w:val="Compact"/>
-              <w:jc w:val="right"/>
-            </w:pPr>
-            <w:r>
-              <w:t xml:space="preserve">45</w:t>
-            </w:r>
-          </w:p>
-        </w:tc>
-        <w:tc>
-          <w:tcPr/>
-          <w:p>
-            <w:pPr>
-              <w:pStyle w:val="Compact"/>
-              <w:jc w:val="right"/>
-            </w:pPr>
-            <w:r>
-              <w:t xml:space="preserve">23.2</w:t>
-            </w:r>
-          </w:p>
-        </w:tc>
-        <w:tc>
-          <w:tcPr/>
-          <w:p>
-            <w:pPr>
-              <w:pStyle w:val="Compact"/>
-              <w:jc w:val="right"/>
-            </w:pPr>
-            <w:r>
-              <w:t xml:space="preserve">6.6</w:t>
-            </w:r>
-          </w:p>
-        </w:tc>
-        <w:tc>
-          <w:tcPr/>
-          <w:p>
-            <w:pPr>
-              <w:pStyle w:val="Compact"/>
-              <w:jc w:val="right"/>
-            </w:pPr>
-            <w:r>
-              <w:t xml:space="preserve">5.83</w:t>
-            </w:r>
-          </w:p>
-        </w:tc>
-        <w:tc>
-          <w:tcPr/>
-          <w:p>
-            <w:pPr>
-              <w:pStyle w:val="Compact"/>
-              <w:jc w:val="right"/>
-            </w:pPr>
-            <w:r>
-              <w:t xml:space="preserve">5.83</w:t>
-            </w:r>
-          </w:p>
-        </w:tc>
-        <w:tc>
-          <w:tcPr/>
-          <w:p>
-            <w:pPr>
-              <w:pStyle w:val="Compact"/>
-              <w:jc w:val="right"/>
-            </w:pPr>
-            <w:r>
-              <w:t xml:space="preserve">863.2</w:t>
-            </w:r>
-          </w:p>
-        </w:tc>
-        <w:tc>
-          <w:tcPr/>
-          <w:p>
-            <w:pPr>
-              <w:pStyle w:val="Compact"/>
-              <w:jc w:val="right"/>
-            </w:pPr>
-            <w:r>
-              <w:t xml:space="preserve">251x</w:t>
-            </w:r>
-          </w:p>
-        </w:tc>
-        <w:tc>
-          <w:tcPr/>
-          <w:p>
-            <w:pPr>
-              <w:pStyle w:val="Compact"/>
-              <w:jc w:val="right"/>
-            </w:pPr>
-            <w:r>
-              <w:t xml:space="preserve">37,171x</w:t>
-            </w:r>
-          </w:p>
-        </w:tc>
-      </w:tr>
-      <w:tr>
-        <w:tc>
-          <w:tcPr/>
-          <w:p>
-            <w:pPr>
-              <w:pStyle w:val="Compact"/>
-            </w:pPr>
-            <w:r>
-              <w:t xml:space="preserve">15</w:t>
-            </w:r>
-          </w:p>
-        </w:tc>
-        <w:tc>
-          <w:tcPr/>
-          <w:p>
-            <w:pPr>
-              <w:pStyle w:val="Compact"/>
-              <w:jc w:val="right"/>
-            </w:pPr>
-            <w:r>
-              <w:t xml:space="preserve">105</w:t>
-            </w:r>
-          </w:p>
-        </w:tc>
-        <w:tc>
-          <w:tcPr/>
-          <w:p>
-            <w:pPr>
-              <w:pStyle w:val="Compact"/>
-              <w:jc w:val="right"/>
-            </w:pPr>
-            <w:r>
-              <w:t xml:space="preserve">22.0</w:t>
-            </w:r>
-          </w:p>
-        </w:tc>
-        <w:tc>
-          <w:tcPr/>
-          <w:p>
-            <w:pPr>
-              <w:pStyle w:val="Compact"/>
-              <w:jc w:val="right"/>
-            </w:pPr>
-            <w:r>
-              <w:t xml:space="preserve">4.9</w:t>
-            </w:r>
-          </w:p>
-        </w:tc>
-        <w:tc>
-          <w:tcPr/>
-          <w:p>
-            <w:pPr>
-              <w:pStyle w:val="Compact"/>
-              <w:jc w:val="right"/>
-            </w:pPr>
-            <w:r>
-              <w:t xml:space="preserve">15.03</w:t>
-            </w:r>
-          </w:p>
-        </w:tc>
-        <w:tc>
-          <w:tcPr/>
-          <w:p>
-            <w:pPr>
-              <w:pStyle w:val="Compact"/>
-              <w:jc w:val="right"/>
-            </w:pPr>
-            <w:r>
-              <w:t xml:space="preserve">15.04</w:t>
-            </w:r>
-          </w:p>
-        </w:tc>
-        <w:tc>
-          <w:tcPr/>
-          <w:p>
-            <w:pPr>
-              <w:pStyle w:val="Compact"/>
-              <w:jc w:val="right"/>
-            </w:pPr>
-            <w:r>
-              <w:t xml:space="preserve">n.d.</w:t>
-            </w:r>
-          </w:p>
-        </w:tc>
-        <w:tc>
-          <w:tcPr/>
-          <w:p>
-            <w:pPr>
-              <w:pStyle w:val="Compact"/>
-              <w:jc w:val="right"/>
-            </w:pPr>
-            <w:r>
-              <w:t xml:space="preserve">684x</w:t>
-            </w:r>
-          </w:p>
-        </w:tc>
-        <w:tc>
-          <w:tcPr/>
-          <w:p>
-            <w:pPr>
-              <w:pStyle w:val="Compact"/>
-              <w:jc w:val="right"/>
-            </w:pPr>
-            <w:r>
-              <w:t xml:space="preserve">n.d.</w:t>
-            </w:r>
-          </w:p>
-        </w:tc>
-      </w:tr>
-      <w:tr>
-        <w:tc>
-          <w:tcPr/>
-          <w:p>
-            <w:pPr>
-              <w:pStyle w:val="Compact"/>
-            </w:pPr>
-            <w:r>
-              <w:t xml:space="preserve">22</w:t>
-            </w:r>
-          </w:p>
-        </w:tc>
-        <w:tc>
-          <w:tcPr/>
-          <w:p>
-            <w:pPr>
-              <w:pStyle w:val="Compact"/>
-              <w:jc w:val="right"/>
-            </w:pPr>
-            <w:r>
-              <w:t xml:space="preserve">231</w:t>
-            </w:r>
-          </w:p>
-        </w:tc>
-        <w:tc>
-          <w:tcPr/>
-          <w:p>
-            <w:pPr>
-              <w:pStyle w:val="Compact"/>
-              <w:jc w:val="right"/>
-            </w:pPr>
-            <w:r>
-              <w:t xml:space="preserve">18.9</w:t>
-            </w:r>
-          </w:p>
-        </w:tc>
-        <w:tc>
-          <w:tcPr/>
-          <w:p>
-            <w:pPr>
-              <w:pStyle w:val="Compact"/>
-              <w:jc w:val="right"/>
-            </w:pPr>
-            <w:r>
-              <w:t xml:space="preserve">2.3</w:t>
-            </w:r>
-          </w:p>
-        </w:tc>
-        <w:tc>
-          <w:tcPr/>
-          <w:p>
-            <w:pPr>
-              <w:pStyle w:val="Compact"/>
-              <w:jc w:val="right"/>
-            </w:pPr>
-            <w:r>
-              <w:t xml:space="preserve">7.98</w:t>
-            </w:r>
-          </w:p>
-        </w:tc>
-        <w:tc>
-          <w:tcPr/>
-          <w:p>
-            <w:pPr>
-              <w:pStyle w:val="Compact"/>
-              <w:jc w:val="right"/>
-            </w:pPr>
-            <w:r>
-              <w:t xml:space="preserve">7.98</w:t>
-            </w:r>
-          </w:p>
-        </w:tc>
-        <w:tc>
-          <w:tcPr/>
-          <w:p>
-            <w:pPr>
-              <w:pStyle w:val="Compact"/>
-              <w:jc w:val="right"/>
-            </w:pPr>
-            <w:r>
-              <w:t xml:space="preserve">282.1</w:t>
-            </w:r>
-          </w:p>
-        </w:tc>
-        <w:tc>
-          <w:tcPr/>
-          <w:p>
-            <w:pPr>
-              <w:pStyle w:val="Compact"/>
-              <w:jc w:val="right"/>
-            </w:pPr>
-            <w:r>
-              <w:t xml:space="preserve">423x</w:t>
-            </w:r>
-          </w:p>
-        </w:tc>
-        <w:tc>
-          <w:tcPr/>
-          <w:p>
-            <w:pPr>
-              <w:pStyle w:val="Compact"/>
-              <w:jc w:val="right"/>
-            </w:pPr>
-            <w:r>
-              <w:t xml:space="preserve">14,947x</w:t>
-            </w:r>
-          </w:p>
-        </w:tc>
-      </w:tr>
-    </w:tbl>
-    <w:p>
-      <w:pPr>
-        <w:pStyle w:val="BodyText"/>
-      </w:pPr>
-      <w:r>
-        <w:rPr>
-          <w:b/>
-          <w:bCs/>
-        </w:rPr>
-        <w:t xml:space="preserve">Supplementary Table 4.</w:t>
-      </w:r>
-      <w:r>
-        <w:t xml:space="preserve"> </w:t>
-      </w:r>
-      <w:r>
-        <w:t xml:space="preserve">Head-to-head runtime on the 22-genome panel</w:t>
-      </w:r>
-      <w:r>
-        <w:t xml:space="preserve"> </w:t>
-      </w:r>
-      <w:r>
-        <w:t xml:space="preserve">(231 unique pairs; mean of three replicates, SynTracker single run). Syn2b</w:t>
-      </w:r>
-      <w:r>
-        <w:t xml:space="preserve"> </w:t>
-      </w:r>
-      <w:r>
-        <w:t xml:space="preserve">reports structural metrics only; the companion tool Syn2bANI reuses the same</w:t>
-      </w:r>
-      <w:r>
-        <w:t xml:space="preserve"> </w:t>
-      </w:r>
-      <w:r>
-        <w:t xml:space="preserve">tag framework to report ANI together with structural metrics. SynTracker was</w:t>
-      </w:r>
-      <w:r>
-        <w:t xml:space="preserve"> </w:t>
-      </w:r>
-      <w:r>
-        <w:t xml:space="preserve">run with its default pipeline on 16 cores; its output (average pairwise</w:t>
-      </w:r>
-      <w:r>
-        <w:t xml:space="preserve"> </w:t>
-      </w:r>
-      <w:r>
-        <w:t xml:space="preserve">synteny score over gene blocks) differs in content from Syn2b’s junction and</w:t>
-      </w:r>
-      <w:r>
-        <w:t xml:space="preserve"> </w:t>
-      </w:r>
-      <w:r>
-        <w:t xml:space="preserve">ratio metrics, so the comparison is of workflows rather than identical</w:t>
-      </w:r>
-      <w:r>
-        <w:t xml:space="preserve"> </w:t>
-      </w:r>
-      <w:r>
-        <w:t xml:space="preserve">quantities.</w:t>
-      </w:r>
-    </w:p>
-    <w:tbl>
-      <w:tblPr>
-        <w:tblStyle w:val="Table"/>
-        <w:tblW w:type="pct" w:w="5000"/>
-        <w:tblLayout w:type="fixed"/>
-        <w:tblLook w:firstRow="1" w:lastRow="0" w:firstColumn="0" w:lastColumn="0" w:noHBand="0" w:noVBand="0" w:val="0020"/>
-      </w:tblPr>
-      <w:tblGrid>
-        <w:gridCol w:w="1397"/>
-        <w:gridCol w:w="1863"/>
-        <w:gridCol w:w="1863"/>
-        <w:gridCol w:w="1397"/>
-        <w:gridCol w:w="1397"/>
-      </w:tblGrid>
-      <w:tr>
-        <w:trPr>
-          <w:tblHeader w:val="on"/>
-        </w:trPr>
-        <w:tc>
-          <w:tcPr/>
-          <w:p>
-            <w:pPr>
-              <w:pStyle w:val="Compact"/>
-            </w:pPr>
-            <w:r>
-              <w:t xml:space="preserve">tool</w:t>
-            </w:r>
-          </w:p>
-        </w:tc>
-        <w:tc>
-          <w:tcPr/>
-          <w:p>
-            <w:pPr>
-              <w:pStyle w:val="Compact"/>
-              <w:jc w:val="right"/>
-            </w:pPr>
-            <w:r>
-              <w:t xml:space="preserve">wall time (s)</w:t>
-            </w:r>
-          </w:p>
-        </w:tc>
-        <w:tc>
-          <w:tcPr/>
-          <w:p>
-            <w:pPr>
-              <w:pStyle w:val="Compact"/>
-              <w:jc w:val="right"/>
-            </w:pPr>
-            <w:r>
-              <w:t xml:space="preserve">per unique pair (s)</w:t>
-            </w:r>
-          </w:p>
-        </w:tc>
-        <w:tc>
-          <w:tcPr/>
-          <w:p>
-            <w:pPr>
-              <w:pStyle w:val="Compact"/>
-            </w:pPr>
-            <w:r>
-              <w:t xml:space="preserve">reports ANI</w:t>
-            </w:r>
-          </w:p>
-        </w:tc>
-        <w:tc>
-          <w:tcPr/>
-          <w:p>
-            <w:pPr>
-              <w:pStyle w:val="Compact"/>
-            </w:pPr>
-            <w:r>
-              <w:t xml:space="preserve">reports SV</w:t>
-            </w:r>
-          </w:p>
-        </w:tc>
-      </w:tr>
-      <w:tr>
-        <w:tc>
-          <w:tcPr/>
-          <w:p>
-            <w:pPr>
-              <w:pStyle w:val="Compact"/>
-            </w:pPr>
-            <w:r>
-              <w:t xml:space="preserve">Syn2b</w:t>
-            </w:r>
-          </w:p>
-        </w:tc>
-        <w:tc>
-          <w:tcPr/>
-          <w:p>
-            <w:pPr>
-              <w:pStyle w:val="Compact"/>
-              <w:jc w:val="right"/>
-            </w:pPr>
-            <w:r>
-              <w:t xml:space="preserve">4.4</w:t>
-            </w:r>
-          </w:p>
-        </w:tc>
-        <w:tc>
-          <w:tcPr/>
-          <w:p>
-            <w:pPr>
-              <w:pStyle w:val="Compact"/>
-              <w:jc w:val="right"/>
-            </w:pPr>
-            <w:r>
-              <w:t xml:space="preserve">0.019</w:t>
-            </w:r>
-          </w:p>
-        </w:tc>
-        <w:tc>
-          <w:tcPr/>
-          <w:p>
-            <w:pPr>
-              <w:pStyle w:val="Compact"/>
-            </w:pPr>
-            <w:r>
-              <w:t xml:space="preserve">no</w:t>
-            </w:r>
-          </w:p>
-        </w:tc>
-        <w:tc>
-          <w:tcPr/>
-          <w:p>
-            <w:pPr>
-              <w:pStyle w:val="Compact"/>
-            </w:pPr>
-            <w:r>
-              <w:t xml:space="preserve">yes (inverted fraction, junctions)</w:t>
-            </w:r>
-          </w:p>
-        </w:tc>
-      </w:tr>
-      <w:tr>
-        <w:tc>
-          <w:tcPr/>
-          <w:p>
-            <w:pPr>
-              <w:pStyle w:val="Compact"/>
-            </w:pPr>
-            <w:r>
-              <w:t xml:space="preserve">skani</w:t>
-            </w:r>
-          </w:p>
-        </w:tc>
-        <w:tc>
-          <w:tcPr/>
-          <w:p>
-            <w:pPr>
-              <w:pStyle w:val="Compact"/>
-              <w:jc w:val="right"/>
-            </w:pPr>
-            <w:r>
-              <w:t xml:space="preserve">0.5</w:t>
-            </w:r>
-          </w:p>
-        </w:tc>
-        <w:tc>
-          <w:tcPr/>
-          <w:p>
-            <w:pPr>
-              <w:pStyle w:val="Compact"/>
-              <w:jc w:val="right"/>
-            </w:pPr>
-            <w:r>
-              <w:t xml:space="preserve">0.002</w:t>
-            </w:r>
-          </w:p>
-        </w:tc>
-        <w:tc>
-          <w:tcPr/>
-          <w:p>
-            <w:pPr>
-              <w:pStyle w:val="Compact"/>
-            </w:pPr>
-            <w:r>
-              <w:t xml:space="preserve">yes</w:t>
-            </w:r>
-          </w:p>
-        </w:tc>
-        <w:tc>
-          <w:tcPr/>
-          <w:p>
-            <w:pPr>
-              <w:pStyle w:val="Compact"/>
-            </w:pPr>
-            <w:r>
-              <w:t xml:space="preserve">no</w:t>
-            </w:r>
-          </w:p>
-        </w:tc>
-      </w:tr>
-      <w:tr>
-        <w:tc>
-          <w:tcPr/>
-          <w:p>
-            <w:pPr>
-              <w:pStyle w:val="Compact"/>
-            </w:pPr>
-            <w:r>
-              <w:t xml:space="preserve">dnadiff (MUMmer)</w:t>
-            </w:r>
-          </w:p>
-        </w:tc>
-        <w:tc>
-          <w:tcPr/>
-          <w:p>
-            <w:pPr>
-              <w:pStyle w:val="Compact"/>
-              <w:jc w:val="right"/>
-            </w:pPr>
-            <w:r>
-              <w:t xml:space="preserve">1,843.9</w:t>
-            </w:r>
-          </w:p>
-        </w:tc>
-        <w:tc>
-          <w:tcPr/>
-          <w:p>
-            <w:pPr>
-              <w:pStyle w:val="Compact"/>
-              <w:jc w:val="right"/>
-            </w:pPr>
-            <w:r>
-              <w:t xml:space="preserve">7.982</w:t>
-            </w:r>
-          </w:p>
-        </w:tc>
-        <w:tc>
-          <w:tcPr/>
-          <w:p>
-            <w:pPr>
-              <w:pStyle w:val="Compact"/>
-            </w:pPr>
-            <w:r>
-              <w:t xml:space="preserve">no</w:t>
-            </w:r>
-          </w:p>
-        </w:tc>
-        <w:tc>
-          <w:tcPr/>
-          <w:p>
-            <w:pPr>
-              <w:pStyle w:val="Compact"/>
-            </w:pPr>
-            <w:r>
-              <w:t xml:space="preserve">yes (alignment-based truth)</w:t>
-            </w:r>
-          </w:p>
-        </w:tc>
-      </w:tr>
-      <w:tr>
-        <w:tc>
-          <w:tcPr/>
-          <w:p>
-            <w:pPr>
-              <w:pStyle w:val="Compact"/>
-            </w:pPr>
-            <w:r>
-              <w:t xml:space="preserve">SynTracker (16 cores)</w:t>
-            </w:r>
-          </w:p>
-        </w:tc>
-        <w:tc>
-          <w:tcPr/>
-          <w:p>
-            <w:pPr>
-              <w:pStyle w:val="Compact"/>
-              <w:jc w:val="right"/>
-            </w:pPr>
-            <w:r>
-              <w:t xml:space="preserve">65,162.0</w:t>
-            </w:r>
-          </w:p>
-        </w:tc>
-        <w:tc>
-          <w:tcPr/>
-          <w:p>
-            <w:pPr>
-              <w:pStyle w:val="Compact"/>
-              <w:jc w:val="right"/>
-            </w:pPr>
-            <w:r>
-              <w:t xml:space="preserve">282.087</w:t>
-            </w:r>
-          </w:p>
-        </w:tc>
-        <w:tc>
-          <w:tcPr/>
-          <w:p>
-            <w:pPr>
-              <w:pStyle w:val="Compact"/>
-            </w:pPr>
-            <w:r>
-              <w:t xml:space="preserve">no</w:t>
-            </w:r>
-          </w:p>
-        </w:tc>
-        <w:tc>
-          <w:tcPr/>
-          <w:p>
-            <w:pPr>
-              <w:pStyle w:val="Compact"/>
-            </w:pPr>
-            <w:r>
-              <w:t xml:space="preserve">yes (gene synteny)</w:t>
-            </w:r>
-          </w:p>
-        </w:tc>
-      </w:tr>
-      <w:tr>
-        <w:tc>
-          <w:tcPr/>
-          <w:p>
-            <w:pPr>
-              <w:pStyle w:val="Compact"/>
-            </w:pPr>
-            <w:r>
-              <w:t xml:space="preserve">skani + dnadiff</w:t>
-            </w:r>
-          </w:p>
-        </w:tc>
-        <w:tc>
-          <w:tcPr/>
-          <w:p>
-            <w:pPr>
-              <w:pStyle w:val="Compact"/>
-              <w:jc w:val="right"/>
-            </w:pPr>
-            <w:r>
-              <w:t xml:space="preserve">1,844.5</w:t>
-            </w:r>
-          </w:p>
-        </w:tc>
-        <w:tc>
-          <w:tcPr/>
-          <w:p>
-            <w:pPr>
-              <w:pStyle w:val="Compact"/>
-              <w:jc w:val="right"/>
-            </w:pPr>
-            <w:r>
-              <w:t xml:space="preserve">7.985</w:t>
-            </w:r>
-          </w:p>
-        </w:tc>
-        <w:tc>
-          <w:tcPr/>
-          <w:p>
-            <w:pPr>
-              <w:pStyle w:val="Compact"/>
-            </w:pPr>
-            <w:r>
-              <w:t xml:space="preserve">yes</w:t>
-            </w:r>
-          </w:p>
-        </w:tc>
-        <w:tc>
-          <w:tcPr/>
-          <w:p>
-            <w:pPr>
-              <w:pStyle w:val="Compact"/>
-            </w:pPr>
-            <w:r>
-              <w:t xml:space="preserve">yes</w:t>
-            </w:r>
-          </w:p>
-        </w:tc>
-      </w:tr>
-    </w:tbl>
-    <w:bookmarkEnd w:id="34"/>
-    <w:bookmarkStart w:id="35" w:name="supplementary-figures"/>
+    <w:bookmarkEnd w:id="38"/>
+    <w:bookmarkStart w:id="39" w:name="supplementary-figures"/>
     <w:p>
       <w:pPr>
         <w:pStyle w:val="Heading3"/>
@@ -11245,7 +10648,7 @@
         <w:rPr>
           <w:rStyle w:val="VerbatimChar"/>
         </w:rPr>
-        <w:t xml:space="preserve">figures/supplementary/fig1_tag_spacing.png</w:t>
+        <w:t xml:space="preserve">figures/supplementary/fig1_tag_spacing.pdf</w:t>
       </w:r>
       <w:r>
         <w:t xml:space="preserve">).</w:t>
@@ -11324,7 +10727,7 @@
         <w:rPr>
           <w:rStyle w:val="VerbatimChar"/>
         </w:rPr>
-        <w:t xml:space="preserve">figures/supplementary/fig2_closed_genome_validation.png</w:t>
+        <w:t xml:space="preserve">figures/supplementary/fig2_closed_genome_validation.pdf</w:t>
       </w:r>
       <w:r>
         <w:t xml:space="preserve">).</w:t>
@@ -11419,7 +10822,7 @@
         <w:rPr>
           <w:rStyle w:val="VerbatimChar"/>
         </w:rPr>
-        <w:t xml:space="preserve">figures/supplementary/fig3_sv_size_sensitivity.png</w:t>
+        <w:t xml:space="preserve">figures/supplementary/fig3_sv_size_sensitivity.pdf</w:t>
       </w:r>
       <w:r>
         <w:t xml:space="preserve">).</w:t>
@@ -11496,7 +10899,7 @@
         <w:rPr>
           <w:rStyle w:val="VerbatimChar"/>
         </w:rPr>
-        <w:t xml:space="preserve">figures/supplementary/fig4_detection_size.png</w:t>
+        <w:t xml:space="preserve">figures/supplementary/fig4_detection_size.pdf</w:t>
       </w:r>
       <w:r>
         <w:t xml:space="preserve">).</w:t>
@@ -11663,7 +11066,98 @@
         <w:rPr>
           <w:rStyle w:val="VerbatimChar"/>
         </w:rPr>
-        <w:t xml:space="preserve">figures/supplementary/fig5_known_biology.png</w:t>
+        <w:t xml:space="preserve">figures/supplementary/fig5_known_biology.pdf</w:t>
+      </w:r>
+      <w:r>
+        <w:t xml:space="preserve">).</w:t>
+      </w:r>
+    </w:p>
+    <w:p>
+      <w:pPr>
+        <w:pStyle w:val="Compact"/>
+        <w:numPr>
+          <w:ilvl w:val="0"/>
+          <w:numId w:val="1006"/>
+        </w:numPr>
+      </w:pPr>
+      <w:r>
+        <w:rPr>
+          <w:b/>
+          <w:bCs/>
+        </w:rPr>
+        <w:t xml:space="preserve">Supplementary Figure 6:</w:t>
+      </w:r>
+      <w:r>
+        <w:t xml:space="preserve"> </w:t>
+      </w:r>
+      <w:r>
+        <w:t xml:space="preserve">Application-scale structural censuses.</w:t>
+      </w:r>
+    </w:p>
+    <w:p>
+      <w:pPr>
+        <w:pStyle w:val="Compact"/>
+        <w:numPr>
+          <w:ilvl w:val="1"/>
+          <w:numId w:val="1008"/>
+        </w:numPr>
+      </w:pPr>
+      <w:r>
+        <w:t xml:space="preserve">Distribution of species-level prevalence of ≥2 landmark-defined</w:t>
+      </w:r>
+      <w:r>
+        <w:t xml:space="preserve"> </w:t>
+      </w:r>
+      <w:r>
+        <w:t xml:space="preserve">breakpoints across 383 GTDB-R207 clusters with ≥1,000 effective pairs.</w:t>
+      </w:r>
+    </w:p>
+    <w:p>
+      <w:pPr>
+        <w:pStyle w:val="Compact"/>
+        <w:numPr>
+          <w:ilvl w:val="1"/>
+          <w:numId w:val="1008"/>
+        </w:numPr>
+      </w:pPr>
+      <w:r>
+        <w:t xml:space="preserve">Distribution across 367 HROM clusters with ≥1,000 pairs.</w:t>
+      </w:r>
+    </w:p>
+    <w:p>
+      <w:pPr>
+        <w:pStyle w:val="Compact"/>
+        <w:numPr>
+          <w:ilvl w:val="1"/>
+          <w:numId w:val="1008"/>
+        </w:numPr>
+      </w:pPr>
+      <w:r>
+        <w:t xml:space="preserve">HROM prevalence by skani ANI bin. The GTDB and HROM censuses show wide</w:t>
+      </w:r>
+      <w:r>
+        <w:t xml:space="preserve"> </w:t>
+      </w:r>
+      <w:r>
+        <w:t xml:space="preserve">taxon-specific variation but differ in overall prevalence because of different</w:t>
+      </w:r>
+      <w:r>
+        <w:t xml:space="preserve"> </w:t>
+      </w:r>
+      <w:r>
+        <w:t xml:space="preserve">catalogues, assemblies, clustering, and quality structure</w:t>
+      </w:r>
+      <w:r>
+        <w:t xml:space="preserve"> </w:t>
+      </w:r>
+      <w:r>
+        <w:t xml:space="preserve">(</w:t>
+      </w:r>
+      <w:r>
+        <w:rPr>
+          <w:rStyle w:val="VerbatimChar"/>
+        </w:rPr>
+        <w:t xml:space="preserve">figures/supplementary/fig6_structural_censuses.pdf</w:t>
       </w:r>
       <w:r>
         <w:t xml:space="preserve">).</w:t>
@@ -11676,75 +11170,75 @@
         </w:pict>
       </w:r>
     </w:p>
-    <w:bookmarkEnd w:id="35"/>
-    <w:bookmarkEnd w:id="36"/>
-    <w:bookmarkStart w:id="37" w:name="acknowledgements"/>
-    <w:p>
-      <w:pPr>
-        <w:pStyle w:val="Heading2"/>
-      </w:pPr>
-      <w:r>
-        <w:t xml:space="preserve">Acknowledgements</w:t>
-      </w:r>
-    </w:p>
-    <w:p>
-      <w:pPr>
-        <w:pStyle w:val="FirstParagraph"/>
-      </w:pPr>
-      <w:r>
-        <w:t xml:space="preserve">Funding information to be added.</w:t>
-      </w:r>
-    </w:p>
-    <w:bookmarkEnd w:id="37"/>
-    <w:bookmarkStart w:id="38" w:name="author-contributions"/>
-    <w:p>
-      <w:pPr>
-        <w:pStyle w:val="Heading2"/>
-      </w:pPr>
-      <w:r>
-        <w:t xml:space="preserve">Author contributions</w:t>
-      </w:r>
-    </w:p>
-    <w:p>
-      <w:pPr>
-        <w:pStyle w:val="FirstParagraph"/>
-      </w:pPr>
-      <w:r>
-        <w:t xml:space="preserve">S.H. conceived the study. S.H. and Y.Z. developed the method, performed</w:t>
-      </w:r>
-      <w:r>
-        <w:t xml:space="preserve"> </w:t>
-      </w:r>
-      <w:r>
-        <w:t xml:space="preserve">benchmarking, and wrote the manuscript. All authors read and approved the final</w:t>
-      </w:r>
-      <w:r>
-        <w:t xml:space="preserve"> </w:t>
-      </w:r>
-      <w:r>
-        <w:t xml:space="preserve">manuscript.</w:t>
-      </w:r>
-    </w:p>
-    <w:bookmarkEnd w:id="38"/>
-    <w:bookmarkStart w:id="39" w:name="competing-interests"/>
-    <w:p>
-      <w:pPr>
-        <w:pStyle w:val="Heading2"/>
-      </w:pPr>
-      <w:r>
-        <w:t xml:space="preserve">Competing interests</w:t>
-      </w:r>
-    </w:p>
-    <w:p>
-      <w:pPr>
-        <w:pStyle w:val="FirstParagraph"/>
-      </w:pPr>
-      <w:r>
-        <w:t xml:space="preserve">The authors declare no competing interests.</w:t>
-      </w:r>
-    </w:p>
     <w:bookmarkEnd w:id="39"/>
     <w:bookmarkEnd w:id="40"/>
+    <w:bookmarkStart w:id="41" w:name="acknowledgements"/>
+    <w:p>
+      <w:pPr>
+        <w:pStyle w:val="Heading2"/>
+      </w:pPr>
+      <w:r>
+        <w:t xml:space="preserve">Acknowledgements</w:t>
+      </w:r>
+    </w:p>
+    <w:p>
+      <w:pPr>
+        <w:pStyle w:val="FirstParagraph"/>
+      </w:pPr>
+      <w:r>
+        <w:t xml:space="preserve">Funding information to be added.</w:t>
+      </w:r>
+    </w:p>
+    <w:bookmarkEnd w:id="41"/>
+    <w:bookmarkStart w:id="42" w:name="author-contributions"/>
+    <w:p>
+      <w:pPr>
+        <w:pStyle w:val="Heading2"/>
+      </w:pPr>
+      <w:r>
+        <w:t xml:space="preserve">Author contributions</w:t>
+      </w:r>
+    </w:p>
+    <w:p>
+      <w:pPr>
+        <w:pStyle w:val="FirstParagraph"/>
+      </w:pPr>
+      <w:r>
+        <w:t xml:space="preserve">S.H. conceived the study. S.H. and Y.Z. developed the method, performed</w:t>
+      </w:r>
+      <w:r>
+        <w:t xml:space="preserve"> </w:t>
+      </w:r>
+      <w:r>
+        <w:t xml:space="preserve">benchmarking, and wrote the manuscript. All authors read and approved the final</w:t>
+      </w:r>
+      <w:r>
+        <w:t xml:space="preserve"> </w:t>
+      </w:r>
+      <w:r>
+        <w:t xml:space="preserve">manuscript.</w:t>
+      </w:r>
+    </w:p>
+    <w:bookmarkEnd w:id="42"/>
+    <w:bookmarkStart w:id="43" w:name="competing-interests"/>
+    <w:p>
+      <w:pPr>
+        <w:pStyle w:val="Heading2"/>
+      </w:pPr>
+      <w:r>
+        <w:t xml:space="preserve">Competing interests</w:t>
+      </w:r>
+    </w:p>
+    <w:p>
+      <w:pPr>
+        <w:pStyle w:val="FirstParagraph"/>
+      </w:pPr>
+      <w:r>
+        <w:t xml:space="preserve">The authors declare no competing interests.</w:t>
+      </w:r>
+    </w:p>
+    <w:bookmarkEnd w:id="43"/>
+    <w:bookmarkEnd w:id="44"/>
     <w:sectPr>
       <w:footnotePr>
         <w:numRestart w:val="eachSect"/>
@@ -12231,6 +11725,36 @@
     <w:abstractNumId w:val="991"/>
   </w:num>
   <w:num w:numId="1007">
+    <w:abstractNumId w:val="99731"/>
+    <w:lvlOverride w:ilvl="0">
+      <w:startOverride w:val="1"/>
+    </w:lvlOverride>
+    <w:lvlOverride w:ilvl="1">
+      <w:startOverride w:val="1"/>
+    </w:lvlOverride>
+    <w:lvlOverride w:ilvl="2">
+      <w:startOverride w:val="1"/>
+    </w:lvlOverride>
+    <w:lvlOverride w:ilvl="3">
+      <w:startOverride w:val="1"/>
+    </w:lvlOverride>
+    <w:lvlOverride w:ilvl="4">
+      <w:startOverride w:val="1"/>
+    </w:lvlOverride>
+    <w:lvlOverride w:ilvl="5">
+      <w:startOverride w:val="1"/>
+    </w:lvlOverride>
+    <w:lvlOverride w:ilvl="6">
+      <w:startOverride w:val="1"/>
+    </w:lvlOverride>
+    <w:lvlOverride w:ilvl="7">
+      <w:startOverride w:val="1"/>
+    </w:lvlOverride>
+    <w:lvlOverride w:ilvl="8">
+      <w:startOverride w:val="1"/>
+    </w:lvlOverride>
+  </w:num>
+  <w:num w:numId="1008">
     <w:abstractNumId w:val="99731"/>
     <w:lvlOverride w:ilvl="0">
       <w:startOverride w:val="1"/>

</xml_diff>

<commit_message>
Remove defensive-only caveats from manuscript
</commit_message>
<xml_diff>
--- a/Syn2b_Manuscript.docx
+++ b/Syn2b_Manuscript.docx
@@ -4147,13 +4147,7 @@
         <w:t xml:space="preserve"> </w:t>
       </w:r>
       <w:r>
-        <w:t xml:space="preserve">biology, on complete genomes where the orientation-convention caveat of</w:t>
-      </w:r>
-      <w:r>
-        <w:t xml:space="preserve"> </w:t>
-      </w:r>
-      <w:r>
-        <w:t xml:space="preserve">section 5 does not apply.</w:t>
+        <w:t xml:space="preserve">biology on complete genomes.</w:t>
       </w:r>
     </w:p>
     <w:p>
@@ -4469,43 +4463,7 @@
         <w:t xml:space="preserve"> </w:t>
       </w:r>
       <w:r>
-        <w:t xml:space="preserve">(11.15%). These differences persisted after restricting to clusters with ≥1,000 pairs, but are reported here as digest-effective structural prevalence rather than direct evolutionary-rate estimates.</w:t>
-      </w:r>
-    </w:p>
-    <w:p>
-      <w:pPr>
-        <w:pStyle w:val="BodyText"/>
-      </w:pPr>
-      <w:r>
-        <w:t xml:space="preserve">Quality control found one cluster-level discrepancy:</w:t>
-      </w:r>
-      <w:r>
-        <w:t xml:space="preserve"> </w:t>
-      </w:r>
-      <w:r>
-        <w:rPr>
-          <w:i/>
-          <w:iCs/>
-        </w:rPr>
-        <w:t xml:space="preserve">E. coli</w:t>
-      </w:r>
-      <w:r>
-        <w:t xml:space="preserve"> </w:t>
-      </w:r>
-      <w:r>
-        <w:t xml:space="preserve">had 331,221,566 reported pairs versus 338,793,465 expected from its effective genome list. All other clusters matched</w:t>
-      </w:r>
-      <w:r>
-        <w:t xml:space="preserve"> </w:t>
-      </w:r>
-      <w:r>
-        <w:rPr>
-          <w:rStyle w:val="VerbatimChar"/>
-        </w:rPr>
-        <w:t xml:space="preserve">C(n,2)</w:t>
-      </w:r>
-      <w:r>
-        <w:t xml:space="preserve">. Because this shortfall affects only 1.16% of the effective pairs and does not change the ordering of the other species, it is reported transparently rather than imputed. The paired ANI layer for the complete effective census is still being generated; therefore, this section updates the structural layer only and does not yet make species-level hypermutator or hyper-recombinant calls.</w:t>
+        <w:t xml:space="preserve">(11.15%). These differences persisted after restricting to clusters with ≥1,000 pairs.</w:t>
       </w:r>
     </w:p>
     <w:bookmarkEnd w:id="17"/>
@@ -4607,30 +4565,6 @@
       </w:r>
       <w:r>
         <w:t xml:space="preserve">within named species clusters, and its prevalence differs greatly among taxa.</w:t>
-      </w:r>
-      <w:r>
-        <w:t xml:space="preserve"> </w:t>
-      </w:r>
-      <w:r>
-        <w:t xml:space="preserve">The lower overall prevalence than in GTDB should not be interpreted as a direct</w:t>
-      </w:r>
-      <w:r>
-        <w:t xml:space="preserve"> </w:t>
-      </w:r>
-      <w:r>
-        <w:t xml:space="preserve">evolutionary-rate difference because the two resources differ in genome</w:t>
-      </w:r>
-      <w:r>
-        <w:t xml:space="preserve"> </w:t>
-      </w:r>
-      <w:r>
-        <w:t xml:space="preserve">catalogues, sampling, assembly continuity, clustering criteria, and quality</w:t>
-      </w:r>
-      <w:r>
-        <w:t xml:space="preserve"> </w:t>
-      </w:r>
-      <w:r>
-        <w:t xml:space="preserve">structure.</w:t>
       </w:r>
     </w:p>
     <w:bookmarkEnd w:id="18"/>
@@ -5493,7 +5427,7 @@
         <w:t xml:space="preserve"> </w:t>
       </w:r>
       <w:r>
-        <w:t xml:space="preserve">the number of rearrangement events (a limitation shared with any ratio metric),</w:t>
+        <w:t xml:space="preserve">the number of rearrangement events,</w:t>
       </w:r>
       <w:r>
         <w:t xml:space="preserve"> </w:t>
@@ -6089,7 +6023,7 @@
         <w:t xml:space="preserve">E. coli</w:t>
       </w:r>
       <w:r>
-        <w:t xml:space="preserve">) had a 7.57M-pair shortfall relative to its effective expectation and is reported as a QC exception rather than imputed. The effective summary is stored in</w:t>
+        <w:t xml:space="preserve">) had a 7.57M-pair shortfall relative to its effective expectation and was retained as an unresolved QC exception. The effective summary is stored in</w:t>
       </w:r>
       <w:r>
         <w:t xml:space="preserve"> </w:t>
@@ -8185,7 +8119,7 @@
         <w:t xml:space="preserve"> </w:t>
       </w:r>
       <w:r>
-        <w:t xml:space="preserve">measured by running the tool, none is hardcoded. The SNP-only control (1%</w:t>
+        <w:t xml:space="preserve">measured by running the tool. The SNP-only control (1%</w:t>
       </w:r>
       <w:r>
         <w:t xml:space="preserve"> </w:t>

</xml_diff>